<commit_message>
docs: normalize performance series
</commit_message>
<xml_diff>
--- a/Enterprise-WordPress-Performance-Operational-Checklist.docx
+++ b/Enterprise-WordPress-Performance-Operational-Checklist.docx
@@ -114,11 +114,18 @@
         <w:pStyle w:val="BlockText"/>
       </w:pPr>
       <w:r>
-        <w:t xml:space="preserve">Operating rule: do not start by installing another performance plugin. Start by identifying where time is spent, whether WordPress is executing at all, and whether the response can safely be cached.</w:t>
+        <w:t xml:space="preserve">Do not start by installing another performance plugin. Start by identifying where time is spent, whether WordPress is executing at all, and whether the response can safely be cached.</w:t>
+      </w:r>
+    </w:p>
+    <w:p>
+      <w:r>
+        <w:pict>
+          <v:rect style="width:0;height:1.5pt" o:hralign="center" o:hrstd="t" o:hr="t"/>
+        </w:pict>
       </w:r>
     </w:p>
     <w:bookmarkEnd w:id="40"/>
-    <w:bookmarkStart w:id="98" w:name="table-of-contents"/>
+    <w:bookmarkStart w:id="96" w:name="table-of-contents"/>
     <w:p>
       <w:pPr>
         <w:pStyle w:val="Heading1"/>
@@ -126,35 +133,6 @@
       <w:r>
         <w:t xml:space="preserve">Table of Contents</w:t>
       </w:r>
-    </w:p>
-    <w:p>
-      <w:pPr>
-        <w:pStyle w:val="Compact"/>
-        <w:numPr>
-          <w:ilvl w:val="0"/>
-          <w:numId w:val="1001"/>
-        </w:numPr>
-      </w:pPr>
-      <w:hyperlink w:anchor="X7f4cbd800b89160c2b6bb401fb0980d0c372ec5">
-        <w:r>
-          <w:rPr>
-            <w:rStyle w:val="Hyperlink"/>
-          </w:rPr>
-          <w:t xml:space="preserve">Companion cross-reference: Remkus De Vries’</w:t>
-        </w:r>
-        <w:r>
-          <w:rPr>
-            <w:rStyle w:val="Hyperlink"/>
-          </w:rPr>
-          <w:t xml:space="preserve"> </w:t>
-        </w:r>
-        <w:r>
-          <w:rPr>
-            <w:rStyle w:val="Hyperlink"/>
-          </w:rPr>
-          <w:t xml:space="preserve">“Make WordPress Fast”</w:t>
-        </w:r>
-      </w:hyperlink>
     </w:p>
     <w:p>
       <w:pPr>
@@ -882,41 +860,313 @@
         </w:r>
       </w:hyperlink>
     </w:p>
-    <w:bookmarkStart w:id="42" w:name="X7f4cbd800b89160c2b6bb401fb0980d0c372ec5"/>
+    <w:bookmarkStart w:id="41" w:name="define-the-performance-problem"/>
     <w:p>
       <w:pPr>
         <w:pStyle w:val="Heading2"/>
       </w:pPr>
       <w:r>
-        <w:t xml:space="preserve">Companion cross-reference: Remkus De Vries’</w:t>
-      </w:r>
-      <w:r>
-        <w:t xml:space="preserve"> </w:t>
-      </w:r>
-      <w:r>
-        <w:t xml:space="preserve">“Make WordPress Fast”</w:t>
-      </w:r>
-    </w:p>
-    <w:p>
-      <w:pPr>
-        <w:pStyle w:val="FirstParagraph"/>
-      </w:pPr>
-      <w:r>
-        <w:t xml:space="preserve">Use this runbook as the enterprise/backend/platform workflow. When a performance symptom is user-facing or frontend-heavy, cross-check the checklist based on Remkus’ guidance at</w:t>
-      </w:r>
-      <w:r>
-        <w:t xml:space="preserve"> </w:t>
-      </w:r>
-      <w:hyperlink r:id="rId41">
-        <w:r>
-          <w:rPr>
-            <w:rStyle w:val="VerbatimChar"/>
-          </w:rPr>
-          <w:t xml:space="preserve">wordpress-performance-optimization-checklist.md</w:t>
-        </w:r>
-      </w:hyperlink>
-      <w:r>
-        <w:t xml:space="preserve">. It goes deeper on Core Web Vitals, LCP/INP/CLS, images, fonts, third-party scripts, CSS/JavaScript loading, page builders, DOM bloat, WooCommerce, Multisite, plugin stack simplification, DevTools, and performance reporting.</w:t>
+        <w:t xml:space="preserve">0. Define the performance problem</w:t>
+      </w:r>
+    </w:p>
+    <w:p>
+      <w:pPr>
+        <w:pStyle w:val="Compact"/>
+        <w:numPr>
+          <w:ilvl w:val="0"/>
+          <w:numId w:val="1006"/>
+        </w:numPr>
+      </w:pPr>
+      <w:r>
+        <w:t xml:space="preserve">[ ] Identify the affected surface:</w:t>
+      </w:r>
+    </w:p>
+    <w:p>
+      <w:pPr>
+        <w:pStyle w:val="Compact"/>
+        <w:numPr>
+          <w:ilvl w:val="1"/>
+          <w:numId w:val="1007"/>
+        </w:numPr>
+      </w:pPr>
+      <w:r>
+        <w:t xml:space="preserve">[ ] public anonymous page</w:t>
+      </w:r>
+    </w:p>
+    <w:p>
+      <w:pPr>
+        <w:pStyle w:val="Compact"/>
+        <w:numPr>
+          <w:ilvl w:val="1"/>
+          <w:numId w:val="1007"/>
+        </w:numPr>
+      </w:pPr>
+      <w:r>
+        <w:t xml:space="preserve">[ ] logged-in page</w:t>
+      </w:r>
+    </w:p>
+    <w:p>
+      <w:pPr>
+        <w:pStyle w:val="Compact"/>
+        <w:numPr>
+          <w:ilvl w:val="1"/>
+          <w:numId w:val="1007"/>
+        </w:numPr>
+      </w:pPr>
+      <w:r>
+        <w:t xml:space="preserve">[ ] editorial/admin workflow</w:t>
+      </w:r>
+    </w:p>
+    <w:p>
+      <w:pPr>
+        <w:pStyle w:val="Compact"/>
+        <w:numPr>
+          <w:ilvl w:val="1"/>
+          <w:numId w:val="1007"/>
+        </w:numPr>
+      </w:pPr>
+      <w:r>
+        <w:t xml:space="preserve">[ ] API endpoint</w:t>
+      </w:r>
+    </w:p>
+    <w:p>
+      <w:pPr>
+        <w:pStyle w:val="Compact"/>
+        <w:numPr>
+          <w:ilvl w:val="1"/>
+          <w:numId w:val="1007"/>
+        </w:numPr>
+      </w:pPr>
+      <w:r>
+        <w:t xml:space="preserve">[ ] AJAX endpoint</w:t>
+      </w:r>
+    </w:p>
+    <w:p>
+      <w:pPr>
+        <w:pStyle w:val="Compact"/>
+        <w:numPr>
+          <w:ilvl w:val="1"/>
+          <w:numId w:val="1007"/>
+        </w:numPr>
+      </w:pPr>
+      <w:r>
+        <w:t xml:space="preserve">[ ] search results</w:t>
+      </w:r>
+    </w:p>
+    <w:p>
+      <w:pPr>
+        <w:pStyle w:val="Compact"/>
+        <w:numPr>
+          <w:ilvl w:val="1"/>
+          <w:numId w:val="1007"/>
+        </w:numPr>
+      </w:pPr>
+      <w:r>
+        <w:t xml:space="preserve">[ ] sitemap generation</w:t>
+      </w:r>
+    </w:p>
+    <w:p>
+      <w:pPr>
+        <w:pStyle w:val="Compact"/>
+        <w:numPr>
+          <w:ilvl w:val="1"/>
+          <w:numId w:val="1007"/>
+        </w:numPr>
+      </w:pPr>
+      <w:r>
+        <w:t xml:space="preserve">[ ] redirect path</w:t>
+      </w:r>
+    </w:p>
+    <w:p>
+      <w:pPr>
+        <w:pStyle w:val="Compact"/>
+        <w:numPr>
+          <w:ilvl w:val="1"/>
+          <w:numId w:val="1007"/>
+        </w:numPr>
+      </w:pPr>
+      <w:r>
+        <w:t xml:space="preserve">[ ] high-traffic event page</w:t>
+      </w:r>
+    </w:p>
+    <w:p>
+      <w:pPr>
+        <w:pStyle w:val="Compact"/>
+        <w:numPr>
+          <w:ilvl w:val="0"/>
+          <w:numId w:val="1006"/>
+        </w:numPr>
+      </w:pPr>
+      <w:r>
+        <w:t xml:space="preserve">[ ] Identify the failure mode:</w:t>
+      </w:r>
+    </w:p>
+    <w:p>
+      <w:pPr>
+        <w:pStyle w:val="Compact"/>
+        <w:numPr>
+          <w:ilvl w:val="1"/>
+          <w:numId w:val="1008"/>
+        </w:numPr>
+      </w:pPr>
+      <w:r>
+        <w:t xml:space="preserve">[ ] high TTFB</w:t>
+      </w:r>
+    </w:p>
+    <w:p>
+      <w:pPr>
+        <w:pStyle w:val="Compact"/>
+        <w:numPr>
+          <w:ilvl w:val="1"/>
+          <w:numId w:val="1008"/>
+        </w:numPr>
+      </w:pPr>
+      <w:r>
+        <w:t xml:space="preserve">[ ] slow PHP execution</w:t>
+      </w:r>
+    </w:p>
+    <w:p>
+      <w:pPr>
+        <w:pStyle w:val="Compact"/>
+        <w:numPr>
+          <w:ilvl w:val="1"/>
+          <w:numId w:val="1008"/>
+        </w:numPr>
+      </w:pPr>
+      <w:r>
+        <w:t xml:space="preserve">[ ] slow MySQL queries</w:t>
+      </w:r>
+    </w:p>
+    <w:p>
+      <w:pPr>
+        <w:pStyle w:val="Compact"/>
+        <w:numPr>
+          <w:ilvl w:val="1"/>
+          <w:numId w:val="1008"/>
+        </w:numPr>
+      </w:pPr>
+      <w:r>
+        <w:t xml:space="preserve">[ ] too many database queries</w:t>
+      </w:r>
+    </w:p>
+    <w:p>
+      <w:pPr>
+        <w:pStyle w:val="Compact"/>
+        <w:numPr>
+          <w:ilvl w:val="1"/>
+          <w:numId w:val="1008"/>
+        </w:numPr>
+      </w:pPr>
+      <w:r>
+        <w:t xml:space="preserve">[ ] cache misses</w:t>
+      </w:r>
+    </w:p>
+    <w:p>
+      <w:pPr>
+        <w:pStyle w:val="Compact"/>
+        <w:numPr>
+          <w:ilvl w:val="1"/>
+          <w:numId w:val="1008"/>
+        </w:numPr>
+      </w:pPr>
+      <w:r>
+        <w:t xml:space="preserve">[ ] object-cache pressure</w:t>
+      </w:r>
+    </w:p>
+    <w:p>
+      <w:pPr>
+        <w:pStyle w:val="Compact"/>
+        <w:numPr>
+          <w:ilvl w:val="1"/>
+          <w:numId w:val="1008"/>
+        </w:numPr>
+      </w:pPr>
+      <w:r>
+        <w:t xml:space="preserve">[ ] cache stampede/race condition</w:t>
+      </w:r>
+    </w:p>
+    <w:p>
+      <w:pPr>
+        <w:pStyle w:val="Compact"/>
+        <w:numPr>
+          <w:ilvl w:val="1"/>
+          <w:numId w:val="1008"/>
+        </w:numPr>
+      </w:pPr>
+      <w:r>
+        <w:t xml:space="preserve">[ ] slow third-party/external request</w:t>
+      </w:r>
+    </w:p>
+    <w:p>
+      <w:pPr>
+        <w:pStyle w:val="Compact"/>
+        <w:numPr>
+          <w:ilvl w:val="1"/>
+          <w:numId w:val="1008"/>
+        </w:numPr>
+      </w:pPr>
+      <w:r>
+        <w:t xml:space="preserve">[ ] client-side JavaScript delay</w:t>
+      </w:r>
+    </w:p>
+    <w:p>
+      <w:pPr>
+        <w:pStyle w:val="Compact"/>
+        <w:numPr>
+          <w:ilvl w:val="1"/>
+          <w:numId w:val="1008"/>
+        </w:numPr>
+      </w:pPr>
+      <w:r>
+        <w:t xml:space="preserve">[ ] load-test failure</w:t>
+      </w:r>
+    </w:p>
+    <w:p>
+      <w:pPr>
+        <w:pStyle w:val="Compact"/>
+        <w:numPr>
+          <w:ilvl w:val="0"/>
+          <w:numId w:val="1006"/>
+        </w:numPr>
+      </w:pPr>
+      <w:r>
+        <w:t xml:space="preserve">[ ] Confirm the test target URL or route.</w:t>
+      </w:r>
+    </w:p>
+    <w:p>
+      <w:pPr>
+        <w:pStyle w:val="Compact"/>
+        <w:numPr>
+          <w:ilvl w:val="0"/>
+          <w:numId w:val="1006"/>
+        </w:numPr>
+      </w:pPr>
+      <w:r>
+        <w:t xml:space="preserve">[ ] Record whether the request is anonymous or authenticated.</w:t>
+      </w:r>
+    </w:p>
+    <w:p>
+      <w:pPr>
+        <w:pStyle w:val="Compact"/>
+        <w:numPr>
+          <w:ilvl w:val="0"/>
+          <w:numId w:val="1006"/>
+        </w:numPr>
+      </w:pPr>
+      <w:r>
+        <w:t xml:space="preserve">[ ] Record whether the page should be cacheable.</w:t>
+      </w:r>
+    </w:p>
+    <w:p>
+      <w:pPr>
+        <w:pStyle w:val="Compact"/>
+        <w:numPr>
+          <w:ilvl w:val="0"/>
+          <w:numId w:val="1006"/>
+        </w:numPr>
+      </w:pPr>
+      <w:r>
+        <w:t xml:space="preserve">[ ] Confirm rollback path before changing production behavior.</w:t>
       </w:r>
     </w:p>
     <w:p>
@@ -926,314 +1176,222 @@
         </w:pict>
       </w:r>
     </w:p>
-    <w:bookmarkEnd w:id="42"/>
-    <w:bookmarkStart w:id="43" w:name="define-the-performance-problem"/>
+    <w:bookmarkEnd w:id="41"/>
+    <w:bookmarkStart w:id="42" w:name="trace-the-request-cycle"/>
     <w:p>
       <w:pPr>
         <w:pStyle w:val="Heading2"/>
       </w:pPr>
       <w:r>
-        <w:t xml:space="preserve">0. Define the performance problem</w:t>
-      </w:r>
-    </w:p>
-    <w:p>
-      <w:pPr>
-        <w:pStyle w:val="Compact"/>
-        <w:numPr>
-          <w:ilvl w:val="0"/>
-          <w:numId w:val="1006"/>
-        </w:numPr>
-      </w:pPr>
-      <w:r>
-        <w:t xml:space="preserve">[ ] Identify the affected surface:</w:t>
-      </w:r>
-    </w:p>
-    <w:p>
-      <w:pPr>
-        <w:pStyle w:val="Compact"/>
-        <w:numPr>
-          <w:ilvl w:val="1"/>
-          <w:numId w:val="1007"/>
-        </w:numPr>
-      </w:pPr>
-      <w:r>
-        <w:t xml:space="preserve">[ ] public anonymous page</w:t>
-      </w:r>
-    </w:p>
-    <w:p>
-      <w:pPr>
-        <w:pStyle w:val="Compact"/>
-        <w:numPr>
-          <w:ilvl w:val="1"/>
-          <w:numId w:val="1007"/>
-        </w:numPr>
-      </w:pPr>
-      <w:r>
-        <w:t xml:space="preserve">[ ] logged-in page</w:t>
-      </w:r>
-    </w:p>
-    <w:p>
-      <w:pPr>
-        <w:pStyle w:val="Compact"/>
-        <w:numPr>
-          <w:ilvl w:val="1"/>
-          <w:numId w:val="1007"/>
-        </w:numPr>
-      </w:pPr>
-      <w:r>
-        <w:t xml:space="preserve">[ ] editorial/admin workflow</w:t>
-      </w:r>
-    </w:p>
-    <w:p>
-      <w:pPr>
-        <w:pStyle w:val="Compact"/>
-        <w:numPr>
-          <w:ilvl w:val="1"/>
-          <w:numId w:val="1007"/>
-        </w:numPr>
-      </w:pPr>
-      <w:r>
-        <w:t xml:space="preserve">[ ] API endpoint</w:t>
-      </w:r>
-    </w:p>
-    <w:p>
-      <w:pPr>
-        <w:pStyle w:val="Compact"/>
-        <w:numPr>
-          <w:ilvl w:val="1"/>
-          <w:numId w:val="1007"/>
-        </w:numPr>
-      </w:pPr>
-      <w:r>
-        <w:t xml:space="preserve">[ ] AJAX endpoint</w:t>
-      </w:r>
-    </w:p>
-    <w:p>
-      <w:pPr>
-        <w:pStyle w:val="Compact"/>
-        <w:numPr>
-          <w:ilvl w:val="1"/>
-          <w:numId w:val="1007"/>
-        </w:numPr>
-      </w:pPr>
-      <w:r>
-        <w:t xml:space="preserve">[ ] search results</w:t>
-      </w:r>
-    </w:p>
-    <w:p>
-      <w:pPr>
-        <w:pStyle w:val="Compact"/>
-        <w:numPr>
-          <w:ilvl w:val="1"/>
-          <w:numId w:val="1007"/>
-        </w:numPr>
-      </w:pPr>
-      <w:r>
-        <w:t xml:space="preserve">[ ] sitemap generation</w:t>
-      </w:r>
-    </w:p>
-    <w:p>
-      <w:pPr>
-        <w:pStyle w:val="Compact"/>
-        <w:numPr>
-          <w:ilvl w:val="1"/>
-          <w:numId w:val="1007"/>
-        </w:numPr>
-      </w:pPr>
-      <w:r>
-        <w:t xml:space="preserve">[ ] redirect path</w:t>
-      </w:r>
-    </w:p>
-    <w:p>
-      <w:pPr>
-        <w:pStyle w:val="Compact"/>
-        <w:numPr>
-          <w:ilvl w:val="1"/>
-          <w:numId w:val="1007"/>
-        </w:numPr>
-      </w:pPr>
-      <w:r>
-        <w:t xml:space="preserve">[ ] high-traffic event page</w:t>
-      </w:r>
-    </w:p>
-    <w:p>
-      <w:pPr>
-        <w:pStyle w:val="Compact"/>
-        <w:numPr>
-          <w:ilvl w:val="0"/>
-          <w:numId w:val="1006"/>
-        </w:numPr>
-      </w:pPr>
-      <w:r>
-        <w:t xml:space="preserve">[ ] Identify the failure mode:</w:t>
-      </w:r>
-    </w:p>
-    <w:p>
-      <w:pPr>
-        <w:pStyle w:val="Compact"/>
-        <w:numPr>
-          <w:ilvl w:val="1"/>
-          <w:numId w:val="1008"/>
-        </w:numPr>
-      </w:pPr>
-      <w:r>
-        <w:t xml:space="preserve">[ ] high TTFB</w:t>
-      </w:r>
-    </w:p>
-    <w:p>
-      <w:pPr>
-        <w:pStyle w:val="Compact"/>
-        <w:numPr>
-          <w:ilvl w:val="1"/>
-          <w:numId w:val="1008"/>
-        </w:numPr>
-      </w:pPr>
-      <w:r>
-        <w:t xml:space="preserve">[ ] slow PHP execution</w:t>
-      </w:r>
-    </w:p>
-    <w:p>
-      <w:pPr>
-        <w:pStyle w:val="Compact"/>
-        <w:numPr>
-          <w:ilvl w:val="1"/>
-          <w:numId w:val="1008"/>
-        </w:numPr>
-      </w:pPr>
-      <w:r>
-        <w:t xml:space="preserve">[ ] slow MySQL queries</w:t>
-      </w:r>
-    </w:p>
-    <w:p>
-      <w:pPr>
-        <w:pStyle w:val="Compact"/>
-        <w:numPr>
-          <w:ilvl w:val="1"/>
-          <w:numId w:val="1008"/>
-        </w:numPr>
-      </w:pPr>
-      <w:r>
-        <w:t xml:space="preserve">[ ] too many database queries</w:t>
-      </w:r>
-    </w:p>
-    <w:p>
-      <w:pPr>
-        <w:pStyle w:val="Compact"/>
-        <w:numPr>
-          <w:ilvl w:val="1"/>
-          <w:numId w:val="1008"/>
-        </w:numPr>
-      </w:pPr>
-      <w:r>
-        <w:t xml:space="preserve">[ ] cache misses</w:t>
-      </w:r>
-    </w:p>
-    <w:p>
-      <w:pPr>
-        <w:pStyle w:val="Compact"/>
-        <w:numPr>
-          <w:ilvl w:val="1"/>
-          <w:numId w:val="1008"/>
-        </w:numPr>
-      </w:pPr>
-      <w:r>
-        <w:t xml:space="preserve">[ ] object-cache pressure</w:t>
-      </w:r>
-    </w:p>
-    <w:p>
-      <w:pPr>
-        <w:pStyle w:val="Compact"/>
-        <w:numPr>
-          <w:ilvl w:val="1"/>
-          <w:numId w:val="1008"/>
-        </w:numPr>
-      </w:pPr>
-      <w:r>
-        <w:t xml:space="preserve">[ ] cache stampede/race condition</w:t>
-      </w:r>
-    </w:p>
-    <w:p>
-      <w:pPr>
-        <w:pStyle w:val="Compact"/>
-        <w:numPr>
-          <w:ilvl w:val="1"/>
-          <w:numId w:val="1008"/>
-        </w:numPr>
-      </w:pPr>
-      <w:r>
-        <w:t xml:space="preserve">[ ] slow third-party/external request</w:t>
-      </w:r>
-    </w:p>
-    <w:p>
-      <w:pPr>
-        <w:pStyle w:val="Compact"/>
-        <w:numPr>
-          <w:ilvl w:val="1"/>
-          <w:numId w:val="1008"/>
-        </w:numPr>
-      </w:pPr>
-      <w:r>
-        <w:t xml:space="preserve">[ ] client-side JavaScript delay</w:t>
-      </w:r>
-    </w:p>
-    <w:p>
-      <w:pPr>
-        <w:pStyle w:val="Compact"/>
-        <w:numPr>
-          <w:ilvl w:val="1"/>
-          <w:numId w:val="1008"/>
-        </w:numPr>
-      </w:pPr>
-      <w:r>
-        <w:t xml:space="preserve">[ ] load-test failure</w:t>
-      </w:r>
-    </w:p>
-    <w:p>
-      <w:pPr>
-        <w:pStyle w:val="Compact"/>
-        <w:numPr>
-          <w:ilvl w:val="0"/>
-          <w:numId w:val="1006"/>
-        </w:numPr>
-      </w:pPr>
-      <w:r>
-        <w:t xml:space="preserve">[ ] Confirm the test target URL or route.</w:t>
-      </w:r>
-    </w:p>
-    <w:p>
-      <w:pPr>
-        <w:pStyle w:val="Compact"/>
-        <w:numPr>
-          <w:ilvl w:val="0"/>
-          <w:numId w:val="1006"/>
-        </w:numPr>
-      </w:pPr>
-      <w:r>
-        <w:t xml:space="preserve">[ ] Record whether the request is anonymous or authenticated.</w:t>
-      </w:r>
-    </w:p>
-    <w:p>
-      <w:pPr>
-        <w:pStyle w:val="Compact"/>
-        <w:numPr>
-          <w:ilvl w:val="0"/>
-          <w:numId w:val="1006"/>
-        </w:numPr>
-      </w:pPr>
-      <w:r>
-        <w:t xml:space="preserve">[ ] Record whether the page should be cacheable.</w:t>
-      </w:r>
-    </w:p>
-    <w:p>
-      <w:pPr>
-        <w:pStyle w:val="Compact"/>
-        <w:numPr>
-          <w:ilvl w:val="0"/>
-          <w:numId w:val="1006"/>
-        </w:numPr>
-      </w:pPr>
-      <w:r>
-        <w:t xml:space="preserve">[ ] Confirm rollback path before changing production behavior.</w:t>
+        <w:t xml:space="preserve">1. Trace the request cycle</w:t>
+      </w:r>
+    </w:p>
+    <w:p>
+      <w:pPr>
+        <w:pStyle w:val="FirstParagraph"/>
+      </w:pPr>
+      <w:r>
+        <w:t xml:space="preserve">For each target request, walk the full path.</w:t>
+      </w:r>
+    </w:p>
+    <w:p>
+      <w:pPr>
+        <w:pStyle w:val="Compact"/>
+        <w:numPr>
+          <w:ilvl w:val="0"/>
+          <w:numId w:val="1009"/>
+        </w:numPr>
+      </w:pPr>
+      <w:r>
+        <w:t xml:space="preserve">[ ] User enters URL.</w:t>
+      </w:r>
+    </w:p>
+    <w:p>
+      <w:pPr>
+        <w:pStyle w:val="Compact"/>
+        <w:numPr>
+          <w:ilvl w:val="0"/>
+          <w:numId w:val="1009"/>
+        </w:numPr>
+      </w:pPr>
+      <w:r>
+        <w:t xml:space="preserve">[ ] DNS resolves the hostname.</w:t>
+      </w:r>
+    </w:p>
+    <w:p>
+      <w:pPr>
+        <w:pStyle w:val="Compact"/>
+        <w:numPr>
+          <w:ilvl w:val="0"/>
+          <w:numId w:val="1009"/>
+        </w:numPr>
+      </w:pPr>
+      <w:r>
+        <w:t xml:space="preserve">[ ] Browser sends HTTP request.</w:t>
+      </w:r>
+    </w:p>
+    <w:p>
+      <w:pPr>
+        <w:pStyle w:val="Compact"/>
+        <w:numPr>
+          <w:ilvl w:val="0"/>
+          <w:numId w:val="1009"/>
+        </w:numPr>
+      </w:pPr>
+      <w:r>
+        <w:t xml:space="preserve">[ ] Edge/CDN checks for cached response.</w:t>
+      </w:r>
+    </w:p>
+    <w:p>
+      <w:pPr>
+        <w:pStyle w:val="Compact"/>
+        <w:numPr>
+          <w:ilvl w:val="0"/>
+          <w:numId w:val="1009"/>
+        </w:numPr>
+      </w:pPr>
+      <w:r>
+        <w:t xml:space="preserve">[ ] Origin web server receives request if edge misses or bypasses.</w:t>
+      </w:r>
+    </w:p>
+    <w:p>
+      <w:pPr>
+        <w:pStyle w:val="Compact"/>
+        <w:numPr>
+          <w:ilvl w:val="0"/>
+          <w:numId w:val="1009"/>
+        </w:numPr>
+      </w:pPr>
+      <w:r>
+        <w:t xml:space="preserve">[ ] WordPress core loads.</w:t>
+      </w:r>
+    </w:p>
+    <w:p>
+      <w:pPr>
+        <w:pStyle w:val="Compact"/>
+        <w:numPr>
+          <w:ilvl w:val="0"/>
+          <w:numId w:val="1009"/>
+        </w:numPr>
+      </w:pPr>
+      <w:r>
+        <w:t xml:space="preserve">[ ] MU plugins load.</w:t>
+      </w:r>
+    </w:p>
+    <w:p>
+      <w:pPr>
+        <w:pStyle w:val="Compact"/>
+        <w:numPr>
+          <w:ilvl w:val="0"/>
+          <w:numId w:val="1009"/>
+        </w:numPr>
+      </w:pPr>
+      <w:r>
+        <w:t xml:space="preserve">[ ] Plugins and theme code run.</w:t>
+      </w:r>
+    </w:p>
+    <w:p>
+      <w:pPr>
+        <w:pStyle w:val="Compact"/>
+        <w:numPr>
+          <w:ilvl w:val="0"/>
+          <w:numId w:val="1009"/>
+        </w:numPr>
+      </w:pPr>
+      <w:r>
+        <w:t xml:space="preserve">[ ] Database and object cache are queried.</w:t>
+      </w:r>
+    </w:p>
+    <w:p>
+      <w:pPr>
+        <w:pStyle w:val="Compact"/>
+        <w:numPr>
+          <w:ilvl w:val="0"/>
+          <w:numId w:val="1009"/>
+        </w:numPr>
+      </w:pPr>
+      <w:r>
+        <w:t xml:space="preserve">[ ] Template is selected and rendered.</w:t>
+      </w:r>
+    </w:p>
+    <w:p>
+      <w:pPr>
+        <w:pStyle w:val="Compact"/>
+        <w:numPr>
+          <w:ilvl w:val="0"/>
+          <w:numId w:val="1009"/>
+        </w:numPr>
+      </w:pPr>
+      <w:r>
+        <w:t xml:space="preserve">[ ] HTTP response is sent to browser.</w:t>
+      </w:r>
+    </w:p>
+    <w:p>
+      <w:pPr>
+        <w:pStyle w:val="Compact"/>
+        <w:numPr>
+          <w:ilvl w:val="0"/>
+          <w:numId w:val="1009"/>
+        </w:numPr>
+      </w:pPr>
+      <w:r>
+        <w:t xml:space="preserve">[ ] Browser parses HTML, downloads assets, executes JavaScript, renders the page.</w:t>
+      </w:r>
+    </w:p>
+    <w:p>
+      <w:pPr>
+        <w:pStyle w:val="Compact"/>
+        <w:numPr>
+          <w:ilvl w:val="0"/>
+          <w:numId w:val="1009"/>
+        </w:numPr>
+      </w:pPr>
+      <w:r>
+        <w:t xml:space="preserve">[ ] Additional requests fire: AJAX, REST, media, tracking, personalization.</w:t>
+      </w:r>
+    </w:p>
+    <w:p>
+      <w:pPr>
+        <w:pStyle w:val="FirstParagraph"/>
+      </w:pPr>
+      <w:r>
+        <w:t xml:space="preserve">Decision point:</w:t>
+      </w:r>
+    </w:p>
+    <w:p>
+      <w:pPr>
+        <w:pStyle w:val="Compact"/>
+        <w:numPr>
+          <w:ilvl w:val="0"/>
+          <w:numId w:val="1010"/>
+        </w:numPr>
+      </w:pPr>
+      <w:r>
+        <w:t xml:space="preserve">[ ] If the edge cache returns a valid</w:t>
+      </w:r>
+      <w:r>
+        <w:t xml:space="preserve"> </w:t>
+      </w:r>
+      <w:r>
+        <w:rPr>
+          <w:rStyle w:val="VerbatimChar"/>
+        </w:rPr>
+        <w:t xml:space="preserve">HIT</w:t>
+      </w:r>
+      <w:r>
+        <w:t xml:space="preserve">, focus on payload, browser rendering, and post-load requests.</w:t>
+      </w:r>
+    </w:p>
+    <w:p>
+      <w:pPr>
+        <w:pStyle w:val="Compact"/>
+        <w:numPr>
+          <w:ilvl w:val="0"/>
+          <w:numId w:val="1010"/>
+        </w:numPr>
+      </w:pPr>
+      <w:r>
+        <w:t xml:space="preserve">[ ] If the request reaches origin, focus on cacheability, PHP, database, object cache, hooks, templates, and external calls.</w:t>
       </w:r>
     </w:p>
     <w:p>
@@ -1243,233 +1401,8 @@
         </w:pict>
       </w:r>
     </w:p>
-    <w:bookmarkEnd w:id="43"/>
-    <w:bookmarkStart w:id="44" w:name="trace-the-request-cycle"/>
-    <w:p>
-      <w:pPr>
-        <w:pStyle w:val="Heading2"/>
-      </w:pPr>
-      <w:r>
-        <w:t xml:space="preserve">1. Trace the request cycle</w:t>
-      </w:r>
-    </w:p>
-    <w:p>
-      <w:pPr>
-        <w:pStyle w:val="FirstParagraph"/>
-      </w:pPr>
-      <w:r>
-        <w:t xml:space="preserve">For each target request, walk the full path.</w:t>
-      </w:r>
-    </w:p>
-    <w:p>
-      <w:pPr>
-        <w:pStyle w:val="Compact"/>
-        <w:numPr>
-          <w:ilvl w:val="0"/>
-          <w:numId w:val="1009"/>
-        </w:numPr>
-      </w:pPr>
-      <w:r>
-        <w:t xml:space="preserve">[ ] User enters URL.</w:t>
-      </w:r>
-    </w:p>
-    <w:p>
-      <w:pPr>
-        <w:pStyle w:val="Compact"/>
-        <w:numPr>
-          <w:ilvl w:val="0"/>
-          <w:numId w:val="1009"/>
-        </w:numPr>
-      </w:pPr>
-      <w:r>
-        <w:t xml:space="preserve">[ ] DNS resolves the hostname.</w:t>
-      </w:r>
-    </w:p>
-    <w:p>
-      <w:pPr>
-        <w:pStyle w:val="Compact"/>
-        <w:numPr>
-          <w:ilvl w:val="0"/>
-          <w:numId w:val="1009"/>
-        </w:numPr>
-      </w:pPr>
-      <w:r>
-        <w:t xml:space="preserve">[ ] Browser sends HTTP request.</w:t>
-      </w:r>
-    </w:p>
-    <w:p>
-      <w:pPr>
-        <w:pStyle w:val="Compact"/>
-        <w:numPr>
-          <w:ilvl w:val="0"/>
-          <w:numId w:val="1009"/>
-        </w:numPr>
-      </w:pPr>
-      <w:r>
-        <w:t xml:space="preserve">[ ] Edge/CDN checks for cached response.</w:t>
-      </w:r>
-    </w:p>
-    <w:p>
-      <w:pPr>
-        <w:pStyle w:val="Compact"/>
-        <w:numPr>
-          <w:ilvl w:val="0"/>
-          <w:numId w:val="1009"/>
-        </w:numPr>
-      </w:pPr>
-      <w:r>
-        <w:t xml:space="preserve">[ ] Origin web server receives request if edge misses or bypasses.</w:t>
-      </w:r>
-    </w:p>
-    <w:p>
-      <w:pPr>
-        <w:pStyle w:val="Compact"/>
-        <w:numPr>
-          <w:ilvl w:val="0"/>
-          <w:numId w:val="1009"/>
-        </w:numPr>
-      </w:pPr>
-      <w:r>
-        <w:t xml:space="preserve">[ ] WordPress core loads.</w:t>
-      </w:r>
-    </w:p>
-    <w:p>
-      <w:pPr>
-        <w:pStyle w:val="Compact"/>
-        <w:numPr>
-          <w:ilvl w:val="0"/>
-          <w:numId w:val="1009"/>
-        </w:numPr>
-      </w:pPr>
-      <w:r>
-        <w:t xml:space="preserve">[ ] MU plugins load.</w:t>
-      </w:r>
-    </w:p>
-    <w:p>
-      <w:pPr>
-        <w:pStyle w:val="Compact"/>
-        <w:numPr>
-          <w:ilvl w:val="0"/>
-          <w:numId w:val="1009"/>
-        </w:numPr>
-      </w:pPr>
-      <w:r>
-        <w:t xml:space="preserve">[ ] Plugins and theme code run.</w:t>
-      </w:r>
-    </w:p>
-    <w:p>
-      <w:pPr>
-        <w:pStyle w:val="Compact"/>
-        <w:numPr>
-          <w:ilvl w:val="0"/>
-          <w:numId w:val="1009"/>
-        </w:numPr>
-      </w:pPr>
-      <w:r>
-        <w:t xml:space="preserve">[ ] Database and object cache are queried.</w:t>
-      </w:r>
-    </w:p>
-    <w:p>
-      <w:pPr>
-        <w:pStyle w:val="Compact"/>
-        <w:numPr>
-          <w:ilvl w:val="0"/>
-          <w:numId w:val="1009"/>
-        </w:numPr>
-      </w:pPr>
-      <w:r>
-        <w:t xml:space="preserve">[ ] Template is selected and rendered.</w:t>
-      </w:r>
-    </w:p>
-    <w:p>
-      <w:pPr>
-        <w:pStyle w:val="Compact"/>
-        <w:numPr>
-          <w:ilvl w:val="0"/>
-          <w:numId w:val="1009"/>
-        </w:numPr>
-      </w:pPr>
-      <w:r>
-        <w:t xml:space="preserve">[ ] HTTP response is sent to browser.</w:t>
-      </w:r>
-    </w:p>
-    <w:p>
-      <w:pPr>
-        <w:pStyle w:val="Compact"/>
-        <w:numPr>
-          <w:ilvl w:val="0"/>
-          <w:numId w:val="1009"/>
-        </w:numPr>
-      </w:pPr>
-      <w:r>
-        <w:t xml:space="preserve">[ ] Browser parses HTML, downloads assets, executes JavaScript, renders the page.</w:t>
-      </w:r>
-    </w:p>
-    <w:p>
-      <w:pPr>
-        <w:pStyle w:val="Compact"/>
-        <w:numPr>
-          <w:ilvl w:val="0"/>
-          <w:numId w:val="1009"/>
-        </w:numPr>
-      </w:pPr>
-      <w:r>
-        <w:t xml:space="preserve">[ ] Additional requests fire: AJAX, REST, media, tracking, personalization.</w:t>
-      </w:r>
-    </w:p>
-    <w:p>
-      <w:pPr>
-        <w:pStyle w:val="FirstParagraph"/>
-      </w:pPr>
-      <w:r>
-        <w:t xml:space="preserve">Decision point:</w:t>
-      </w:r>
-    </w:p>
-    <w:p>
-      <w:pPr>
-        <w:pStyle w:val="Compact"/>
-        <w:numPr>
-          <w:ilvl w:val="0"/>
-          <w:numId w:val="1010"/>
-        </w:numPr>
-      </w:pPr>
-      <w:r>
-        <w:t xml:space="preserve">[ ] If the edge cache returns a valid</w:t>
-      </w:r>
-      <w:r>
-        <w:t xml:space="preserve"> </w:t>
-      </w:r>
-      <w:r>
-        <w:rPr>
-          <w:rStyle w:val="VerbatimChar"/>
-        </w:rPr>
-        <w:t xml:space="preserve">HIT</w:t>
-      </w:r>
-      <w:r>
-        <w:t xml:space="preserve">, focus on payload, browser rendering, and post-load requests.</w:t>
-      </w:r>
-    </w:p>
-    <w:p>
-      <w:pPr>
-        <w:pStyle w:val="Compact"/>
-        <w:numPr>
-          <w:ilvl w:val="0"/>
-          <w:numId w:val="1010"/>
-        </w:numPr>
-      </w:pPr>
-      <w:r>
-        <w:t xml:space="preserve">[ ] If the request reaches origin, focus on cacheability, PHP, database, object cache, hooks, templates, and external calls.</w:t>
-      </w:r>
-    </w:p>
-    <w:p>
-      <w:r>
-        <w:pict>
-          <v:rect style="width:0;height:1.5pt" o:hralign="center" o:hrstd="t" o:hr="t"/>
-        </w:pict>
-      </w:r>
-    </w:p>
-    <w:bookmarkEnd w:id="44"/>
-    <w:bookmarkStart w:id="45" w:name="establish-a-baseline"/>
+    <w:bookmarkEnd w:id="42"/>
+    <w:bookmarkStart w:id="43" w:name="establish-a-baseline"/>
     <w:p>
       <w:pPr>
         <w:pStyle w:val="Heading2"/>
@@ -2060,8 +1993,8 @@
         </w:pict>
       </w:r>
     </w:p>
-    <w:bookmarkEnd w:id="45"/>
-    <w:bookmarkStart w:id="46" w:name="dns-and-http-request-setup"/>
+    <w:bookmarkEnd w:id="43"/>
+    <w:bookmarkStart w:id="44" w:name="dns-and-http-request-setup"/>
     <w:p>
       <w:pPr>
         <w:pStyle w:val="Heading2"/>
@@ -2601,8 +2534,8 @@
         </w:pict>
       </w:r>
     </w:p>
-    <w:bookmarkEnd w:id="46"/>
-    <w:bookmarkStart w:id="47" w:name="full-page-cache-and-edge-cache"/>
+    <w:bookmarkEnd w:id="44"/>
+    <w:bookmarkStart w:id="45" w:name="full-page-cache-and-edge-cache"/>
     <w:p>
       <w:pPr>
         <w:pStyle w:val="Heading2"/>
@@ -2937,8 +2870,8 @@
         </w:pict>
       </w:r>
     </w:p>
-    <w:bookmarkEnd w:id="47"/>
-    <w:bookmarkStart w:id="48" w:name="ttl-headers-and-invalidation"/>
+    <w:bookmarkEnd w:id="45"/>
+    <w:bookmarkStart w:id="46" w:name="ttl-headers-and-invalidation"/>
     <w:p>
       <w:pPr>
         <w:pStyle w:val="Heading2"/>
@@ -3191,8 +3124,8 @@
         </w:pict>
       </w:r>
     </w:p>
-    <w:bookmarkEnd w:id="48"/>
-    <w:bookmarkStart w:id="49" w:name="application-optimization"/>
+    <w:bookmarkEnd w:id="46"/>
+    <w:bookmarkStart w:id="47" w:name="application-optimization"/>
     <w:p>
       <w:pPr>
         <w:pStyle w:val="Heading2"/>
@@ -3392,8 +3325,8 @@
         </w:pict>
       </w:r>
     </w:p>
-    <w:bookmarkEnd w:id="49"/>
-    <w:bookmarkStart w:id="50" w:name="partial-output-caching"/>
+    <w:bookmarkEnd w:id="47"/>
+    <w:bookmarkStart w:id="48" w:name="partial-output-caching"/>
     <w:p>
       <w:pPr>
         <w:pStyle w:val="Heading2"/>
@@ -4474,8 +4407,8 @@
         </w:pict>
       </w:r>
     </w:p>
-    <w:bookmarkEnd w:id="50"/>
-    <w:bookmarkStart w:id="51" w:name="mysql-query-optimization"/>
+    <w:bookmarkEnd w:id="48"/>
+    <w:bookmarkStart w:id="49" w:name="mysql-query-optimization"/>
     <w:p>
       <w:pPr>
         <w:pStyle w:val="Heading2"/>
@@ -5054,8 +4987,8 @@
         </w:pict>
       </w:r>
     </w:p>
-    <w:bookmarkEnd w:id="51"/>
-    <w:bookmarkStart w:id="52" w:name="unbounded-queries"/>
+    <w:bookmarkEnd w:id="49"/>
+    <w:bookmarkStart w:id="50" w:name="unbounded-queries"/>
     <w:p>
       <w:pPr>
         <w:pStyle w:val="Heading2"/>
@@ -5935,688 +5868,688 @@
         </w:pict>
       </w:r>
     </w:p>
+    <w:bookmarkEnd w:id="50"/>
+    <w:bookmarkStart w:id="55" w:name="taxonomies-exclusions-post-meta-and-like"/>
+    <w:p>
+      <w:pPr>
+        <w:pStyle w:val="Heading2"/>
+      </w:pPr>
+      <w:r>
+        <w:t xml:space="preserve">10. Taxonomies, exclusions, post meta, and LIKE</w:t>
+      </w:r>
+    </w:p>
+    <w:bookmarkStart w:id="51" w:name="taxonomies"/>
+    <w:p>
+      <w:pPr>
+        <w:pStyle w:val="Heading3"/>
+      </w:pPr>
+      <w:r>
+        <w:t xml:space="preserve">Taxonomies</w:t>
+      </w:r>
+    </w:p>
+    <w:p>
+      <w:pPr>
+        <w:pStyle w:val="Compact"/>
+        <w:numPr>
+          <w:ilvl w:val="0"/>
+          <w:numId w:val="1028"/>
+        </w:numPr>
+      </w:pPr>
+      <w:r>
+        <w:t xml:space="preserve">[ ] Use taxonomies for classification, not arbitrary high-cardinality data.</w:t>
+      </w:r>
+    </w:p>
+    <w:p>
+      <w:pPr>
+        <w:pStyle w:val="Compact"/>
+        <w:numPr>
+          <w:ilvl w:val="0"/>
+          <w:numId w:val="1028"/>
+        </w:numPr>
+      </w:pPr>
+      <w:r>
+        <w:t xml:space="preserve">[ ] Avoid overly complex taxonomy intersections/exclusions.</w:t>
+      </w:r>
+    </w:p>
+    <w:p>
+      <w:pPr>
+        <w:pStyle w:val="Compact"/>
+        <w:numPr>
+          <w:ilvl w:val="0"/>
+          <w:numId w:val="1028"/>
+        </w:numPr>
+      </w:pPr>
+      <w:r>
+        <w:t xml:space="preserve">[ ] Keep term relationships manageable.</w:t>
+      </w:r>
+    </w:p>
+    <w:p>
+      <w:pPr>
+        <w:pStyle w:val="Compact"/>
+        <w:numPr>
+          <w:ilvl w:val="0"/>
+          <w:numId w:val="1028"/>
+        </w:numPr>
+      </w:pPr>
+      <w:r>
+        <w:t xml:space="preserve">[ ] Use dedicated indexes/search systems for large faceted search use cases.</w:t>
+      </w:r>
+    </w:p>
+    <w:p>
+      <w:pPr>
+        <w:pStyle w:val="FirstParagraph"/>
+      </w:pPr>
+      <w:r>
+        <w:t xml:space="preserve">Example scope limiter:</w:t>
+      </w:r>
+    </w:p>
+    <w:p>
+      <w:pPr>
+        <w:pStyle w:val="SourceCode"/>
+      </w:pPr>
+      <w:r>
+        <w:rPr>
+          <w:rStyle w:val="KeywordTok"/>
+        </w:rPr>
+        <w:t xml:space="preserve">function</w:t>
+      </w:r>
+      <w:r>
+        <w:rPr>
+          <w:rStyle w:val="NormalTok"/>
+        </w:rPr>
+        <w:t xml:space="preserve"> limit_news_scope_query_filter( </w:t>
+      </w:r>
+      <w:r>
+        <w:rPr>
+          <w:rStyle w:val="VariableTok"/>
+        </w:rPr>
+        <w:t xml:space="preserve">$query</w:t>
+      </w:r>
+      <w:r>
+        <w:rPr>
+          <w:rStyle w:val="NormalTok"/>
+        </w:rPr>
+        <w:t xml:space="preserve"> ) {</w:t>
+      </w:r>
+      <w:r>
+        <w:br/>
+      </w:r>
+      <w:r>
+        <w:rPr>
+          <w:rStyle w:val="NormalTok"/>
+        </w:rPr>
+        <w:t xml:space="preserve">    </w:t>
+      </w:r>
+      <w:r>
+        <w:rPr>
+          <w:rStyle w:val="ControlFlowTok"/>
+        </w:rPr>
+        <w:t xml:space="preserve">if</w:t>
+      </w:r>
+      <w:r>
+        <w:rPr>
+          <w:rStyle w:val="NormalTok"/>
+        </w:rPr>
+        <w:t xml:space="preserve"> ( is_admin() </w:t>
+      </w:r>
+      <w:r>
+        <w:rPr>
+          <w:rStyle w:val="OperatorTok"/>
+        </w:rPr>
+        <w:t xml:space="preserve">||</w:t>
+      </w:r>
+      <w:r>
+        <w:rPr>
+          <w:rStyle w:val="NormalTok"/>
+        </w:rPr>
+        <w:t xml:space="preserve"> </w:t>
+      </w:r>
+      <w:r>
+        <w:rPr>
+          <w:rStyle w:val="OperatorTok"/>
+        </w:rPr>
+        <w:t xml:space="preserve">!</w:t>
+      </w:r>
+      <w:r>
+        <w:rPr>
+          <w:rStyle w:val="NormalTok"/>
+        </w:rPr>
+        <w:t xml:space="preserve"> </w:t>
+      </w:r>
+      <w:r>
+        <w:rPr>
+          <w:rStyle w:val="VariableTok"/>
+        </w:rPr>
+        <w:t xml:space="preserve">$query</w:t>
+      </w:r>
+      <w:r>
+        <w:rPr>
+          <w:rStyle w:val="NormalTok"/>
+        </w:rPr>
+        <w:t xml:space="preserve">-&gt;is_main_query() ) {</w:t>
+      </w:r>
+      <w:r>
+        <w:br/>
+      </w:r>
+      <w:r>
+        <w:rPr>
+          <w:rStyle w:val="NormalTok"/>
+        </w:rPr>
+        <w:t xml:space="preserve">        </w:t>
+      </w:r>
+      <w:r>
+        <w:rPr>
+          <w:rStyle w:val="ControlFlowTok"/>
+        </w:rPr>
+        <w:t xml:space="preserve">return</w:t>
+      </w:r>
+      <w:r>
+        <w:rPr>
+          <w:rStyle w:val="OtherTok"/>
+        </w:rPr>
+        <w:t xml:space="preserve">;</w:t>
+      </w:r>
+      <w:r>
+        <w:br/>
+      </w:r>
+      <w:r>
+        <w:rPr>
+          <w:rStyle w:val="NormalTok"/>
+        </w:rPr>
+        <w:t xml:space="preserve">    }</w:t>
+      </w:r>
+      <w:r>
+        <w:br/>
+      </w:r>
+      <w:r>
+        <w:br/>
+      </w:r>
+      <w:r>
+        <w:rPr>
+          <w:rStyle w:val="NormalTok"/>
+        </w:rPr>
+        <w:t xml:space="preserve">    </w:t>
+      </w:r>
+      <w:r>
+        <w:rPr>
+          <w:rStyle w:val="ControlFlowTok"/>
+        </w:rPr>
+        <w:t xml:space="preserve">if</w:t>
+      </w:r>
+      <w:r>
+        <w:rPr>
+          <w:rStyle w:val="NormalTok"/>
+        </w:rPr>
+        <w:t xml:space="preserve"> ( </w:t>
+      </w:r>
+      <w:r>
+        <w:rPr>
+          <w:rStyle w:val="VariableTok"/>
+        </w:rPr>
+        <w:t xml:space="preserve">$query</w:t>
+      </w:r>
+      <w:r>
+        <w:rPr>
+          <w:rStyle w:val="NormalTok"/>
+        </w:rPr>
+        <w:t xml:space="preserve">-&gt;is_category() ) {</w:t>
+      </w:r>
+      <w:r>
+        <w:br/>
+      </w:r>
+      <w:r>
+        <w:rPr>
+          <w:rStyle w:val="NormalTok"/>
+        </w:rPr>
+        <w:t xml:space="preserve">        </w:t>
+      </w:r>
+      <w:r>
+        <w:rPr>
+          <w:rStyle w:val="VariableTok"/>
+        </w:rPr>
+        <w:t xml:space="preserve">$query</w:t>
+      </w:r>
+      <w:r>
+        <w:rPr>
+          <w:rStyle w:val="NormalTok"/>
+        </w:rPr>
+        <w:t xml:space="preserve">-&gt;set( </w:t>
+      </w:r>
+      <w:r>
+        <w:rPr>
+          <w:rStyle w:val="StringTok"/>
+        </w:rPr>
+        <w:t xml:space="preserve">'posts_per_page'</w:t>
+      </w:r>
+      <w:r>
+        <w:rPr>
+          <w:rStyle w:val="OtherTok"/>
+        </w:rPr>
+        <w:t xml:space="preserve">,</w:t>
+      </w:r>
+      <w:r>
+        <w:rPr>
+          <w:rStyle w:val="NormalTok"/>
+        </w:rPr>
+        <w:t xml:space="preserve"> </w:t>
+      </w:r>
+      <w:r>
+        <w:rPr>
+          <w:rStyle w:val="DecValTok"/>
+        </w:rPr>
+        <w:t xml:space="preserve">20</w:t>
+      </w:r>
+      <w:r>
+        <w:rPr>
+          <w:rStyle w:val="NormalTok"/>
+        </w:rPr>
+        <w:t xml:space="preserve"> )</w:t>
+      </w:r>
+      <w:r>
+        <w:rPr>
+          <w:rStyle w:val="OtherTok"/>
+        </w:rPr>
+        <w:t xml:space="preserve">;</w:t>
+      </w:r>
+      <w:r>
+        <w:br/>
+      </w:r>
+      <w:r>
+        <w:rPr>
+          <w:rStyle w:val="NormalTok"/>
+        </w:rPr>
+        <w:t xml:space="preserve">    }</w:t>
+      </w:r>
+      <w:r>
+        <w:br/>
+      </w:r>
+      <w:r>
+        <w:rPr>
+          <w:rStyle w:val="NormalTok"/>
+        </w:rPr>
+        <w:t xml:space="preserve">}</w:t>
+      </w:r>
+      <w:r>
+        <w:br/>
+      </w:r>
+      <w:r>
+        <w:rPr>
+          <w:rStyle w:val="NormalTok"/>
+        </w:rPr>
+        <w:t xml:space="preserve">add_action( </w:t>
+      </w:r>
+      <w:r>
+        <w:rPr>
+          <w:rStyle w:val="StringTok"/>
+        </w:rPr>
+        <w:t xml:space="preserve">'pre_get_posts'</w:t>
+      </w:r>
+      <w:r>
+        <w:rPr>
+          <w:rStyle w:val="OtherTok"/>
+        </w:rPr>
+        <w:t xml:space="preserve">,</w:t>
+      </w:r>
+      <w:r>
+        <w:rPr>
+          <w:rStyle w:val="NormalTok"/>
+        </w:rPr>
+        <w:t xml:space="preserve"> </w:t>
+      </w:r>
+      <w:r>
+        <w:rPr>
+          <w:rStyle w:val="StringTok"/>
+        </w:rPr>
+        <w:t xml:space="preserve">'limit_news_scope_query_filter'</w:t>
+      </w:r>
+      <w:r>
+        <w:rPr>
+          <w:rStyle w:val="NormalTok"/>
+        </w:rPr>
+        <w:t xml:space="preserve"> )</w:t>
+      </w:r>
+      <w:r>
+        <w:rPr>
+          <w:rStyle w:val="OtherTok"/>
+        </w:rPr>
+        <w:t xml:space="preserve">;</w:t>
+      </w:r>
+    </w:p>
+    <w:bookmarkEnd w:id="51"/>
+    <w:bookmarkStart w:id="52" w:name="not-in"/>
+    <w:p>
+      <w:pPr>
+        <w:pStyle w:val="Heading3"/>
+      </w:pPr>
+      <w:r>
+        <w:t xml:space="preserve">NOT IN</w:t>
+      </w:r>
+    </w:p>
+    <w:p>
+      <w:pPr>
+        <w:pStyle w:val="Compact"/>
+        <w:numPr>
+          <w:ilvl w:val="0"/>
+          <w:numId w:val="1029"/>
+        </w:numPr>
+      </w:pPr>
+      <w:r>
+        <w:t xml:space="preserve">[ ] Avoid large</w:t>
+      </w:r>
+      <w:r>
+        <w:t xml:space="preserve"> </w:t>
+      </w:r>
+      <w:r>
+        <w:rPr>
+          <w:rStyle w:val="VerbatimChar"/>
+        </w:rPr>
+        <w:t xml:space="preserve">NOT IN</w:t>
+      </w:r>
+      <w:r>
+        <w:t xml:space="preserve"> </w:t>
+      </w:r>
+      <w:r>
+        <w:t xml:space="preserve">exclusions.</w:t>
+      </w:r>
+    </w:p>
+    <w:p>
+      <w:pPr>
+        <w:pStyle w:val="Compact"/>
+        <w:numPr>
+          <w:ilvl w:val="0"/>
+          <w:numId w:val="1029"/>
+        </w:numPr>
+      </w:pPr>
+      <w:r>
+        <w:t xml:space="preserve">[ ] Prefer positive selection rules where possible.</w:t>
+      </w:r>
+    </w:p>
+    <w:p>
+      <w:pPr>
+        <w:pStyle w:val="Compact"/>
+        <w:numPr>
+          <w:ilvl w:val="0"/>
+          <w:numId w:val="1029"/>
+        </w:numPr>
+      </w:pPr>
+      <w:r>
+        <w:t xml:space="preserve">[ ] Cache exclusion sets if they must be computed.</w:t>
+      </w:r>
+    </w:p>
+    <w:p>
+      <w:pPr>
+        <w:pStyle w:val="Compact"/>
+        <w:numPr>
+          <w:ilvl w:val="0"/>
+          <w:numId w:val="1029"/>
+        </w:numPr>
+      </w:pPr>
+      <w:r>
+        <w:t xml:space="preserve">[ ] Test with production-scale data.</w:t>
+      </w:r>
+    </w:p>
+    <w:p>
+      <w:pPr>
+        <w:pStyle w:val="FirstParagraph"/>
+      </w:pPr>
+      <w:r>
+        <w:t xml:space="preserve">Example to scrutinize:</w:t>
+      </w:r>
+    </w:p>
+    <w:p>
+      <w:pPr>
+        <w:pStyle w:val="SourceCode"/>
+      </w:pPr>
+      <w:r>
+        <w:rPr>
+          <w:rStyle w:val="KeywordTok"/>
+        </w:rPr>
+        <w:t xml:space="preserve">SELECT</w:t>
+      </w:r>
+      <w:r>
+        <w:rPr>
+          <w:rStyle w:val="NormalTok"/>
+        </w:rPr>
+        <w:t xml:space="preserve"> </w:t>
+      </w:r>
+      <w:r>
+        <w:rPr>
+          <w:rStyle w:val="OperatorTok"/>
+        </w:rPr>
+        <w:t xml:space="preserve">*</w:t>
+      </w:r>
+      <w:r>
+        <w:rPr>
+          <w:rStyle w:val="NormalTok"/>
+        </w:rPr>
+        <w:t xml:space="preserve"> </w:t>
+      </w:r>
+      <w:r>
+        <w:rPr>
+          <w:rStyle w:val="KeywordTok"/>
+        </w:rPr>
+        <w:t xml:space="preserve">FROM</w:t>
+      </w:r>
+      <w:r>
+        <w:rPr>
+          <w:rStyle w:val="NormalTok"/>
+        </w:rPr>
+        <w:t xml:space="preserve"> wp_posts</w:t>
+      </w:r>
+      <w:r>
+        <w:br/>
+      </w:r>
+      <w:r>
+        <w:rPr>
+          <w:rStyle w:val="KeywordTok"/>
+        </w:rPr>
+        <w:t xml:space="preserve">WHERE</w:t>
+      </w:r>
+      <w:r>
+        <w:rPr>
+          <w:rStyle w:val="NormalTok"/>
+        </w:rPr>
+        <w:t xml:space="preserve"> post_type </w:t>
+      </w:r>
+      <w:r>
+        <w:rPr>
+          <w:rStyle w:val="OperatorTok"/>
+        </w:rPr>
+        <w:t xml:space="preserve">=</w:t>
+      </w:r>
+      <w:r>
+        <w:rPr>
+          <w:rStyle w:val="NormalTok"/>
+        </w:rPr>
+        <w:t xml:space="preserve"> </w:t>
+      </w:r>
+      <w:r>
+        <w:rPr>
+          <w:rStyle w:val="StringTok"/>
+        </w:rPr>
+        <w:t xml:space="preserve">'post'</w:t>
+      </w:r>
+      <w:r>
+        <w:br/>
+      </w:r>
+      <w:r>
+        <w:rPr>
+          <w:rStyle w:val="NormalTok"/>
+        </w:rPr>
+        <w:t xml:space="preserve">  </w:t>
+      </w:r>
+      <w:r>
+        <w:rPr>
+          <w:rStyle w:val="KeywordTok"/>
+        </w:rPr>
+        <w:t xml:space="preserve">AND</w:t>
+      </w:r>
+      <w:r>
+        <w:rPr>
+          <w:rStyle w:val="NormalTok"/>
+        </w:rPr>
+        <w:t xml:space="preserve"> post_status </w:t>
+      </w:r>
+      <w:r>
+        <w:rPr>
+          <w:rStyle w:val="OperatorTok"/>
+        </w:rPr>
+        <w:t xml:space="preserve">=</w:t>
+      </w:r>
+      <w:r>
+        <w:rPr>
+          <w:rStyle w:val="NormalTok"/>
+        </w:rPr>
+        <w:t xml:space="preserve"> </w:t>
+      </w:r>
+      <w:r>
+        <w:rPr>
+          <w:rStyle w:val="StringTok"/>
+        </w:rPr>
+        <w:t xml:space="preserve">'publish'</w:t>
+      </w:r>
+      <w:r>
+        <w:br/>
+      </w:r>
+      <w:r>
+        <w:rPr>
+          <w:rStyle w:val="NormalTok"/>
+        </w:rPr>
+        <w:t xml:space="preserve">  </w:t>
+      </w:r>
+      <w:r>
+        <w:rPr>
+          <w:rStyle w:val="KeywordTok"/>
+        </w:rPr>
+        <w:t xml:space="preserve">AND</w:t>
+      </w:r>
+      <w:r>
+        <w:rPr>
+          <w:rStyle w:val="NormalTok"/>
+        </w:rPr>
+        <w:t xml:space="preserve"> </w:t>
+      </w:r>
+      <w:r>
+        <w:rPr>
+          <w:rStyle w:val="KeywordTok"/>
+        </w:rPr>
+        <w:t xml:space="preserve">ID</w:t>
+      </w:r>
+      <w:r>
+        <w:rPr>
+          <w:rStyle w:val="NormalTok"/>
+        </w:rPr>
+        <w:t xml:space="preserve"> </w:t>
+      </w:r>
+      <w:r>
+        <w:rPr>
+          <w:rStyle w:val="KeywordTok"/>
+        </w:rPr>
+        <w:t xml:space="preserve">NOT</w:t>
+      </w:r>
+      <w:r>
+        <w:rPr>
+          <w:rStyle w:val="NormalTok"/>
+        </w:rPr>
+        <w:t xml:space="preserve"> </w:t>
+      </w:r>
+      <w:r>
+        <w:rPr>
+          <w:rStyle w:val="KeywordTok"/>
+        </w:rPr>
+        <w:t xml:space="preserve">IN</w:t>
+      </w:r>
+      <w:r>
+        <w:rPr>
+          <w:rStyle w:val="NormalTok"/>
+        </w:rPr>
+        <w:t xml:space="preserve"> (</w:t>
+      </w:r>
+      <w:r>
+        <w:rPr>
+          <w:rStyle w:val="DecValTok"/>
+        </w:rPr>
+        <w:t xml:space="preserve">1</w:t>
+      </w:r>
+      <w:r>
+        <w:rPr>
+          <w:rStyle w:val="NormalTok"/>
+        </w:rPr>
+        <w:t xml:space="preserve">, </w:t>
+      </w:r>
+      <w:r>
+        <w:rPr>
+          <w:rStyle w:val="DecValTok"/>
+        </w:rPr>
+        <w:t xml:space="preserve">2</w:t>
+      </w:r>
+      <w:r>
+        <w:rPr>
+          <w:rStyle w:val="NormalTok"/>
+        </w:rPr>
+        <w:t xml:space="preserve">, </w:t>
+      </w:r>
+      <w:r>
+        <w:rPr>
+          <w:rStyle w:val="DecValTok"/>
+        </w:rPr>
+        <w:t xml:space="preserve">3</w:t>
+      </w:r>
+      <w:r>
+        <w:rPr>
+          <w:rStyle w:val="NormalTok"/>
+        </w:rPr>
+        <w:t xml:space="preserve">);</w:t>
+      </w:r>
+    </w:p>
     <w:bookmarkEnd w:id="52"/>
-    <w:bookmarkStart w:id="57" w:name="taxonomies-exclusions-post-meta-and-like"/>
-    <w:p>
-      <w:pPr>
-        <w:pStyle w:val="Heading2"/>
-      </w:pPr>
-      <w:r>
-        <w:t xml:space="preserve">10. Taxonomies, exclusions, post meta, and LIKE</w:t>
-      </w:r>
-    </w:p>
-    <w:bookmarkStart w:id="53" w:name="taxonomies"/>
+    <w:bookmarkStart w:id="53" w:name="post-meta"/>
     <w:p>
       <w:pPr>
         <w:pStyle w:val="Heading3"/>
       </w:pPr>
       <w:r>
-        <w:t xml:space="preserve">Taxonomies</w:t>
-      </w:r>
-    </w:p>
-    <w:p>
-      <w:pPr>
-        <w:pStyle w:val="Compact"/>
-        <w:numPr>
-          <w:ilvl w:val="0"/>
-          <w:numId w:val="1028"/>
-        </w:numPr>
-      </w:pPr>
-      <w:r>
-        <w:t xml:space="preserve">[ ] Use taxonomies for classification, not arbitrary high-cardinality data.</w:t>
-      </w:r>
-    </w:p>
-    <w:p>
-      <w:pPr>
-        <w:pStyle w:val="Compact"/>
-        <w:numPr>
-          <w:ilvl w:val="0"/>
-          <w:numId w:val="1028"/>
-        </w:numPr>
-      </w:pPr>
-      <w:r>
-        <w:t xml:space="preserve">[ ] Avoid overly complex taxonomy intersections/exclusions.</w:t>
-      </w:r>
-    </w:p>
-    <w:p>
-      <w:pPr>
-        <w:pStyle w:val="Compact"/>
-        <w:numPr>
-          <w:ilvl w:val="0"/>
-          <w:numId w:val="1028"/>
-        </w:numPr>
-      </w:pPr>
-      <w:r>
-        <w:t xml:space="preserve">[ ] Keep term relationships manageable.</w:t>
-      </w:r>
-    </w:p>
-    <w:p>
-      <w:pPr>
-        <w:pStyle w:val="Compact"/>
-        <w:numPr>
-          <w:ilvl w:val="0"/>
-          <w:numId w:val="1028"/>
-        </w:numPr>
-      </w:pPr>
-      <w:r>
-        <w:t xml:space="preserve">[ ] Use dedicated indexes/search systems for large faceted search use cases.</w:t>
-      </w:r>
-    </w:p>
-    <w:p>
-      <w:pPr>
-        <w:pStyle w:val="FirstParagraph"/>
-      </w:pPr>
-      <w:r>
-        <w:t xml:space="preserve">Example scope limiter:</w:t>
-      </w:r>
-    </w:p>
-    <w:p>
-      <w:pPr>
-        <w:pStyle w:val="SourceCode"/>
-      </w:pPr>
-      <w:r>
-        <w:rPr>
-          <w:rStyle w:val="KeywordTok"/>
-        </w:rPr>
-        <w:t xml:space="preserve">function</w:t>
-      </w:r>
-      <w:r>
-        <w:rPr>
-          <w:rStyle w:val="NormalTok"/>
-        </w:rPr>
-        <w:t xml:space="preserve"> limit_news_scope_query_filter( </w:t>
-      </w:r>
-      <w:r>
-        <w:rPr>
-          <w:rStyle w:val="VariableTok"/>
-        </w:rPr>
-        <w:t xml:space="preserve">$query</w:t>
-      </w:r>
-      <w:r>
-        <w:rPr>
-          <w:rStyle w:val="NormalTok"/>
-        </w:rPr>
-        <w:t xml:space="preserve"> ) {</w:t>
-      </w:r>
-      <w:r>
-        <w:br/>
-      </w:r>
-      <w:r>
-        <w:rPr>
-          <w:rStyle w:val="NormalTok"/>
-        </w:rPr>
-        <w:t xml:space="preserve">    </w:t>
-      </w:r>
-      <w:r>
-        <w:rPr>
-          <w:rStyle w:val="ControlFlowTok"/>
-        </w:rPr>
-        <w:t xml:space="preserve">if</w:t>
-      </w:r>
-      <w:r>
-        <w:rPr>
-          <w:rStyle w:val="NormalTok"/>
-        </w:rPr>
-        <w:t xml:space="preserve"> ( is_admin() </w:t>
-      </w:r>
-      <w:r>
-        <w:rPr>
-          <w:rStyle w:val="OperatorTok"/>
-        </w:rPr>
-        <w:t xml:space="preserve">||</w:t>
-      </w:r>
-      <w:r>
-        <w:rPr>
-          <w:rStyle w:val="NormalTok"/>
-        </w:rPr>
-        <w:t xml:space="preserve"> </w:t>
-      </w:r>
-      <w:r>
-        <w:rPr>
-          <w:rStyle w:val="OperatorTok"/>
-        </w:rPr>
-        <w:t xml:space="preserve">!</w:t>
-      </w:r>
-      <w:r>
-        <w:rPr>
-          <w:rStyle w:val="NormalTok"/>
-        </w:rPr>
-        <w:t xml:space="preserve"> </w:t>
-      </w:r>
-      <w:r>
-        <w:rPr>
-          <w:rStyle w:val="VariableTok"/>
-        </w:rPr>
-        <w:t xml:space="preserve">$query</w:t>
-      </w:r>
-      <w:r>
-        <w:rPr>
-          <w:rStyle w:val="NormalTok"/>
-        </w:rPr>
-        <w:t xml:space="preserve">-&gt;is_main_query() ) {</w:t>
-      </w:r>
-      <w:r>
-        <w:br/>
-      </w:r>
-      <w:r>
-        <w:rPr>
-          <w:rStyle w:val="NormalTok"/>
-        </w:rPr>
-        <w:t xml:space="preserve">        </w:t>
-      </w:r>
-      <w:r>
-        <w:rPr>
-          <w:rStyle w:val="ControlFlowTok"/>
-        </w:rPr>
-        <w:t xml:space="preserve">return</w:t>
-      </w:r>
-      <w:r>
-        <w:rPr>
-          <w:rStyle w:val="OtherTok"/>
-        </w:rPr>
-        <w:t xml:space="preserve">;</w:t>
-      </w:r>
-      <w:r>
-        <w:br/>
-      </w:r>
-      <w:r>
-        <w:rPr>
-          <w:rStyle w:val="NormalTok"/>
-        </w:rPr>
-        <w:t xml:space="preserve">    }</w:t>
-      </w:r>
-      <w:r>
-        <w:br/>
-      </w:r>
-      <w:r>
-        <w:br/>
-      </w:r>
-      <w:r>
-        <w:rPr>
-          <w:rStyle w:val="NormalTok"/>
-        </w:rPr>
-        <w:t xml:space="preserve">    </w:t>
-      </w:r>
-      <w:r>
-        <w:rPr>
-          <w:rStyle w:val="ControlFlowTok"/>
-        </w:rPr>
-        <w:t xml:space="preserve">if</w:t>
-      </w:r>
-      <w:r>
-        <w:rPr>
-          <w:rStyle w:val="NormalTok"/>
-        </w:rPr>
-        <w:t xml:space="preserve"> ( </w:t>
-      </w:r>
-      <w:r>
-        <w:rPr>
-          <w:rStyle w:val="VariableTok"/>
-        </w:rPr>
-        <w:t xml:space="preserve">$query</w:t>
-      </w:r>
-      <w:r>
-        <w:rPr>
-          <w:rStyle w:val="NormalTok"/>
-        </w:rPr>
-        <w:t xml:space="preserve">-&gt;is_category() ) {</w:t>
-      </w:r>
-      <w:r>
-        <w:br/>
-      </w:r>
-      <w:r>
-        <w:rPr>
-          <w:rStyle w:val="NormalTok"/>
-        </w:rPr>
-        <w:t xml:space="preserve">        </w:t>
-      </w:r>
-      <w:r>
-        <w:rPr>
-          <w:rStyle w:val="VariableTok"/>
-        </w:rPr>
-        <w:t xml:space="preserve">$query</w:t>
-      </w:r>
-      <w:r>
-        <w:rPr>
-          <w:rStyle w:val="NormalTok"/>
-        </w:rPr>
-        <w:t xml:space="preserve">-&gt;set( </w:t>
-      </w:r>
-      <w:r>
-        <w:rPr>
-          <w:rStyle w:val="StringTok"/>
-        </w:rPr>
-        <w:t xml:space="preserve">'posts_per_page'</w:t>
-      </w:r>
-      <w:r>
-        <w:rPr>
-          <w:rStyle w:val="OtherTok"/>
-        </w:rPr>
-        <w:t xml:space="preserve">,</w:t>
-      </w:r>
-      <w:r>
-        <w:rPr>
-          <w:rStyle w:val="NormalTok"/>
-        </w:rPr>
-        <w:t xml:space="preserve"> </w:t>
-      </w:r>
-      <w:r>
-        <w:rPr>
-          <w:rStyle w:val="DecValTok"/>
-        </w:rPr>
-        <w:t xml:space="preserve">20</w:t>
-      </w:r>
-      <w:r>
-        <w:rPr>
-          <w:rStyle w:val="NormalTok"/>
-        </w:rPr>
-        <w:t xml:space="preserve"> )</w:t>
-      </w:r>
-      <w:r>
-        <w:rPr>
-          <w:rStyle w:val="OtherTok"/>
-        </w:rPr>
-        <w:t xml:space="preserve">;</w:t>
-      </w:r>
-      <w:r>
-        <w:br/>
-      </w:r>
-      <w:r>
-        <w:rPr>
-          <w:rStyle w:val="NormalTok"/>
-        </w:rPr>
-        <w:t xml:space="preserve">    }</w:t>
-      </w:r>
-      <w:r>
-        <w:br/>
-      </w:r>
-      <w:r>
-        <w:rPr>
-          <w:rStyle w:val="NormalTok"/>
-        </w:rPr>
-        <w:t xml:space="preserve">}</w:t>
-      </w:r>
-      <w:r>
-        <w:br/>
-      </w:r>
-      <w:r>
-        <w:rPr>
-          <w:rStyle w:val="NormalTok"/>
-        </w:rPr>
-        <w:t xml:space="preserve">add_action( </w:t>
-      </w:r>
-      <w:r>
-        <w:rPr>
-          <w:rStyle w:val="StringTok"/>
-        </w:rPr>
-        <w:t xml:space="preserve">'pre_get_posts'</w:t>
-      </w:r>
-      <w:r>
-        <w:rPr>
-          <w:rStyle w:val="OtherTok"/>
-        </w:rPr>
-        <w:t xml:space="preserve">,</w:t>
-      </w:r>
-      <w:r>
-        <w:rPr>
-          <w:rStyle w:val="NormalTok"/>
-        </w:rPr>
-        <w:t xml:space="preserve"> </w:t>
-      </w:r>
-      <w:r>
-        <w:rPr>
-          <w:rStyle w:val="StringTok"/>
-        </w:rPr>
-        <w:t xml:space="preserve">'limit_news_scope_query_filter'</w:t>
-      </w:r>
-      <w:r>
-        <w:rPr>
-          <w:rStyle w:val="NormalTok"/>
-        </w:rPr>
-        <w:t xml:space="preserve"> )</w:t>
-      </w:r>
-      <w:r>
-        <w:rPr>
-          <w:rStyle w:val="OtherTok"/>
-        </w:rPr>
-        <w:t xml:space="preserve">;</w:t>
+        <w:t xml:space="preserve">Post meta</w:t>
+      </w:r>
+    </w:p>
+    <w:p>
+      <w:pPr>
+        <w:pStyle w:val="Compact"/>
+        <w:numPr>
+          <w:ilvl w:val="0"/>
+          <w:numId w:val="1030"/>
+        </w:numPr>
+      </w:pPr>
+      <w:r>
+        <w:t xml:space="preserve">[ ] Do not treat post meta as a general-purpose relational store at scale.</w:t>
+      </w:r>
+    </w:p>
+    <w:p>
+      <w:pPr>
+        <w:pStyle w:val="Compact"/>
+        <w:numPr>
+          <w:ilvl w:val="0"/>
+          <w:numId w:val="1030"/>
+        </w:numPr>
+      </w:pPr>
+      <w:r>
+        <w:t xml:space="preserve">[ ] Avoid sorting/filtering large result sets by arbitrary meta values.</w:t>
+      </w:r>
+    </w:p>
+    <w:p>
+      <w:pPr>
+        <w:pStyle w:val="Compact"/>
+        <w:numPr>
+          <w:ilvl w:val="0"/>
+          <w:numId w:val="1030"/>
+        </w:numPr>
+      </w:pPr>
+      <w:r>
+        <w:t xml:space="preserve">[ ] Consider custom tables or search infrastructure for high-volume structured data.</w:t>
       </w:r>
     </w:p>
     <w:bookmarkEnd w:id="53"/>
-    <w:bookmarkStart w:id="54" w:name="not-in"/>
-    <w:p>
-      <w:pPr>
-        <w:pStyle w:val="Heading3"/>
-      </w:pPr>
-      <w:r>
-        <w:t xml:space="preserve">NOT IN</w:t>
-      </w:r>
-    </w:p>
-    <w:p>
-      <w:pPr>
-        <w:pStyle w:val="Compact"/>
-        <w:numPr>
-          <w:ilvl w:val="0"/>
-          <w:numId w:val="1029"/>
-        </w:numPr>
-      </w:pPr>
-      <w:r>
-        <w:t xml:space="preserve">[ ] Avoid large</w:t>
-      </w:r>
-      <w:r>
-        <w:t xml:space="preserve"> </w:t>
-      </w:r>
-      <w:r>
-        <w:rPr>
-          <w:rStyle w:val="VerbatimChar"/>
-        </w:rPr>
-        <w:t xml:space="preserve">NOT IN</w:t>
-      </w:r>
-      <w:r>
-        <w:t xml:space="preserve"> </w:t>
-      </w:r>
-      <w:r>
-        <w:t xml:space="preserve">exclusions.</w:t>
-      </w:r>
-    </w:p>
-    <w:p>
-      <w:pPr>
-        <w:pStyle w:val="Compact"/>
-        <w:numPr>
-          <w:ilvl w:val="0"/>
-          <w:numId w:val="1029"/>
-        </w:numPr>
-      </w:pPr>
-      <w:r>
-        <w:t xml:space="preserve">[ ] Prefer positive selection rules where possible.</w:t>
-      </w:r>
-    </w:p>
-    <w:p>
-      <w:pPr>
-        <w:pStyle w:val="Compact"/>
-        <w:numPr>
-          <w:ilvl w:val="0"/>
-          <w:numId w:val="1029"/>
-        </w:numPr>
-      </w:pPr>
-      <w:r>
-        <w:t xml:space="preserve">[ ] Cache exclusion sets if they must be computed.</w:t>
-      </w:r>
-    </w:p>
-    <w:p>
-      <w:pPr>
-        <w:pStyle w:val="Compact"/>
-        <w:numPr>
-          <w:ilvl w:val="0"/>
-          <w:numId w:val="1029"/>
-        </w:numPr>
-      </w:pPr>
-      <w:r>
-        <w:t xml:space="preserve">[ ] Test with production-scale data.</w:t>
-      </w:r>
-    </w:p>
-    <w:p>
-      <w:pPr>
-        <w:pStyle w:val="FirstParagraph"/>
-      </w:pPr>
-      <w:r>
-        <w:t xml:space="preserve">Example to scrutinize:</w:t>
-      </w:r>
-    </w:p>
-    <w:p>
-      <w:pPr>
-        <w:pStyle w:val="SourceCode"/>
-      </w:pPr>
-      <w:r>
-        <w:rPr>
-          <w:rStyle w:val="KeywordTok"/>
-        </w:rPr>
-        <w:t xml:space="preserve">SELECT</w:t>
-      </w:r>
-      <w:r>
-        <w:rPr>
-          <w:rStyle w:val="NormalTok"/>
-        </w:rPr>
-        <w:t xml:space="preserve"> </w:t>
-      </w:r>
-      <w:r>
-        <w:rPr>
-          <w:rStyle w:val="OperatorTok"/>
-        </w:rPr>
-        <w:t xml:space="preserve">*</w:t>
-      </w:r>
-      <w:r>
-        <w:rPr>
-          <w:rStyle w:val="NormalTok"/>
-        </w:rPr>
-        <w:t xml:space="preserve"> </w:t>
-      </w:r>
-      <w:r>
-        <w:rPr>
-          <w:rStyle w:val="KeywordTok"/>
-        </w:rPr>
-        <w:t xml:space="preserve">FROM</w:t>
-      </w:r>
-      <w:r>
-        <w:rPr>
-          <w:rStyle w:val="NormalTok"/>
-        </w:rPr>
-        <w:t xml:space="preserve"> wp_posts</w:t>
-      </w:r>
-      <w:r>
-        <w:br/>
-      </w:r>
-      <w:r>
-        <w:rPr>
-          <w:rStyle w:val="KeywordTok"/>
-        </w:rPr>
-        <w:t xml:space="preserve">WHERE</w:t>
-      </w:r>
-      <w:r>
-        <w:rPr>
-          <w:rStyle w:val="NormalTok"/>
-        </w:rPr>
-        <w:t xml:space="preserve"> post_type </w:t>
-      </w:r>
-      <w:r>
-        <w:rPr>
-          <w:rStyle w:val="OperatorTok"/>
-        </w:rPr>
-        <w:t xml:space="preserve">=</w:t>
-      </w:r>
-      <w:r>
-        <w:rPr>
-          <w:rStyle w:val="NormalTok"/>
-        </w:rPr>
-        <w:t xml:space="preserve"> </w:t>
-      </w:r>
-      <w:r>
-        <w:rPr>
-          <w:rStyle w:val="StringTok"/>
-        </w:rPr>
-        <w:t xml:space="preserve">'post'</w:t>
-      </w:r>
-      <w:r>
-        <w:br/>
-      </w:r>
-      <w:r>
-        <w:rPr>
-          <w:rStyle w:val="NormalTok"/>
-        </w:rPr>
-        <w:t xml:space="preserve">  </w:t>
-      </w:r>
-      <w:r>
-        <w:rPr>
-          <w:rStyle w:val="KeywordTok"/>
-        </w:rPr>
-        <w:t xml:space="preserve">AND</w:t>
-      </w:r>
-      <w:r>
-        <w:rPr>
-          <w:rStyle w:val="NormalTok"/>
-        </w:rPr>
-        <w:t xml:space="preserve"> post_status </w:t>
-      </w:r>
-      <w:r>
-        <w:rPr>
-          <w:rStyle w:val="OperatorTok"/>
-        </w:rPr>
-        <w:t xml:space="preserve">=</w:t>
-      </w:r>
-      <w:r>
-        <w:rPr>
-          <w:rStyle w:val="NormalTok"/>
-        </w:rPr>
-        <w:t xml:space="preserve"> </w:t>
-      </w:r>
-      <w:r>
-        <w:rPr>
-          <w:rStyle w:val="StringTok"/>
-        </w:rPr>
-        <w:t xml:space="preserve">'publish'</w:t>
-      </w:r>
-      <w:r>
-        <w:br/>
-      </w:r>
-      <w:r>
-        <w:rPr>
-          <w:rStyle w:val="NormalTok"/>
-        </w:rPr>
-        <w:t xml:space="preserve">  </w:t>
-      </w:r>
-      <w:r>
-        <w:rPr>
-          <w:rStyle w:val="KeywordTok"/>
-        </w:rPr>
-        <w:t xml:space="preserve">AND</w:t>
-      </w:r>
-      <w:r>
-        <w:rPr>
-          <w:rStyle w:val="NormalTok"/>
-        </w:rPr>
-        <w:t xml:space="preserve"> </w:t>
-      </w:r>
-      <w:r>
-        <w:rPr>
-          <w:rStyle w:val="KeywordTok"/>
-        </w:rPr>
-        <w:t xml:space="preserve">ID</w:t>
-      </w:r>
-      <w:r>
-        <w:rPr>
-          <w:rStyle w:val="NormalTok"/>
-        </w:rPr>
-        <w:t xml:space="preserve"> </w:t>
-      </w:r>
-      <w:r>
-        <w:rPr>
-          <w:rStyle w:val="KeywordTok"/>
-        </w:rPr>
-        <w:t xml:space="preserve">NOT</w:t>
-      </w:r>
-      <w:r>
-        <w:rPr>
-          <w:rStyle w:val="NormalTok"/>
-        </w:rPr>
-        <w:t xml:space="preserve"> </w:t>
-      </w:r>
-      <w:r>
-        <w:rPr>
-          <w:rStyle w:val="KeywordTok"/>
-        </w:rPr>
-        <w:t xml:space="preserve">IN</w:t>
-      </w:r>
-      <w:r>
-        <w:rPr>
-          <w:rStyle w:val="NormalTok"/>
-        </w:rPr>
-        <w:t xml:space="preserve"> (</w:t>
-      </w:r>
-      <w:r>
-        <w:rPr>
-          <w:rStyle w:val="DecValTok"/>
-        </w:rPr>
-        <w:t xml:space="preserve">1</w:t>
-      </w:r>
-      <w:r>
-        <w:rPr>
-          <w:rStyle w:val="NormalTok"/>
-        </w:rPr>
-        <w:t xml:space="preserve">, </w:t>
-      </w:r>
-      <w:r>
-        <w:rPr>
-          <w:rStyle w:val="DecValTok"/>
-        </w:rPr>
-        <w:t xml:space="preserve">2</w:t>
-      </w:r>
-      <w:r>
-        <w:rPr>
-          <w:rStyle w:val="NormalTok"/>
-        </w:rPr>
-        <w:t xml:space="preserve">, </w:t>
-      </w:r>
-      <w:r>
-        <w:rPr>
-          <w:rStyle w:val="DecValTok"/>
-        </w:rPr>
-        <w:t xml:space="preserve">3</w:t>
-      </w:r>
-      <w:r>
-        <w:rPr>
-          <w:rStyle w:val="NormalTok"/>
-        </w:rPr>
-        <w:t xml:space="preserve">);</w:t>
-      </w:r>
-    </w:p>
-    <w:bookmarkEnd w:id="54"/>
-    <w:bookmarkStart w:id="55" w:name="post-meta"/>
-    <w:p>
-      <w:pPr>
-        <w:pStyle w:val="Heading3"/>
-      </w:pPr>
-      <w:r>
-        <w:t xml:space="preserve">Post meta</w:t>
-      </w:r>
-    </w:p>
-    <w:p>
-      <w:pPr>
-        <w:pStyle w:val="Compact"/>
-        <w:numPr>
-          <w:ilvl w:val="0"/>
-          <w:numId w:val="1030"/>
-        </w:numPr>
-      </w:pPr>
-      <w:r>
-        <w:t xml:space="preserve">[ ] Do not treat post meta as a general-purpose relational store at scale.</w:t>
-      </w:r>
-    </w:p>
-    <w:p>
-      <w:pPr>
-        <w:pStyle w:val="Compact"/>
-        <w:numPr>
-          <w:ilvl w:val="0"/>
-          <w:numId w:val="1030"/>
-        </w:numPr>
-      </w:pPr>
-      <w:r>
-        <w:t xml:space="preserve">[ ] Avoid sorting/filtering large result sets by arbitrary meta values.</w:t>
-      </w:r>
-    </w:p>
-    <w:p>
-      <w:pPr>
-        <w:pStyle w:val="Compact"/>
-        <w:numPr>
-          <w:ilvl w:val="0"/>
-          <w:numId w:val="1030"/>
-        </w:numPr>
-      </w:pPr>
-      <w:r>
-        <w:t xml:space="preserve">[ ] Consider custom tables or search infrastructure for high-volume structured data.</w:t>
-      </w:r>
-    </w:p>
-    <w:bookmarkEnd w:id="55"/>
-    <w:bookmarkStart w:id="56" w:name="like"/>
+    <w:bookmarkStart w:id="54" w:name="like"/>
     <w:p>
       <w:pPr>
         <w:pStyle w:val="Heading3"/>
@@ -6838,9 +6771,9 @@
         </w:pict>
       </w:r>
     </w:p>
-    <w:bookmarkEnd w:id="56"/>
-    <w:bookmarkEnd w:id="57"/>
-    <w:bookmarkStart w:id="58" w:name="explain-driven-query-review"/>
+    <w:bookmarkEnd w:id="54"/>
+    <w:bookmarkEnd w:id="55"/>
+    <w:bookmarkStart w:id="56" w:name="explain-driven-query-review"/>
     <w:p>
       <w:pPr>
         <w:pStyle w:val="Heading2"/>
@@ -7230,8 +7163,8 @@
         </w:pict>
       </w:r>
     </w:p>
-    <w:bookmarkEnd w:id="58"/>
-    <w:bookmarkStart w:id="59" w:name="object-caching"/>
+    <w:bookmarkEnd w:id="56"/>
+    <w:bookmarkStart w:id="57" w:name="object-caching"/>
     <w:p>
       <w:pPr>
         <w:pStyle w:val="Heading2"/>
@@ -7505,8 +7438,8 @@
         </w:pict>
       </w:r>
     </w:p>
-    <w:bookmarkEnd w:id="59"/>
-    <w:bookmarkStart w:id="60" w:name="transients-and-in-memory-caching"/>
+    <w:bookmarkEnd w:id="57"/>
+    <w:bookmarkStart w:id="58" w:name="transients-and-in-memory-caching"/>
     <w:p>
       <w:pPr>
         <w:pStyle w:val="Heading2"/>
@@ -7998,8 +7931,8 @@
         </w:pict>
       </w:r>
     </w:p>
-    <w:bookmarkEnd w:id="60"/>
-    <w:bookmarkStart w:id="61" w:name="race-conditions-and-cache-stampedes"/>
+    <w:bookmarkEnd w:id="58"/>
+    <w:bookmarkStart w:id="59" w:name="race-conditions-and-cache-stampedes"/>
     <w:p>
       <w:pPr>
         <w:pStyle w:val="Heading2"/>
@@ -8668,8 +8601,8 @@
         </w:pict>
       </w:r>
     </w:p>
-    <w:bookmarkEnd w:id="61"/>
-    <w:bookmarkStart w:id="62" w:name="wp-cron-and-scheduled-work"/>
+    <w:bookmarkEnd w:id="59"/>
+    <w:bookmarkStart w:id="60" w:name="wp-cron-and-scheduled-work"/>
     <w:p>
       <w:pPr>
         <w:pStyle w:val="Heading2"/>
@@ -9278,172 +9211,172 @@
         <w:t xml:space="preserve">After setting the constant, confirm scheduled events continue to clear. Roll back by commenting out the constant and clearing OPcache if the backlog grows.</w:t>
       </w:r>
     </w:p>
+    <w:bookmarkEnd w:id="60"/>
+    <w:bookmarkStart w:id="64" w:name="X074b66bf28bf6916238b2bb912424b5abd2e6d1"/>
+    <w:p>
+      <w:pPr>
+        <w:pStyle w:val="Heading2"/>
+      </w:pPr>
+      <w:r>
+        <w:t xml:space="preserve">16. AJAX, REST, sitemaps, redirects, and external requests</w:t>
+      </w:r>
+    </w:p>
+    <w:bookmarkStart w:id="61" w:name="ajax-and-rest"/>
+    <w:p>
+      <w:pPr>
+        <w:pStyle w:val="Heading3"/>
+      </w:pPr>
+      <w:r>
+        <w:t xml:space="preserve">AJAX and REST</w:t>
+      </w:r>
+    </w:p>
+    <w:p>
+      <w:pPr>
+        <w:pStyle w:val="Compact"/>
+        <w:numPr>
+          <w:ilvl w:val="0"/>
+          <w:numId w:val="1039"/>
+        </w:numPr>
+      </w:pPr>
+      <w:r>
+        <w:t xml:space="preserve">[ ] Identify</w:t>
+      </w:r>
+      <w:r>
+        <w:t xml:space="preserve"> </w:t>
+      </w:r>
+      <w:r>
+        <w:rPr>
+          <w:rStyle w:val="VerbatimChar"/>
+        </w:rPr>
+        <w:t xml:space="preserve">admin-ajax.php</w:t>
+      </w:r>
+      <w:r>
+        <w:t xml:space="preserve"> </w:t>
+      </w:r>
+      <w:r>
+        <w:t xml:space="preserve">calls on public pages.</w:t>
+      </w:r>
+    </w:p>
+    <w:p>
+      <w:pPr>
+        <w:pStyle w:val="Compact"/>
+        <w:numPr>
+          <w:ilvl w:val="0"/>
+          <w:numId w:val="1039"/>
+        </w:numPr>
+      </w:pPr>
+      <w:r>
+        <w:t xml:space="preserve">[ ] Identify REST API calls after initial render.</w:t>
+      </w:r>
+    </w:p>
+    <w:p>
+      <w:pPr>
+        <w:pStyle w:val="Compact"/>
+        <w:numPr>
+          <w:ilvl w:val="0"/>
+          <w:numId w:val="1039"/>
+        </w:numPr>
+      </w:pPr>
+      <w:r>
+        <w:t xml:space="preserve">[ ] Remove unnecessary polling.</w:t>
+      </w:r>
+    </w:p>
+    <w:p>
+      <w:pPr>
+        <w:pStyle w:val="Compact"/>
+        <w:numPr>
+          <w:ilvl w:val="0"/>
+          <w:numId w:val="1039"/>
+        </w:numPr>
+      </w:pPr>
+      <w:r>
+        <w:t xml:space="preserve">[ ] Cache public endpoint responses where safe.</w:t>
+      </w:r>
+    </w:p>
+    <w:p>
+      <w:pPr>
+        <w:pStyle w:val="Compact"/>
+        <w:numPr>
+          <w:ilvl w:val="0"/>
+          <w:numId w:val="1039"/>
+        </w:numPr>
+      </w:pPr>
+      <w:r>
+        <w:t xml:space="preserve">[ ] Move heavy endpoint work out of synchronous user requests.</w:t>
+      </w:r>
+    </w:p>
+    <w:p>
+      <w:pPr>
+        <w:pStyle w:val="Compact"/>
+        <w:numPr>
+          <w:ilvl w:val="0"/>
+          <w:numId w:val="1039"/>
+        </w:numPr>
+      </w:pPr>
+      <w:r>
+        <w:t xml:space="preserve">[ ] Authenticate private endpoints correctly.</w:t>
+      </w:r>
+    </w:p>
+    <w:bookmarkEnd w:id="61"/>
+    <w:bookmarkStart w:id="62" w:name="sitemaps"/>
+    <w:p>
+      <w:pPr>
+        <w:pStyle w:val="Heading3"/>
+      </w:pPr>
+      <w:r>
+        <w:t xml:space="preserve">Sitemaps</w:t>
+      </w:r>
+    </w:p>
+    <w:p>
+      <w:pPr>
+        <w:pStyle w:val="Compact"/>
+        <w:numPr>
+          <w:ilvl w:val="0"/>
+          <w:numId w:val="1040"/>
+        </w:numPr>
+      </w:pPr>
+      <w:r>
+        <w:t xml:space="preserve">[ ] Ensure sitemap generation does not perform expensive unbounded queries.</w:t>
+      </w:r>
+    </w:p>
+    <w:p>
+      <w:pPr>
+        <w:pStyle w:val="Compact"/>
+        <w:numPr>
+          <w:ilvl w:val="0"/>
+          <w:numId w:val="1040"/>
+        </w:numPr>
+      </w:pPr>
+      <w:r>
+        <w:t xml:space="preserve">[ ] Cache sitemap output when possible.</w:t>
+      </w:r>
+    </w:p>
+    <w:p>
+      <w:pPr>
+        <w:pStyle w:val="Compact"/>
+        <w:numPr>
+          <w:ilvl w:val="0"/>
+          <w:numId w:val="1040"/>
+        </w:numPr>
+      </w:pPr>
+      <w:r>
+        <w:t xml:space="preserve">[ ] Paginate large sitemaps.</w:t>
+      </w:r>
+    </w:p>
+    <w:p>
+      <w:pPr>
+        <w:pStyle w:val="Compact"/>
+        <w:numPr>
+          <w:ilvl w:val="0"/>
+          <w:numId w:val="1040"/>
+        </w:numPr>
+      </w:pPr>
+      <w:r>
+        <w:t xml:space="preserve">[ ] Avoid regenerating large sitemap structures on every request.</w:t>
+      </w:r>
+    </w:p>
     <w:bookmarkEnd w:id="62"/>
-    <w:bookmarkStart w:id="66" w:name="X074b66bf28bf6916238b2bb912424b5abd2e6d1"/>
-    <w:p>
-      <w:pPr>
-        <w:pStyle w:val="Heading2"/>
-      </w:pPr>
-      <w:r>
-        <w:t xml:space="preserve">16. AJAX, REST, sitemaps, redirects, and external requests</w:t>
-      </w:r>
-    </w:p>
-    <w:bookmarkStart w:id="63" w:name="ajax-and-rest"/>
-    <w:p>
-      <w:pPr>
-        <w:pStyle w:val="Heading3"/>
-      </w:pPr>
-      <w:r>
-        <w:t xml:space="preserve">AJAX and REST</w:t>
-      </w:r>
-    </w:p>
-    <w:p>
-      <w:pPr>
-        <w:pStyle w:val="Compact"/>
-        <w:numPr>
-          <w:ilvl w:val="0"/>
-          <w:numId w:val="1039"/>
-        </w:numPr>
-      </w:pPr>
-      <w:r>
-        <w:t xml:space="preserve">[ ] Identify</w:t>
-      </w:r>
-      <w:r>
-        <w:t xml:space="preserve"> </w:t>
-      </w:r>
-      <w:r>
-        <w:rPr>
-          <w:rStyle w:val="VerbatimChar"/>
-        </w:rPr>
-        <w:t xml:space="preserve">admin-ajax.php</w:t>
-      </w:r>
-      <w:r>
-        <w:t xml:space="preserve"> </w:t>
-      </w:r>
-      <w:r>
-        <w:t xml:space="preserve">calls on public pages.</w:t>
-      </w:r>
-    </w:p>
-    <w:p>
-      <w:pPr>
-        <w:pStyle w:val="Compact"/>
-        <w:numPr>
-          <w:ilvl w:val="0"/>
-          <w:numId w:val="1039"/>
-        </w:numPr>
-      </w:pPr>
-      <w:r>
-        <w:t xml:space="preserve">[ ] Identify REST API calls after initial render.</w:t>
-      </w:r>
-    </w:p>
-    <w:p>
-      <w:pPr>
-        <w:pStyle w:val="Compact"/>
-        <w:numPr>
-          <w:ilvl w:val="0"/>
-          <w:numId w:val="1039"/>
-        </w:numPr>
-      </w:pPr>
-      <w:r>
-        <w:t xml:space="preserve">[ ] Remove unnecessary polling.</w:t>
-      </w:r>
-    </w:p>
-    <w:p>
-      <w:pPr>
-        <w:pStyle w:val="Compact"/>
-        <w:numPr>
-          <w:ilvl w:val="0"/>
-          <w:numId w:val="1039"/>
-        </w:numPr>
-      </w:pPr>
-      <w:r>
-        <w:t xml:space="preserve">[ ] Cache public endpoint responses where safe.</w:t>
-      </w:r>
-    </w:p>
-    <w:p>
-      <w:pPr>
-        <w:pStyle w:val="Compact"/>
-        <w:numPr>
-          <w:ilvl w:val="0"/>
-          <w:numId w:val="1039"/>
-        </w:numPr>
-      </w:pPr>
-      <w:r>
-        <w:t xml:space="preserve">[ ] Move heavy endpoint work out of synchronous user requests.</w:t>
-      </w:r>
-    </w:p>
-    <w:p>
-      <w:pPr>
-        <w:pStyle w:val="Compact"/>
-        <w:numPr>
-          <w:ilvl w:val="0"/>
-          <w:numId w:val="1039"/>
-        </w:numPr>
-      </w:pPr>
-      <w:r>
-        <w:t xml:space="preserve">[ ] Authenticate private endpoints correctly.</w:t>
-      </w:r>
-    </w:p>
-    <w:bookmarkEnd w:id="63"/>
-    <w:bookmarkStart w:id="64" w:name="sitemaps"/>
-    <w:p>
-      <w:pPr>
-        <w:pStyle w:val="Heading3"/>
-      </w:pPr>
-      <w:r>
-        <w:t xml:space="preserve">Sitemaps</w:t>
-      </w:r>
-    </w:p>
-    <w:p>
-      <w:pPr>
-        <w:pStyle w:val="Compact"/>
-        <w:numPr>
-          <w:ilvl w:val="0"/>
-          <w:numId w:val="1040"/>
-        </w:numPr>
-      </w:pPr>
-      <w:r>
-        <w:t xml:space="preserve">[ ] Ensure sitemap generation does not perform expensive unbounded queries.</w:t>
-      </w:r>
-    </w:p>
-    <w:p>
-      <w:pPr>
-        <w:pStyle w:val="Compact"/>
-        <w:numPr>
-          <w:ilvl w:val="0"/>
-          <w:numId w:val="1040"/>
-        </w:numPr>
-      </w:pPr>
-      <w:r>
-        <w:t xml:space="preserve">[ ] Cache sitemap output when possible.</w:t>
-      </w:r>
-    </w:p>
-    <w:p>
-      <w:pPr>
-        <w:pStyle w:val="Compact"/>
-        <w:numPr>
-          <w:ilvl w:val="0"/>
-          <w:numId w:val="1040"/>
-        </w:numPr>
-      </w:pPr>
-      <w:r>
-        <w:t xml:space="preserve">[ ] Paginate large sitemaps.</w:t>
-      </w:r>
-    </w:p>
-    <w:p>
-      <w:pPr>
-        <w:pStyle w:val="Compact"/>
-        <w:numPr>
-          <w:ilvl w:val="0"/>
-          <w:numId w:val="1040"/>
-        </w:numPr>
-      </w:pPr>
-      <w:r>
-        <w:t xml:space="preserve">[ ] Avoid regenerating large sitemap structures on every request.</w:t>
-      </w:r>
-    </w:p>
-    <w:bookmarkEnd w:id="64"/>
-    <w:bookmarkStart w:id="65" w:name="external-requests"/>
+    <w:bookmarkStart w:id="63" w:name="external-requests"/>
     <w:p>
       <w:pPr>
         <w:pStyle w:val="Heading3"/>
@@ -9519,9 +9452,9 @@
         </w:pict>
       </w:r>
     </w:p>
-    <w:bookmarkEnd w:id="65"/>
-    <w:bookmarkEnd w:id="66"/>
-    <w:bookmarkStart w:id="67" w:name="Xbaf3fdb85831dc92fa95e7eb51331eec8c713cb"/>
+    <w:bookmarkEnd w:id="63"/>
+    <w:bookmarkEnd w:id="64"/>
+    <w:bookmarkStart w:id="65" w:name="Xbaf3fdb85831dc92fa95e7eb51331eec8c713cb"/>
     <w:p>
       <w:pPr>
         <w:pStyle w:val="Heading2"/>
@@ -9629,8 +9562,8 @@
         </w:pict>
       </w:r>
     </w:p>
-    <w:bookmarkEnd w:id="67"/>
-    <w:bookmarkStart w:id="68" w:name="traffic-patterns-and-high-traffic-events"/>
+    <w:bookmarkEnd w:id="65"/>
+    <w:bookmarkStart w:id="66" w:name="traffic-patterns-and-high-traffic-events"/>
     <w:p>
       <w:pPr>
         <w:pStyle w:val="Heading2"/>
@@ -9854,8 +9787,8 @@
         </w:pict>
       </w:r>
     </w:p>
-    <w:bookmarkEnd w:id="68"/>
-    <w:bookmarkStart w:id="69" w:name="load-testing"/>
+    <w:bookmarkEnd w:id="66"/>
+    <w:bookmarkStart w:id="67" w:name="load-testing"/>
     <w:p>
       <w:pPr>
         <w:pStyle w:val="Heading2"/>
@@ -10092,745 +10025,745 @@
         </w:pict>
       </w:r>
     </w:p>
+    <w:bookmarkEnd w:id="67"/>
+    <w:bookmarkStart w:id="71" w:name="measuring-time-spent"/>
+    <w:p>
+      <w:pPr>
+        <w:pStyle w:val="Heading2"/>
+      </w:pPr>
+      <w:r>
+        <w:t xml:space="preserve">20. Measuring time spent</w:t>
+      </w:r>
+    </w:p>
+    <w:p>
+      <w:pPr>
+        <w:pStyle w:val="FirstParagraph"/>
+      </w:pPr>
+      <w:r>
+        <w:t xml:space="preserve">Use multiple tools because each sees a different layer.</w:t>
+      </w:r>
+    </w:p>
+    <w:bookmarkStart w:id="68" w:name="php-logging"/>
+    <w:p>
+      <w:pPr>
+        <w:pStyle w:val="Heading3"/>
+      </w:pPr>
+      <w:r>
+        <w:t xml:space="preserve">PHP logging</w:t>
+      </w:r>
+    </w:p>
+    <w:p>
+      <w:pPr>
+        <w:pStyle w:val="Compact"/>
+        <w:numPr>
+          <w:ilvl w:val="0"/>
+          <w:numId w:val="1047"/>
+        </w:numPr>
+      </w:pPr>
+      <w:r>
+        <w:t xml:space="preserve">[ ] Use targeted timing around suspected code paths.</w:t>
+      </w:r>
+    </w:p>
+    <w:p>
+      <w:pPr>
+        <w:pStyle w:val="Compact"/>
+        <w:numPr>
+          <w:ilvl w:val="0"/>
+          <w:numId w:val="1047"/>
+        </w:numPr>
+      </w:pPr>
+      <w:r>
+        <w:t xml:space="preserve">[ ] Remove noisy debug logging after investigation.</w:t>
+      </w:r>
+    </w:p>
+    <w:p>
+      <w:pPr>
+        <w:pStyle w:val="Compact"/>
+        <w:numPr>
+          <w:ilvl w:val="0"/>
+          <w:numId w:val="1047"/>
+        </w:numPr>
+      </w:pPr>
+      <w:r>
+        <w:t xml:space="preserve">[ ] Do not expose timing details publicly.</w:t>
+      </w:r>
+    </w:p>
+    <w:p>
+      <w:pPr>
+        <w:pStyle w:val="FirstParagraph"/>
+      </w:pPr>
+      <w:r>
+        <w:t xml:space="preserve">Example:</w:t>
+      </w:r>
+    </w:p>
+    <w:p>
+      <w:pPr>
+        <w:pStyle w:val="SourceCode"/>
+      </w:pPr>
+      <w:r>
+        <w:rPr>
+          <w:rStyle w:val="KeywordTok"/>
+        </w:rPr>
+        <w:t xml:space="preserve">function</w:t>
+      </w:r>
+      <w:r>
+        <w:rPr>
+          <w:rStyle w:val="NormalTok"/>
+        </w:rPr>
+        <w:t xml:space="preserve"> my_custom_function() {</w:t>
+      </w:r>
+      <w:r>
+        <w:br/>
+      </w:r>
+      <w:r>
+        <w:rPr>
+          <w:rStyle w:val="NormalTok"/>
+        </w:rPr>
+        <w:t xml:space="preserve">    </w:t>
+      </w:r>
+      <w:r>
+        <w:rPr>
+          <w:rStyle w:val="VariableTok"/>
+        </w:rPr>
+        <w:t xml:space="preserve">$start_time</w:t>
+      </w:r>
+      <w:r>
+        <w:rPr>
+          <w:rStyle w:val="NormalTok"/>
+        </w:rPr>
+        <w:t xml:space="preserve"> </w:t>
+      </w:r>
+      <w:r>
+        <w:rPr>
+          <w:rStyle w:val="OperatorTok"/>
+        </w:rPr>
+        <w:t xml:space="preserve">=</w:t>
+      </w:r>
+      <w:r>
+        <w:rPr>
+          <w:rStyle w:val="NormalTok"/>
+        </w:rPr>
+        <w:t xml:space="preserve"> </w:t>
+      </w:r>
+      <w:r>
+        <w:rPr>
+          <w:rStyle w:val="FunctionTok"/>
+        </w:rPr>
+        <w:t xml:space="preserve">microtime</w:t>
+      </w:r>
+      <w:r>
+        <w:rPr>
+          <w:rStyle w:val="NormalTok"/>
+        </w:rPr>
+        <w:t xml:space="preserve">( </w:t>
+      </w:r>
+      <w:r>
+        <w:rPr>
+          <w:rStyle w:val="KeywordTok"/>
+        </w:rPr>
+        <w:t xml:space="preserve">true</w:t>
+      </w:r>
+      <w:r>
+        <w:rPr>
+          <w:rStyle w:val="NormalTok"/>
+        </w:rPr>
+        <w:t xml:space="preserve"> )</w:t>
+      </w:r>
+      <w:r>
+        <w:rPr>
+          <w:rStyle w:val="OtherTok"/>
+        </w:rPr>
+        <w:t xml:space="preserve">;</w:t>
+      </w:r>
+      <w:r>
+        <w:br/>
+      </w:r>
+      <w:r>
+        <w:br/>
+      </w:r>
+      <w:r>
+        <w:rPr>
+          <w:rStyle w:val="NormalTok"/>
+        </w:rPr>
+        <w:t xml:space="preserve">    </w:t>
+      </w:r>
+      <w:r>
+        <w:rPr>
+          <w:rStyle w:val="CommentTok"/>
+        </w:rPr>
+        <w:t xml:space="preserve">// Code to be measured here.</w:t>
+      </w:r>
+      <w:r>
+        <w:br/>
+      </w:r>
+      <w:r>
+        <w:br/>
+      </w:r>
+      <w:r>
+        <w:rPr>
+          <w:rStyle w:val="NormalTok"/>
+        </w:rPr>
+        <w:t xml:space="preserve">    </w:t>
+      </w:r>
+      <w:r>
+        <w:rPr>
+          <w:rStyle w:val="VariableTok"/>
+        </w:rPr>
+        <w:t xml:space="preserve">$end_time</w:t>
+      </w:r>
+      <w:r>
+        <w:rPr>
+          <w:rStyle w:val="NormalTok"/>
+        </w:rPr>
+        <w:t xml:space="preserve"> </w:t>
+      </w:r>
+      <w:r>
+        <w:rPr>
+          <w:rStyle w:val="OperatorTok"/>
+        </w:rPr>
+        <w:t xml:space="preserve">=</w:t>
+      </w:r>
+      <w:r>
+        <w:rPr>
+          <w:rStyle w:val="NormalTok"/>
+        </w:rPr>
+        <w:t xml:space="preserve"> </w:t>
+      </w:r>
+      <w:r>
+        <w:rPr>
+          <w:rStyle w:val="FunctionTok"/>
+        </w:rPr>
+        <w:t xml:space="preserve">microtime</w:t>
+      </w:r>
+      <w:r>
+        <w:rPr>
+          <w:rStyle w:val="NormalTok"/>
+        </w:rPr>
+        <w:t xml:space="preserve">( </w:t>
+      </w:r>
+      <w:r>
+        <w:rPr>
+          <w:rStyle w:val="KeywordTok"/>
+        </w:rPr>
+        <w:t xml:space="preserve">true</w:t>
+      </w:r>
+      <w:r>
+        <w:rPr>
+          <w:rStyle w:val="NormalTok"/>
+        </w:rPr>
+        <w:t xml:space="preserve"> )</w:t>
+      </w:r>
+      <w:r>
+        <w:rPr>
+          <w:rStyle w:val="OtherTok"/>
+        </w:rPr>
+        <w:t xml:space="preserve">;</w:t>
+      </w:r>
+      <w:r>
+        <w:br/>
+      </w:r>
+      <w:r>
+        <w:rPr>
+          <w:rStyle w:val="NormalTok"/>
+        </w:rPr>
+        <w:t xml:space="preserve">    </w:t>
+      </w:r>
+      <w:r>
+        <w:rPr>
+          <w:rStyle w:val="VariableTok"/>
+        </w:rPr>
+        <w:t xml:space="preserve">$execution_time</w:t>
+      </w:r>
+      <w:r>
+        <w:rPr>
+          <w:rStyle w:val="NormalTok"/>
+        </w:rPr>
+        <w:t xml:space="preserve"> </w:t>
+      </w:r>
+      <w:r>
+        <w:rPr>
+          <w:rStyle w:val="OperatorTok"/>
+        </w:rPr>
+        <w:t xml:space="preserve">=</w:t>
+      </w:r>
+      <w:r>
+        <w:rPr>
+          <w:rStyle w:val="NormalTok"/>
+        </w:rPr>
+        <w:t xml:space="preserve"> </w:t>
+      </w:r>
+      <w:r>
+        <w:rPr>
+          <w:rStyle w:val="VariableTok"/>
+        </w:rPr>
+        <w:t xml:space="preserve">$end_time</w:t>
+      </w:r>
+      <w:r>
+        <w:rPr>
+          <w:rStyle w:val="NormalTok"/>
+        </w:rPr>
+        <w:t xml:space="preserve"> </w:t>
+      </w:r>
+      <w:r>
+        <w:rPr>
+          <w:rStyle w:val="OperatorTok"/>
+        </w:rPr>
+        <w:t xml:space="preserve">-</w:t>
+      </w:r>
+      <w:r>
+        <w:rPr>
+          <w:rStyle w:val="NormalTok"/>
+        </w:rPr>
+        <w:t xml:space="preserve"> </w:t>
+      </w:r>
+      <w:r>
+        <w:rPr>
+          <w:rStyle w:val="VariableTok"/>
+        </w:rPr>
+        <w:t xml:space="preserve">$start_time</w:t>
+      </w:r>
+      <w:r>
+        <w:rPr>
+          <w:rStyle w:val="OtherTok"/>
+        </w:rPr>
+        <w:t xml:space="preserve">;</w:t>
+      </w:r>
+      <w:r>
+        <w:br/>
+      </w:r>
+      <w:r>
+        <w:br/>
+      </w:r>
+      <w:r>
+        <w:rPr>
+          <w:rStyle w:val="NormalTok"/>
+        </w:rPr>
+        <w:t xml:space="preserve">    </w:t>
+      </w:r>
+      <w:r>
+        <w:rPr>
+          <w:rStyle w:val="FunctionTok"/>
+        </w:rPr>
+        <w:t xml:space="preserve">error_log</w:t>
+      </w:r>
+      <w:r>
+        <w:rPr>
+          <w:rStyle w:val="NormalTok"/>
+        </w:rPr>
+        <w:t xml:space="preserve">( </w:t>
+      </w:r>
+      <w:r>
+        <w:rPr>
+          <w:rStyle w:val="StringTok"/>
+        </w:rPr>
+        <w:t xml:space="preserve">'my_custom_function took '</w:t>
+      </w:r>
+      <w:r>
+        <w:rPr>
+          <w:rStyle w:val="NormalTok"/>
+        </w:rPr>
+        <w:t xml:space="preserve"> </w:t>
+      </w:r>
+      <w:r>
+        <w:rPr>
+          <w:rStyle w:val="OperatorTok"/>
+        </w:rPr>
+        <w:t xml:space="preserve">.</w:t>
+      </w:r>
+      <w:r>
+        <w:rPr>
+          <w:rStyle w:val="NormalTok"/>
+        </w:rPr>
+        <w:t xml:space="preserve"> </w:t>
+      </w:r>
+      <w:r>
+        <w:rPr>
+          <w:rStyle w:val="VariableTok"/>
+        </w:rPr>
+        <w:t xml:space="preserve">$execution_time</w:t>
+      </w:r>
+      <w:r>
+        <w:rPr>
+          <w:rStyle w:val="NormalTok"/>
+        </w:rPr>
+        <w:t xml:space="preserve"> </w:t>
+      </w:r>
+      <w:r>
+        <w:rPr>
+          <w:rStyle w:val="OperatorTok"/>
+        </w:rPr>
+        <w:t xml:space="preserve">.</w:t>
+      </w:r>
+      <w:r>
+        <w:rPr>
+          <w:rStyle w:val="NormalTok"/>
+        </w:rPr>
+        <w:t xml:space="preserve"> </w:t>
+      </w:r>
+      <w:r>
+        <w:rPr>
+          <w:rStyle w:val="StringTok"/>
+        </w:rPr>
+        <w:t xml:space="preserve">' seconds'</w:t>
+      </w:r>
+      <w:r>
+        <w:rPr>
+          <w:rStyle w:val="NormalTok"/>
+        </w:rPr>
+        <w:t xml:space="preserve"> )</w:t>
+      </w:r>
+      <w:r>
+        <w:rPr>
+          <w:rStyle w:val="OtherTok"/>
+        </w:rPr>
+        <w:t xml:space="preserve">;</w:t>
+      </w:r>
+      <w:r>
+        <w:br/>
+      </w:r>
+      <w:r>
+        <w:rPr>
+          <w:rStyle w:val="NormalTok"/>
+        </w:rPr>
+        <w:t xml:space="preserve">}</w:t>
+      </w:r>
+    </w:p>
+    <w:bookmarkEnd w:id="68"/>
+    <w:bookmarkStart w:id="69" w:name="new-relic"/>
+    <w:p>
+      <w:pPr>
+        <w:pStyle w:val="Heading3"/>
+      </w:pPr>
+      <w:r>
+        <w:t xml:space="preserve">New Relic</w:t>
+      </w:r>
+    </w:p>
+    <w:p>
+      <w:pPr>
+        <w:pStyle w:val="Compact"/>
+        <w:numPr>
+          <w:ilvl w:val="0"/>
+          <w:numId w:val="1048"/>
+        </w:numPr>
+      </w:pPr>
+      <w:r>
+        <w:t xml:space="preserve">[ ] Use APM traces to find slow transactions.</w:t>
+      </w:r>
+    </w:p>
+    <w:p>
+      <w:pPr>
+        <w:pStyle w:val="Compact"/>
+        <w:numPr>
+          <w:ilvl w:val="0"/>
+          <w:numId w:val="1048"/>
+        </w:numPr>
+      </w:pPr>
+      <w:r>
+        <w:t xml:space="preserve">[ ] Group by transaction type: page, admin, REST, AJAX, cron.</w:t>
+      </w:r>
+    </w:p>
+    <w:p>
+      <w:pPr>
+        <w:pStyle w:val="Compact"/>
+        <w:numPr>
+          <w:ilvl w:val="0"/>
+          <w:numId w:val="1048"/>
+        </w:numPr>
+      </w:pPr>
+      <w:r>
+        <w:t xml:space="preserve">[ ] Inspect database, external service, and PHP segment timing.</w:t>
+      </w:r>
+    </w:p>
+    <w:p>
+      <w:pPr>
+        <w:pStyle w:val="FirstParagraph"/>
+      </w:pPr>
+      <w:r>
+        <w:t xml:space="preserve">Example:</w:t>
+      </w:r>
+    </w:p>
+    <w:p>
+      <w:pPr>
+        <w:pStyle w:val="SourceCode"/>
+      </w:pPr>
+      <w:r>
+        <w:rPr>
+          <w:rStyle w:val="CommentTok"/>
+        </w:rPr>
+        <w:t xml:space="preserve">// Guard so the code is safe whether the New Relic PHP agent is loaded or not.</w:t>
+      </w:r>
+      <w:r>
+        <w:br/>
+      </w:r>
+      <w:r>
+        <w:rPr>
+          <w:rStyle w:val="ControlFlowTok"/>
+        </w:rPr>
+        <w:t xml:space="preserve">if</w:t>
+      </w:r>
+      <w:r>
+        <w:rPr>
+          <w:rStyle w:val="NormalTok"/>
+        </w:rPr>
+        <w:t xml:space="preserve"> ( </w:t>
+      </w:r>
+      <w:r>
+        <w:rPr>
+          <w:rStyle w:val="FunctionTok"/>
+        </w:rPr>
+        <w:t xml:space="preserve">extension_loaded</w:t>
+      </w:r>
+      <w:r>
+        <w:rPr>
+          <w:rStyle w:val="NormalTok"/>
+        </w:rPr>
+        <w:t xml:space="preserve">( </w:t>
+      </w:r>
+      <w:r>
+        <w:rPr>
+          <w:rStyle w:val="StringTok"/>
+        </w:rPr>
+        <w:t xml:space="preserve">'newrelic'</w:t>
+      </w:r>
+      <w:r>
+        <w:rPr>
+          <w:rStyle w:val="NormalTok"/>
+        </w:rPr>
+        <w:t xml:space="preserve"> ) </w:t>
+      </w:r>
+      <w:r>
+        <w:rPr>
+          <w:rStyle w:val="OperatorTok"/>
+        </w:rPr>
+        <w:t xml:space="preserve">&amp;&amp;</w:t>
+      </w:r>
+      <w:r>
+        <w:rPr>
+          <w:rStyle w:val="NormalTok"/>
+        </w:rPr>
+        <w:t xml:space="preserve"> </w:t>
+      </w:r>
+      <w:r>
+        <w:rPr>
+          <w:rStyle w:val="FunctionTok"/>
+        </w:rPr>
+        <w:t xml:space="preserve">function_exists</w:t>
+      </w:r>
+      <w:r>
+        <w:rPr>
+          <w:rStyle w:val="NormalTok"/>
+        </w:rPr>
+        <w:t xml:space="preserve">( </w:t>
+      </w:r>
+      <w:r>
+        <w:rPr>
+          <w:rStyle w:val="StringTok"/>
+        </w:rPr>
+        <w:t xml:space="preserve">'newrelic_name_transaction'</w:t>
+      </w:r>
+      <w:r>
+        <w:rPr>
+          <w:rStyle w:val="NormalTok"/>
+        </w:rPr>
+        <w:t xml:space="preserve"> ) ) {</w:t>
+      </w:r>
+      <w:r>
+        <w:br/>
+      </w:r>
+      <w:r>
+        <w:rPr>
+          <w:rStyle w:val="NormalTok"/>
+        </w:rPr>
+        <w:t xml:space="preserve">    </w:t>
+      </w:r>
+      <w:r>
+        <w:rPr>
+          <w:rStyle w:val="CommentTok"/>
+        </w:rPr>
+        <w:t xml:space="preserve">// Name the current transaction so it appears as a distinct entry</w:t>
+      </w:r>
+      <w:r>
+        <w:br/>
+      </w:r>
+      <w:r>
+        <w:rPr>
+          <w:rStyle w:val="NormalTok"/>
+        </w:rPr>
+        <w:t xml:space="preserve">    </w:t>
+      </w:r>
+      <w:r>
+        <w:rPr>
+          <w:rStyle w:val="CommentTok"/>
+        </w:rPr>
+        <w:t xml:space="preserve">// in the New Relic APM transaction list. Avoid per-user or per-URL names.</w:t>
+      </w:r>
+      <w:r>
+        <w:br/>
+      </w:r>
+      <w:r>
+        <w:rPr>
+          <w:rStyle w:val="NormalTok"/>
+        </w:rPr>
+        <w:t xml:space="preserve">    newrelic_name_transaction( </w:t>
+      </w:r>
+      <w:r>
+        <w:rPr>
+          <w:rStyle w:val="StringTok"/>
+        </w:rPr>
+        <w:t xml:space="preserve">'myplugin/expensive-path'</w:t>
+      </w:r>
+      <w:r>
+        <w:rPr>
+          <w:rStyle w:val="NormalTok"/>
+        </w:rPr>
+        <w:t xml:space="preserve"> )</w:t>
+      </w:r>
+      <w:r>
+        <w:rPr>
+          <w:rStyle w:val="OtherTok"/>
+        </w:rPr>
+        <w:t xml:space="preserve">;</w:t>
+      </w:r>
+      <w:r>
+        <w:br/>
+      </w:r>
+      <w:r>
+        <w:rPr>
+          <w:rStyle w:val="NormalTok"/>
+        </w:rPr>
+        <w:t xml:space="preserve">}</w:t>
+      </w:r>
+      <w:r>
+        <w:br/>
+      </w:r>
+      <w:r>
+        <w:br/>
+      </w:r>
+      <w:r>
+        <w:rPr>
+          <w:rStyle w:val="CommentTok"/>
+        </w:rPr>
+        <w:t xml:space="preserve">// Optional: add custom attributes for filtering and querying in NRQL.</w:t>
+      </w:r>
+      <w:r>
+        <w:br/>
+      </w:r>
+      <w:r>
+        <w:rPr>
+          <w:rStyle w:val="ControlFlowTok"/>
+        </w:rPr>
+        <w:t xml:space="preserve">if</w:t>
+      </w:r>
+      <w:r>
+        <w:rPr>
+          <w:rStyle w:val="NormalTok"/>
+        </w:rPr>
+        <w:t xml:space="preserve"> ( </w:t>
+      </w:r>
+      <w:r>
+        <w:rPr>
+          <w:rStyle w:val="FunctionTok"/>
+        </w:rPr>
+        <w:t xml:space="preserve">function_exists</w:t>
+      </w:r>
+      <w:r>
+        <w:rPr>
+          <w:rStyle w:val="NormalTok"/>
+        </w:rPr>
+        <w:t xml:space="preserve">( </w:t>
+      </w:r>
+      <w:r>
+        <w:rPr>
+          <w:rStyle w:val="StringTok"/>
+        </w:rPr>
+        <w:t xml:space="preserve">'newrelic_add_custom_parameter'</w:t>
+      </w:r>
+      <w:r>
+        <w:rPr>
+          <w:rStyle w:val="NormalTok"/>
+        </w:rPr>
+        <w:t xml:space="preserve"> ) ) {</w:t>
+      </w:r>
+      <w:r>
+        <w:br/>
+      </w:r>
+      <w:r>
+        <w:rPr>
+          <w:rStyle w:val="NormalTok"/>
+        </w:rPr>
+        <w:t xml:space="preserve">    newrelic_add_custom_parameter( </w:t>
+      </w:r>
+      <w:r>
+        <w:rPr>
+          <w:rStyle w:val="StringTok"/>
+        </w:rPr>
+        <w:t xml:space="preserve">'plugin_context'</w:t>
+      </w:r>
+      <w:r>
+        <w:rPr>
+          <w:rStyle w:val="OtherTok"/>
+        </w:rPr>
+        <w:t xml:space="preserve">,</w:t>
+      </w:r>
+      <w:r>
+        <w:rPr>
+          <w:rStyle w:val="NormalTok"/>
+        </w:rPr>
+        <w:t xml:space="preserve"> </w:t>
+      </w:r>
+      <w:r>
+        <w:rPr>
+          <w:rStyle w:val="StringTok"/>
+        </w:rPr>
+        <w:t xml:space="preserve">'myplugin_expensive_path'</w:t>
+      </w:r>
+      <w:r>
+        <w:rPr>
+          <w:rStyle w:val="NormalTok"/>
+        </w:rPr>
+        <w:t xml:space="preserve"> )</w:t>
+      </w:r>
+      <w:r>
+        <w:rPr>
+          <w:rStyle w:val="OtherTok"/>
+        </w:rPr>
+        <w:t xml:space="preserve">;</w:t>
+      </w:r>
+      <w:r>
+        <w:br/>
+      </w:r>
+      <w:r>
+        <w:rPr>
+          <w:rStyle w:val="NormalTok"/>
+        </w:rPr>
+        <w:t xml:space="preserve">}</w:t>
+      </w:r>
+    </w:p>
+    <w:p>
+      <w:pPr>
+        <w:pStyle w:val="FirstParagraph"/>
+      </w:pPr>
+      <w:r>
+        <w:t xml:space="preserve">Use</w:t>
+      </w:r>
+      <w:r>
+        <w:t xml:space="preserve"> </w:t>
+      </w:r>
+      <w:r>
+        <w:rPr>
+          <w:rStyle w:val="VerbatimChar"/>
+        </w:rPr>
+        <w:t xml:space="preserve">newrelic_name_transaction()</w:t>
+      </w:r>
+      <w:r>
+        <w:t xml:space="preserve"> </w:t>
+      </w:r>
+      <w:r>
+        <w:t xml:space="preserve">to give the current request a stable, low-cardinality name in APM. The New Relic transaction-start API takes a New Relic application name, not a transaction name, and is reserved for advanced transaction-lifecycle patterns such as queue workers manually ending one transaction and starting another.</w:t>
+      </w:r>
+    </w:p>
     <w:bookmarkEnd w:id="69"/>
-    <w:bookmarkStart w:id="73" w:name="measuring-time-spent"/>
-    <w:p>
-      <w:pPr>
-        <w:pStyle w:val="Heading2"/>
-      </w:pPr>
-      <w:r>
-        <w:t xml:space="preserve">20. Measuring time spent</w:t>
-      </w:r>
-    </w:p>
-    <w:p>
-      <w:pPr>
-        <w:pStyle w:val="FirstParagraph"/>
-      </w:pPr>
-      <w:r>
-        <w:t xml:space="preserve">Use multiple tools because each sees a different layer.</w:t>
-      </w:r>
-    </w:p>
-    <w:bookmarkStart w:id="70" w:name="php-logging"/>
-    <w:p>
-      <w:pPr>
-        <w:pStyle w:val="Heading3"/>
-      </w:pPr>
-      <w:r>
-        <w:t xml:space="preserve">PHP logging</w:t>
-      </w:r>
-    </w:p>
-    <w:p>
-      <w:pPr>
-        <w:pStyle w:val="Compact"/>
-        <w:numPr>
-          <w:ilvl w:val="0"/>
-          <w:numId w:val="1047"/>
-        </w:numPr>
-      </w:pPr>
-      <w:r>
-        <w:t xml:space="preserve">[ ] Use targeted timing around suspected code paths.</w:t>
-      </w:r>
-    </w:p>
-    <w:p>
-      <w:pPr>
-        <w:pStyle w:val="Compact"/>
-        <w:numPr>
-          <w:ilvl w:val="0"/>
-          <w:numId w:val="1047"/>
-        </w:numPr>
-      </w:pPr>
-      <w:r>
-        <w:t xml:space="preserve">[ ] Remove noisy debug logging after investigation.</w:t>
-      </w:r>
-    </w:p>
-    <w:p>
-      <w:pPr>
-        <w:pStyle w:val="Compact"/>
-        <w:numPr>
-          <w:ilvl w:val="0"/>
-          <w:numId w:val="1047"/>
-        </w:numPr>
-      </w:pPr>
-      <w:r>
-        <w:t xml:space="preserve">[ ] Do not expose timing details publicly.</w:t>
-      </w:r>
-    </w:p>
-    <w:p>
-      <w:pPr>
-        <w:pStyle w:val="FirstParagraph"/>
-      </w:pPr>
-      <w:r>
-        <w:t xml:space="preserve">Example:</w:t>
-      </w:r>
-    </w:p>
-    <w:p>
-      <w:pPr>
-        <w:pStyle w:val="SourceCode"/>
-      </w:pPr>
-      <w:r>
-        <w:rPr>
-          <w:rStyle w:val="KeywordTok"/>
-        </w:rPr>
-        <w:t xml:space="preserve">function</w:t>
-      </w:r>
-      <w:r>
-        <w:rPr>
-          <w:rStyle w:val="NormalTok"/>
-        </w:rPr>
-        <w:t xml:space="preserve"> my_custom_function() {</w:t>
-      </w:r>
-      <w:r>
-        <w:br/>
-      </w:r>
-      <w:r>
-        <w:rPr>
-          <w:rStyle w:val="NormalTok"/>
-        </w:rPr>
-        <w:t xml:space="preserve">    </w:t>
-      </w:r>
-      <w:r>
-        <w:rPr>
-          <w:rStyle w:val="VariableTok"/>
-        </w:rPr>
-        <w:t xml:space="preserve">$start_time</w:t>
-      </w:r>
-      <w:r>
-        <w:rPr>
-          <w:rStyle w:val="NormalTok"/>
-        </w:rPr>
-        <w:t xml:space="preserve"> </w:t>
-      </w:r>
-      <w:r>
-        <w:rPr>
-          <w:rStyle w:val="OperatorTok"/>
-        </w:rPr>
-        <w:t xml:space="preserve">=</w:t>
-      </w:r>
-      <w:r>
-        <w:rPr>
-          <w:rStyle w:val="NormalTok"/>
-        </w:rPr>
-        <w:t xml:space="preserve"> </w:t>
-      </w:r>
-      <w:r>
-        <w:rPr>
-          <w:rStyle w:val="FunctionTok"/>
-        </w:rPr>
-        <w:t xml:space="preserve">microtime</w:t>
-      </w:r>
-      <w:r>
-        <w:rPr>
-          <w:rStyle w:val="NormalTok"/>
-        </w:rPr>
-        <w:t xml:space="preserve">( </w:t>
-      </w:r>
-      <w:r>
-        <w:rPr>
-          <w:rStyle w:val="KeywordTok"/>
-        </w:rPr>
-        <w:t xml:space="preserve">true</w:t>
-      </w:r>
-      <w:r>
-        <w:rPr>
-          <w:rStyle w:val="NormalTok"/>
-        </w:rPr>
-        <w:t xml:space="preserve"> )</w:t>
-      </w:r>
-      <w:r>
-        <w:rPr>
-          <w:rStyle w:val="OtherTok"/>
-        </w:rPr>
-        <w:t xml:space="preserve">;</w:t>
-      </w:r>
-      <w:r>
-        <w:br/>
-      </w:r>
-      <w:r>
-        <w:br/>
-      </w:r>
-      <w:r>
-        <w:rPr>
-          <w:rStyle w:val="NormalTok"/>
-        </w:rPr>
-        <w:t xml:space="preserve">    </w:t>
-      </w:r>
-      <w:r>
-        <w:rPr>
-          <w:rStyle w:val="CommentTok"/>
-        </w:rPr>
-        <w:t xml:space="preserve">// Code to be measured here.</w:t>
-      </w:r>
-      <w:r>
-        <w:br/>
-      </w:r>
-      <w:r>
-        <w:br/>
-      </w:r>
-      <w:r>
-        <w:rPr>
-          <w:rStyle w:val="NormalTok"/>
-        </w:rPr>
-        <w:t xml:space="preserve">    </w:t>
-      </w:r>
-      <w:r>
-        <w:rPr>
-          <w:rStyle w:val="VariableTok"/>
-        </w:rPr>
-        <w:t xml:space="preserve">$end_time</w:t>
-      </w:r>
-      <w:r>
-        <w:rPr>
-          <w:rStyle w:val="NormalTok"/>
-        </w:rPr>
-        <w:t xml:space="preserve"> </w:t>
-      </w:r>
-      <w:r>
-        <w:rPr>
-          <w:rStyle w:val="OperatorTok"/>
-        </w:rPr>
-        <w:t xml:space="preserve">=</w:t>
-      </w:r>
-      <w:r>
-        <w:rPr>
-          <w:rStyle w:val="NormalTok"/>
-        </w:rPr>
-        <w:t xml:space="preserve"> </w:t>
-      </w:r>
-      <w:r>
-        <w:rPr>
-          <w:rStyle w:val="FunctionTok"/>
-        </w:rPr>
-        <w:t xml:space="preserve">microtime</w:t>
-      </w:r>
-      <w:r>
-        <w:rPr>
-          <w:rStyle w:val="NormalTok"/>
-        </w:rPr>
-        <w:t xml:space="preserve">( </w:t>
-      </w:r>
-      <w:r>
-        <w:rPr>
-          <w:rStyle w:val="KeywordTok"/>
-        </w:rPr>
-        <w:t xml:space="preserve">true</w:t>
-      </w:r>
-      <w:r>
-        <w:rPr>
-          <w:rStyle w:val="NormalTok"/>
-        </w:rPr>
-        <w:t xml:space="preserve"> )</w:t>
-      </w:r>
-      <w:r>
-        <w:rPr>
-          <w:rStyle w:val="OtherTok"/>
-        </w:rPr>
-        <w:t xml:space="preserve">;</w:t>
-      </w:r>
-      <w:r>
-        <w:br/>
-      </w:r>
-      <w:r>
-        <w:rPr>
-          <w:rStyle w:val="NormalTok"/>
-        </w:rPr>
-        <w:t xml:space="preserve">    </w:t>
-      </w:r>
-      <w:r>
-        <w:rPr>
-          <w:rStyle w:val="VariableTok"/>
-        </w:rPr>
-        <w:t xml:space="preserve">$execution_time</w:t>
-      </w:r>
-      <w:r>
-        <w:rPr>
-          <w:rStyle w:val="NormalTok"/>
-        </w:rPr>
-        <w:t xml:space="preserve"> </w:t>
-      </w:r>
-      <w:r>
-        <w:rPr>
-          <w:rStyle w:val="OperatorTok"/>
-        </w:rPr>
-        <w:t xml:space="preserve">=</w:t>
-      </w:r>
-      <w:r>
-        <w:rPr>
-          <w:rStyle w:val="NormalTok"/>
-        </w:rPr>
-        <w:t xml:space="preserve"> </w:t>
-      </w:r>
-      <w:r>
-        <w:rPr>
-          <w:rStyle w:val="VariableTok"/>
-        </w:rPr>
-        <w:t xml:space="preserve">$end_time</w:t>
-      </w:r>
-      <w:r>
-        <w:rPr>
-          <w:rStyle w:val="NormalTok"/>
-        </w:rPr>
-        <w:t xml:space="preserve"> </w:t>
-      </w:r>
-      <w:r>
-        <w:rPr>
-          <w:rStyle w:val="OperatorTok"/>
-        </w:rPr>
-        <w:t xml:space="preserve">-</w:t>
-      </w:r>
-      <w:r>
-        <w:rPr>
-          <w:rStyle w:val="NormalTok"/>
-        </w:rPr>
-        <w:t xml:space="preserve"> </w:t>
-      </w:r>
-      <w:r>
-        <w:rPr>
-          <w:rStyle w:val="VariableTok"/>
-        </w:rPr>
-        <w:t xml:space="preserve">$start_time</w:t>
-      </w:r>
-      <w:r>
-        <w:rPr>
-          <w:rStyle w:val="OtherTok"/>
-        </w:rPr>
-        <w:t xml:space="preserve">;</w:t>
-      </w:r>
-      <w:r>
-        <w:br/>
-      </w:r>
-      <w:r>
-        <w:br/>
-      </w:r>
-      <w:r>
-        <w:rPr>
-          <w:rStyle w:val="NormalTok"/>
-        </w:rPr>
-        <w:t xml:space="preserve">    </w:t>
-      </w:r>
-      <w:r>
-        <w:rPr>
-          <w:rStyle w:val="FunctionTok"/>
-        </w:rPr>
-        <w:t xml:space="preserve">error_log</w:t>
-      </w:r>
-      <w:r>
-        <w:rPr>
-          <w:rStyle w:val="NormalTok"/>
-        </w:rPr>
-        <w:t xml:space="preserve">( </w:t>
-      </w:r>
-      <w:r>
-        <w:rPr>
-          <w:rStyle w:val="StringTok"/>
-        </w:rPr>
-        <w:t xml:space="preserve">'my_custom_function took '</w:t>
-      </w:r>
-      <w:r>
-        <w:rPr>
-          <w:rStyle w:val="NormalTok"/>
-        </w:rPr>
-        <w:t xml:space="preserve"> </w:t>
-      </w:r>
-      <w:r>
-        <w:rPr>
-          <w:rStyle w:val="OperatorTok"/>
-        </w:rPr>
-        <w:t xml:space="preserve">.</w:t>
-      </w:r>
-      <w:r>
-        <w:rPr>
-          <w:rStyle w:val="NormalTok"/>
-        </w:rPr>
-        <w:t xml:space="preserve"> </w:t>
-      </w:r>
-      <w:r>
-        <w:rPr>
-          <w:rStyle w:val="VariableTok"/>
-        </w:rPr>
-        <w:t xml:space="preserve">$execution_time</w:t>
-      </w:r>
-      <w:r>
-        <w:rPr>
-          <w:rStyle w:val="NormalTok"/>
-        </w:rPr>
-        <w:t xml:space="preserve"> </w:t>
-      </w:r>
-      <w:r>
-        <w:rPr>
-          <w:rStyle w:val="OperatorTok"/>
-        </w:rPr>
-        <w:t xml:space="preserve">.</w:t>
-      </w:r>
-      <w:r>
-        <w:rPr>
-          <w:rStyle w:val="NormalTok"/>
-        </w:rPr>
-        <w:t xml:space="preserve"> </w:t>
-      </w:r>
-      <w:r>
-        <w:rPr>
-          <w:rStyle w:val="StringTok"/>
-        </w:rPr>
-        <w:t xml:space="preserve">' seconds'</w:t>
-      </w:r>
-      <w:r>
-        <w:rPr>
-          <w:rStyle w:val="NormalTok"/>
-        </w:rPr>
-        <w:t xml:space="preserve"> )</w:t>
-      </w:r>
-      <w:r>
-        <w:rPr>
-          <w:rStyle w:val="OtherTok"/>
-        </w:rPr>
-        <w:t xml:space="preserve">;</w:t>
-      </w:r>
-      <w:r>
-        <w:br/>
-      </w:r>
-      <w:r>
-        <w:rPr>
-          <w:rStyle w:val="NormalTok"/>
-        </w:rPr>
-        <w:t xml:space="preserve">}</w:t>
-      </w:r>
-    </w:p>
-    <w:bookmarkEnd w:id="70"/>
-    <w:bookmarkStart w:id="71" w:name="new-relic"/>
-    <w:p>
-      <w:pPr>
-        <w:pStyle w:val="Heading3"/>
-      </w:pPr>
-      <w:r>
-        <w:t xml:space="preserve">New Relic</w:t>
-      </w:r>
-    </w:p>
-    <w:p>
-      <w:pPr>
-        <w:pStyle w:val="Compact"/>
-        <w:numPr>
-          <w:ilvl w:val="0"/>
-          <w:numId w:val="1048"/>
-        </w:numPr>
-      </w:pPr>
-      <w:r>
-        <w:t xml:space="preserve">[ ] Use APM traces to find slow transactions.</w:t>
-      </w:r>
-    </w:p>
-    <w:p>
-      <w:pPr>
-        <w:pStyle w:val="Compact"/>
-        <w:numPr>
-          <w:ilvl w:val="0"/>
-          <w:numId w:val="1048"/>
-        </w:numPr>
-      </w:pPr>
-      <w:r>
-        <w:t xml:space="preserve">[ ] Group by transaction type: page, admin, REST, AJAX, cron.</w:t>
-      </w:r>
-    </w:p>
-    <w:p>
-      <w:pPr>
-        <w:pStyle w:val="Compact"/>
-        <w:numPr>
-          <w:ilvl w:val="0"/>
-          <w:numId w:val="1048"/>
-        </w:numPr>
-      </w:pPr>
-      <w:r>
-        <w:t xml:space="preserve">[ ] Inspect database, external service, and PHP segment timing.</w:t>
-      </w:r>
-    </w:p>
-    <w:p>
-      <w:pPr>
-        <w:pStyle w:val="FirstParagraph"/>
-      </w:pPr>
-      <w:r>
-        <w:t xml:space="preserve">Example:</w:t>
-      </w:r>
-    </w:p>
-    <w:p>
-      <w:pPr>
-        <w:pStyle w:val="SourceCode"/>
-      </w:pPr>
-      <w:r>
-        <w:rPr>
-          <w:rStyle w:val="CommentTok"/>
-        </w:rPr>
-        <w:t xml:space="preserve">// Guard so the code is safe whether the New Relic PHP agent is loaded or not.</w:t>
-      </w:r>
-      <w:r>
-        <w:br/>
-      </w:r>
-      <w:r>
-        <w:rPr>
-          <w:rStyle w:val="ControlFlowTok"/>
-        </w:rPr>
-        <w:t xml:space="preserve">if</w:t>
-      </w:r>
-      <w:r>
-        <w:rPr>
-          <w:rStyle w:val="NormalTok"/>
-        </w:rPr>
-        <w:t xml:space="preserve"> ( </w:t>
-      </w:r>
-      <w:r>
-        <w:rPr>
-          <w:rStyle w:val="FunctionTok"/>
-        </w:rPr>
-        <w:t xml:space="preserve">extension_loaded</w:t>
-      </w:r>
-      <w:r>
-        <w:rPr>
-          <w:rStyle w:val="NormalTok"/>
-        </w:rPr>
-        <w:t xml:space="preserve">( </w:t>
-      </w:r>
-      <w:r>
-        <w:rPr>
-          <w:rStyle w:val="StringTok"/>
-        </w:rPr>
-        <w:t xml:space="preserve">'newrelic'</w:t>
-      </w:r>
-      <w:r>
-        <w:rPr>
-          <w:rStyle w:val="NormalTok"/>
-        </w:rPr>
-        <w:t xml:space="preserve"> ) </w:t>
-      </w:r>
-      <w:r>
-        <w:rPr>
-          <w:rStyle w:val="OperatorTok"/>
-        </w:rPr>
-        <w:t xml:space="preserve">&amp;&amp;</w:t>
-      </w:r>
-      <w:r>
-        <w:rPr>
-          <w:rStyle w:val="NormalTok"/>
-        </w:rPr>
-        <w:t xml:space="preserve"> </w:t>
-      </w:r>
-      <w:r>
-        <w:rPr>
-          <w:rStyle w:val="FunctionTok"/>
-        </w:rPr>
-        <w:t xml:space="preserve">function_exists</w:t>
-      </w:r>
-      <w:r>
-        <w:rPr>
-          <w:rStyle w:val="NormalTok"/>
-        </w:rPr>
-        <w:t xml:space="preserve">( </w:t>
-      </w:r>
-      <w:r>
-        <w:rPr>
-          <w:rStyle w:val="StringTok"/>
-        </w:rPr>
-        <w:t xml:space="preserve">'newrelic_name_transaction'</w:t>
-      </w:r>
-      <w:r>
-        <w:rPr>
-          <w:rStyle w:val="NormalTok"/>
-        </w:rPr>
-        <w:t xml:space="preserve"> ) ) {</w:t>
-      </w:r>
-      <w:r>
-        <w:br/>
-      </w:r>
-      <w:r>
-        <w:rPr>
-          <w:rStyle w:val="NormalTok"/>
-        </w:rPr>
-        <w:t xml:space="preserve">    </w:t>
-      </w:r>
-      <w:r>
-        <w:rPr>
-          <w:rStyle w:val="CommentTok"/>
-        </w:rPr>
-        <w:t xml:space="preserve">// Name the current transaction so it appears as a distinct entry</w:t>
-      </w:r>
-      <w:r>
-        <w:br/>
-      </w:r>
-      <w:r>
-        <w:rPr>
-          <w:rStyle w:val="NormalTok"/>
-        </w:rPr>
-        <w:t xml:space="preserve">    </w:t>
-      </w:r>
-      <w:r>
-        <w:rPr>
-          <w:rStyle w:val="CommentTok"/>
-        </w:rPr>
-        <w:t xml:space="preserve">// in the New Relic APM transaction list. Avoid per-user or per-URL names.</w:t>
-      </w:r>
-      <w:r>
-        <w:br/>
-      </w:r>
-      <w:r>
-        <w:rPr>
-          <w:rStyle w:val="NormalTok"/>
-        </w:rPr>
-        <w:t xml:space="preserve">    newrelic_name_transaction( </w:t>
-      </w:r>
-      <w:r>
-        <w:rPr>
-          <w:rStyle w:val="StringTok"/>
-        </w:rPr>
-        <w:t xml:space="preserve">'myplugin/expensive-path'</w:t>
-      </w:r>
-      <w:r>
-        <w:rPr>
-          <w:rStyle w:val="NormalTok"/>
-        </w:rPr>
-        <w:t xml:space="preserve"> )</w:t>
-      </w:r>
-      <w:r>
-        <w:rPr>
-          <w:rStyle w:val="OtherTok"/>
-        </w:rPr>
-        <w:t xml:space="preserve">;</w:t>
-      </w:r>
-      <w:r>
-        <w:br/>
-      </w:r>
-      <w:r>
-        <w:rPr>
-          <w:rStyle w:val="NormalTok"/>
-        </w:rPr>
-        <w:t xml:space="preserve">}</w:t>
-      </w:r>
-      <w:r>
-        <w:br/>
-      </w:r>
-      <w:r>
-        <w:br/>
-      </w:r>
-      <w:r>
-        <w:rPr>
-          <w:rStyle w:val="CommentTok"/>
-        </w:rPr>
-        <w:t xml:space="preserve">// Optional: add custom attributes for filtering and querying in NRQL.</w:t>
-      </w:r>
-      <w:r>
-        <w:br/>
-      </w:r>
-      <w:r>
-        <w:rPr>
-          <w:rStyle w:val="ControlFlowTok"/>
-        </w:rPr>
-        <w:t xml:space="preserve">if</w:t>
-      </w:r>
-      <w:r>
-        <w:rPr>
-          <w:rStyle w:val="NormalTok"/>
-        </w:rPr>
-        <w:t xml:space="preserve"> ( </w:t>
-      </w:r>
-      <w:r>
-        <w:rPr>
-          <w:rStyle w:val="FunctionTok"/>
-        </w:rPr>
-        <w:t xml:space="preserve">function_exists</w:t>
-      </w:r>
-      <w:r>
-        <w:rPr>
-          <w:rStyle w:val="NormalTok"/>
-        </w:rPr>
-        <w:t xml:space="preserve">( </w:t>
-      </w:r>
-      <w:r>
-        <w:rPr>
-          <w:rStyle w:val="StringTok"/>
-        </w:rPr>
-        <w:t xml:space="preserve">'newrelic_add_custom_parameter'</w:t>
-      </w:r>
-      <w:r>
-        <w:rPr>
-          <w:rStyle w:val="NormalTok"/>
-        </w:rPr>
-        <w:t xml:space="preserve"> ) ) {</w:t>
-      </w:r>
-      <w:r>
-        <w:br/>
-      </w:r>
-      <w:r>
-        <w:rPr>
-          <w:rStyle w:val="NormalTok"/>
-        </w:rPr>
-        <w:t xml:space="preserve">    newrelic_add_custom_parameter( </w:t>
-      </w:r>
-      <w:r>
-        <w:rPr>
-          <w:rStyle w:val="StringTok"/>
-        </w:rPr>
-        <w:t xml:space="preserve">'plugin_context'</w:t>
-      </w:r>
-      <w:r>
-        <w:rPr>
-          <w:rStyle w:val="OtherTok"/>
-        </w:rPr>
-        <w:t xml:space="preserve">,</w:t>
-      </w:r>
-      <w:r>
-        <w:rPr>
-          <w:rStyle w:val="NormalTok"/>
-        </w:rPr>
-        <w:t xml:space="preserve"> </w:t>
-      </w:r>
-      <w:r>
-        <w:rPr>
-          <w:rStyle w:val="StringTok"/>
-        </w:rPr>
-        <w:t xml:space="preserve">'myplugin_expensive_path'</w:t>
-      </w:r>
-      <w:r>
-        <w:rPr>
-          <w:rStyle w:val="NormalTok"/>
-        </w:rPr>
-        <w:t xml:space="preserve"> )</w:t>
-      </w:r>
-      <w:r>
-        <w:rPr>
-          <w:rStyle w:val="OtherTok"/>
-        </w:rPr>
-        <w:t xml:space="preserve">;</w:t>
-      </w:r>
-      <w:r>
-        <w:br/>
-      </w:r>
-      <w:r>
-        <w:rPr>
-          <w:rStyle w:val="NormalTok"/>
-        </w:rPr>
-        <w:t xml:space="preserve">}</w:t>
-      </w:r>
-    </w:p>
-    <w:p>
-      <w:pPr>
-        <w:pStyle w:val="FirstParagraph"/>
-      </w:pPr>
-      <w:r>
-        <w:t xml:space="preserve">Use</w:t>
-      </w:r>
-      <w:r>
-        <w:t xml:space="preserve"> </w:t>
-      </w:r>
-      <w:r>
-        <w:rPr>
-          <w:rStyle w:val="VerbatimChar"/>
-        </w:rPr>
-        <w:t xml:space="preserve">newrelic_name_transaction()</w:t>
-      </w:r>
-      <w:r>
-        <w:t xml:space="preserve"> </w:t>
-      </w:r>
-      <w:r>
-        <w:t xml:space="preserve">to give the current request a stable, low-cardinality name in APM. The New Relic transaction-start API takes a New Relic application name, not a transaction name, and is reserved for advanced transaction-lifecycle patterns such as queue workers manually ending one transaction and starting another.</w:t>
-      </w:r>
-    </w:p>
-    <w:bookmarkEnd w:id="71"/>
-    <w:bookmarkStart w:id="72" w:name="query-monitor"/>
+    <w:bookmarkStart w:id="70" w:name="query-monitor"/>
     <w:p>
       <w:pPr>
         <w:pStyle w:val="Heading3"/>
@@ -11117,9 +11050,9 @@
         </w:pict>
       </w:r>
     </w:p>
-    <w:bookmarkEnd w:id="72"/>
-    <w:bookmarkEnd w:id="73"/>
-    <w:bookmarkStart w:id="74" w:name="performance-alerting"/>
+    <w:bookmarkEnd w:id="70"/>
+    <w:bookmarkEnd w:id="71"/>
+    <w:bookmarkStart w:id="72" w:name="performance-alerting"/>
     <w:p>
       <w:pPr>
         <w:pStyle w:val="Heading2"/>
@@ -11323,8 +11256,8 @@
         </w:pict>
       </w:r>
     </w:p>
-    <w:bookmarkEnd w:id="74"/>
-    <w:bookmarkStart w:id="75" w:name="verification-and-definition-of-done"/>
+    <w:bookmarkEnd w:id="72"/>
+    <w:bookmarkStart w:id="73" w:name="verification-and-definition-of-done"/>
     <w:p>
       <w:pPr>
         <w:pStyle w:val="Heading2"/>
@@ -11536,8 +11469,8 @@
         </w:pict>
       </w:r>
     </w:p>
-    <w:bookmarkEnd w:id="75"/>
-    <w:bookmarkStart w:id="97" w:name="X500be7278c824286df7b36766ef783ff99a1679"/>
+    <w:bookmarkEnd w:id="73"/>
+    <w:bookmarkStart w:id="95" w:name="X500be7278c824286df7b36766ef783ff99a1679"/>
     <w:p>
       <w:pPr>
         <w:pStyle w:val="Heading2"/>
@@ -11556,7 +11489,7 @@
       <w:r>
         <w:t xml:space="preserve"> </w:t>
       </w:r>
-      <w:hyperlink r:id="rId76">
+      <w:hyperlink r:id="rId74">
         <w:r>
           <w:rPr>
             <w:rStyle w:val="VerbatimChar"/>
@@ -11571,7 +11504,7 @@
         <w:t xml:space="preserve">has fuller treatment.</w:t>
       </w:r>
     </w:p>
-    <w:bookmarkStart w:id="77" w:name="X84d7775bb3119c347a3b1ab665b19a32c85e188"/>
+    <w:bookmarkStart w:id="75" w:name="X84d7775bb3119c347a3b1ab665b19a32c85e188"/>
     <w:p>
       <w:pPr>
         <w:pStyle w:val="Heading3"/>
@@ -12006,8 +11939,8 @@
         <w:t xml:space="preserve">;</w:t>
       </w:r>
     </w:p>
-    <w:bookmarkEnd w:id="77"/>
-    <w:bookmarkStart w:id="80" w:name="X0916ed51d9250e775030e1b001c35a5a994eda1"/>
+    <w:bookmarkEnd w:id="75"/>
+    <w:bookmarkStart w:id="78" w:name="X0916ed51d9250e775030e1b001c35a5a994eda1"/>
     <w:p>
       <w:pPr>
         <w:pStyle w:val="Heading3"/>
@@ -12026,7 +11959,7 @@
       <w:r>
         <w:t xml:space="preserve"> </w:t>
       </w:r>
-      <w:hyperlink r:id="rId78">
+      <w:hyperlink r:id="rId76">
         <w:r>
           <w:rPr>
             <w:rStyle w:val="Hyperlink"/>
@@ -12136,7 +12069,7 @@
       <w:r>
         <w:t xml:space="preserve"> </w:t>
       </w:r>
-      <w:hyperlink r:id="rId79">
+      <w:hyperlink r:id="rId77">
         <w:r>
           <w:rPr>
             <w:rStyle w:val="Hyperlink"/>
@@ -12216,8 +12149,8 @@
         <w:t xml:space="preserve">wording as the recommended Core opt-out mechanism.</w:t>
       </w:r>
     </w:p>
-    <w:bookmarkEnd w:id="80"/>
-    <w:bookmarkStart w:id="83" w:name="wordpress-6.9-performance-deltas"/>
+    <w:bookmarkEnd w:id="78"/>
+    <w:bookmarkStart w:id="81" w:name="wordpress-6.9-performance-deltas"/>
     <w:p>
       <w:pPr>
         <w:pStyle w:val="Heading3"/>
@@ -12258,7 +12191,7 @@
       <w:r>
         <w:t xml:space="preserve"> </w:t>
       </w:r>
-      <w:hyperlink r:id="rId81">
+      <w:hyperlink r:id="rId79">
         <w:r>
           <w:rPr>
             <w:rStyle w:val="Hyperlink"/>
@@ -12331,7 +12264,7 @@
       <w:r>
         <w:t xml:space="preserve"> </w:t>
       </w:r>
-      <w:hyperlink r:id="rId82">
+      <w:hyperlink r:id="rId80">
         <w:r>
           <w:rPr>
             <w:rStyle w:val="Hyperlink"/>
@@ -12354,8 +12287,8 @@
         <w:t xml:space="preserve">Treat this as a delta inventory, not a substitute for measurement: verify impact on the specific site with the same baseline and rollback discipline used elsewhere in this guide.</w:t>
       </w:r>
     </w:p>
-    <w:bookmarkEnd w:id="83"/>
-    <w:bookmarkStart w:id="84" w:name="fetchpriority-on-lcp-image-wordpress-6.3"/>
+    <w:bookmarkEnd w:id="81"/>
+    <w:bookmarkStart w:id="82" w:name="fetchpriority-on-lcp-image-wordpress-6.3"/>
     <w:p>
       <w:pPr>
         <w:pStyle w:val="Heading3"/>
@@ -12450,8 +12383,8 @@
         <w:t xml:space="preserve">[ ] Confirm AMP / Block Theme combinations correctly identify the LCP candidate after 6.3.</w:t>
       </w:r>
     </w:p>
-    <w:bookmarkEnd w:id="84"/>
-    <w:bookmarkStart w:id="86" w:name="performance-lab-plugin"/>
+    <w:bookmarkEnd w:id="82"/>
+    <w:bookmarkStart w:id="84" w:name="performance-lab-plugin"/>
     <w:p>
       <w:pPr>
         <w:pStyle w:val="Heading3"/>
@@ -12464,7 +12397,7 @@
       <w:pPr>
         <w:pStyle w:val="FirstParagraph"/>
       </w:pPr>
-      <w:hyperlink r:id="rId85">
+      <w:hyperlink r:id="rId83">
         <w:r>
           <w:rPr>
             <w:rStyle w:val="Hyperlink"/>
@@ -12712,8 +12645,8 @@
         <w:t xml:space="preserve">Recommendation: evaluate Performance Lab on staging, look at the current Featured Plugins list at the verification time, and adopt specific plugins by name only when they match the site’s documented performance need.</w:t>
       </w:r>
     </w:p>
-    <w:bookmarkEnd w:id="86"/>
-    <w:bookmarkStart w:id="87" w:name="X272861d0d2d8708b0ae9043c57ce40fee4abb08"/>
+    <w:bookmarkEnd w:id="84"/>
+    <w:bookmarkStart w:id="85" w:name="X272861d0d2d8708b0ae9043c57ce40fee4abb08"/>
     <w:p>
       <w:pPr>
         <w:pStyle w:val="Heading3"/>
@@ -12950,8 +12883,8 @@
         <w:t xml:space="preserve">Enterprise platform reporting should retire FID dashboards and ensure RUM SDKs report INP. INP is more sensitive to JavaScript main-thread work than FID was, so customer-success conversations about “suddenly worse mobile” often trace to long-running scripts that FID would not have penalized.</w:t>
       </w:r>
     </w:p>
-    <w:bookmarkEnd w:id="87"/>
-    <w:bookmarkStart w:id="88" w:name="editorial-correction-to-source-lesson"/>
+    <w:bookmarkEnd w:id="85"/>
+    <w:bookmarkStart w:id="86" w:name="editorial-correction-to-source-lesson"/>
     <w:p>
       <w:pPr>
         <w:pStyle w:val="Heading3"/>
@@ -12995,8 +12928,8 @@
         <w:t xml:space="preserve">matching the site’s canonical scheme. (This operational checklist at §15 already uses HTTPS.)</w:t>
       </w:r>
     </w:p>
-    <w:bookmarkEnd w:id="88"/>
-    <w:bookmarkStart w:id="96" w:name="references"/>
+    <w:bookmarkEnd w:id="86"/>
+    <w:bookmarkStart w:id="94" w:name="references"/>
     <w:p>
       <w:pPr>
         <w:pStyle w:val="Heading3"/>
@@ -13013,7 +12946,7 @@
           <w:numId w:val="1058"/>
         </w:numPr>
       </w:pPr>
-      <w:hyperlink r:id="rId89">
+      <w:hyperlink r:id="rId87">
         <w:r>
           <w:rPr>
             <w:rStyle w:val="Hyperlink"/>
@@ -13030,7 +12963,7 @@
           <w:numId w:val="1058"/>
         </w:numPr>
       </w:pPr>
-      <w:hyperlink r:id="rId90">
+      <w:hyperlink r:id="rId88">
         <w:r>
           <w:rPr>
             <w:rStyle w:val="Hyperlink"/>
@@ -13047,7 +12980,7 @@
           <w:numId w:val="1058"/>
         </w:numPr>
       </w:pPr>
-      <w:hyperlink r:id="rId91">
+      <w:hyperlink r:id="rId89">
         <w:r>
           <w:rPr>
             <w:rStyle w:val="Hyperlink"/>
@@ -13064,7 +12997,7 @@
           <w:numId w:val="1058"/>
         </w:numPr>
       </w:pPr>
-      <w:hyperlink r:id="rId78">
+      <w:hyperlink r:id="rId76">
         <w:r>
           <w:rPr>
             <w:rStyle w:val="Hyperlink"/>
@@ -13081,7 +13014,7 @@
           <w:numId w:val="1058"/>
         </w:numPr>
       </w:pPr>
-      <w:hyperlink r:id="rId92">
+      <w:hyperlink r:id="rId90">
         <w:r>
           <w:rPr>
             <w:rStyle w:val="Hyperlink"/>
@@ -13098,7 +13031,7 @@
           <w:numId w:val="1058"/>
         </w:numPr>
       </w:pPr>
-      <w:hyperlink r:id="rId93">
+      <w:hyperlink r:id="rId91">
         <w:r>
           <w:rPr>
             <w:rStyle w:val="VerbatimChar"/>
@@ -13115,7 +13048,7 @@
           <w:numId w:val="1058"/>
         </w:numPr>
       </w:pPr>
-      <w:hyperlink r:id="rId85">
+      <w:hyperlink r:id="rId83">
         <w:r>
           <w:rPr>
             <w:rStyle w:val="Hyperlink"/>
@@ -13132,7 +13065,7 @@
           <w:numId w:val="1058"/>
         </w:numPr>
       </w:pPr>
-      <w:hyperlink r:id="rId94">
+      <w:hyperlink r:id="rId92">
         <w:r>
           <w:rPr>
             <w:rStyle w:val="Hyperlink"/>
@@ -13149,7 +13082,7 @@
           <w:numId w:val="1058"/>
         </w:numPr>
       </w:pPr>
-      <w:hyperlink r:id="rId95">
+      <w:hyperlink r:id="rId93">
         <w:r>
           <w:rPr>
             <w:rStyle w:val="Hyperlink"/>
@@ -13158,9 +13091,9 @@
         </w:r>
       </w:hyperlink>
     </w:p>
+    <w:bookmarkEnd w:id="94"/>
+    <w:bookmarkEnd w:id="95"/>
     <w:bookmarkEnd w:id="96"/>
-    <w:bookmarkEnd w:id="97"/>
-    <w:bookmarkEnd w:id="98"/>
     <w:sectPr>
       <w:footerReference r:id="rId31" w:type="default"/>
       <w:footnotePr>

</xml_diff>

<commit_message>
docs: regenerate performance publication artifacts
</commit_message>
<xml_diff>
--- a/Enterprise-WordPress-Performance-Operational-Checklist.docx
+++ b/Enterprise-WordPress-Performance-Operational-Checklist.docx
@@ -15,7 +15,7 @@
         <w:pStyle w:val="Subtitle"/>
       </w:pPr>
       <w:r>
-        <w:t xml:space="preserve">Version 1.0 — DRAFT</w:t>
+        <w:t xml:space="preserve">Version 1.1 — DRAFT</w:t>
       </w:r>
     </w:p>
     <w:p>
@@ -26,7 +26,7 @@
         <w:t xml:space="preserve">Dan Knauss, General Editor</w:t>
       </w:r>
     </w:p>
-    <w:bookmarkStart w:id="40" w:name="X0ee7156a14d8698c74ff527f137db695911a062"/>
+    <w:bookmarkStart w:id="41" w:name="X0ee7156a14d8698c74ff527f137db695911a062"/>
     <w:p>
       <w:pPr>
         <w:pStyle w:val="Heading1"/>
@@ -53,7 +53,7 @@
         <w:t xml:space="preserve">DRAFT</w:t>
       </w:r>
       <w:r>
-        <w:br/>
+        <w:t xml:space="preserve"> </w:t>
       </w:r>
       <w:r>
         <w:rPr>
@@ -66,31 +66,23 @@
         <w:t xml:space="preserve"> </w:t>
       </w:r>
       <w:r>
-        <w:t xml:space="preserve">1.0</w:t>
-      </w:r>
-      <w:r>
-        <w:br/>
+        <w:t xml:space="preserve">1.1</w:t>
+      </w:r>
+      <w:r>
+        <w:t xml:space="preserve"> </w:t>
       </w:r>
       <w:r>
         <w:rPr>
           <w:b/>
           <w:bCs/>
         </w:rPr>
-        <w:t xml:space="preserve">General Editor:</w:t>
-      </w:r>
-      <w:r>
-        <w:t xml:space="preserve"> </w:t>
-      </w:r>
-      <w:r>
-        <w:t xml:space="preserve">Dan Knauss</w:t>
-      </w:r>
-    </w:p>
-    <w:p>
-      <w:pPr>
-        <w:pStyle w:val="FirstParagraph"/>
-      </w:pPr>
-      <w:r>
-        <w:t xml:space="preserve">A checklist-oriented runbook based on the WP VIP Learn</w:t>
+        <w:t xml:space="preserve">Date:</w:t>
+      </w:r>
+      <w:r>
+        <w:t xml:space="preserve"> </w:t>
+      </w:r>
+      <w:r>
+        <w:t xml:space="preserve">14 June 2026</w:t>
       </w:r>
       <w:r>
         <w:t xml:space="preserve"> </w:t>
@@ -100,13 +92,54 @@
           <w:b/>
           <w:bCs/>
         </w:rPr>
-        <w:t xml:space="preserve">Enterprise WordPress Performance</w:t>
-      </w:r>
-      <w:r>
-        <w:t xml:space="preserve"> </w:t>
-      </w:r>
-      <w:r>
-        <w:t xml:space="preserve">course. Use it to diagnose, optimize, and verify performance on high-traffic WordPress sites where backend execution, cacheability, database access, object caching, traffic events, and measurement discipline matter.</w:t>
+        <w:t xml:space="preserve">General Editor:</w:t>
+      </w:r>
+      <w:r>
+        <w:t xml:space="preserve"> </w:t>
+      </w:r>
+      <w:r>
+        <w:t xml:space="preserve">Dan Knauss</w:t>
+      </w:r>
+      <w:r>
+        <w:t xml:space="preserve"> </w:t>
+      </w:r>
+      <w:r>
+        <w:rPr>
+          <w:b/>
+          <w:bCs/>
+        </w:rPr>
+        <w:t xml:space="preserve">Currency:</w:t>
+      </w:r>
+      <w:r>
+        <w:t xml:space="preserve"> </w:t>
+      </w:r>
+      <w:r>
+        <w:t xml:space="preserve">Last verified against WordPress 7.0 on 2026-06-14.</w:t>
+      </w:r>
+    </w:p>
+    <w:p>
+      <w:pPr>
+        <w:pStyle w:val="FirstParagraph"/>
+      </w:pPr>
+      <w:r>
+        <w:t xml:space="preserve">A checklist-oriented enterprise operational guide for diagnosing, optimizing, and verifying performance on high-traffic WordPress sites where backend execution, cacheability, database access, object caching, traffic events, and measurement discipline matter. It complements the general</w:t>
+      </w:r>
+      <w:r>
+        <w:t xml:space="preserve"> </w:t>
+      </w:r>
+      <w:hyperlink r:id="rId40">
+        <w:r>
+          <w:rPr>
+            <w:rStyle w:val="VerbatimChar"/>
+          </w:rPr>
+          <w:t xml:space="preserve">wordpress-performance-optimization-checklist.md</w:t>
+        </w:r>
+      </w:hyperlink>
+      <w:r>
+        <w:t xml:space="preserve"> </w:t>
+      </w:r>
+      <w:r>
+        <w:t xml:space="preserve">by going deeper on operational scale and platform constraints.</w:t>
       </w:r>
     </w:p>
     <w:p>
@@ -124,8 +157,8 @@
         </w:pict>
       </w:r>
     </w:p>
-    <w:bookmarkEnd w:id="40"/>
-    <w:bookmarkStart w:id="96" w:name="table-of-contents"/>
+    <w:bookmarkEnd w:id="41"/>
+    <w:bookmarkStart w:id="92" w:name="table-of-contents"/>
     <w:p>
       <w:pPr>
         <w:pStyle w:val="Heading1"/>
@@ -703,154 +736,6 @@
           <w:numId w:val="1001"/>
         </w:numPr>
       </w:pPr>
-      <w:hyperlink w:anchor="X040b3b7b2cc6c053ae632cefe45eb13e8c153e0">
-        <w:r>
-          <w:rPr>
-            <w:rStyle w:val="Hyperlink"/>
-          </w:rPr>
-          <w:t xml:space="preserve">Appendix A: Modern additions (verified against WordPress 6.9.4, 2026-05-18)</w:t>
-        </w:r>
-      </w:hyperlink>
-    </w:p>
-    <w:p>
-      <w:pPr>
-        <w:pStyle w:val="Compact"/>
-        <w:numPr>
-          <w:ilvl w:val="1"/>
-          <w:numId w:val="1005"/>
-        </w:numPr>
-      </w:pPr>
-      <w:hyperlink w:anchor="X338e668c0df88702a795cfc4d60a67697d0fd94">
-        <w:r>
-          <w:rPr>
-            <w:rStyle w:val="Hyperlink"/>
-          </w:rPr>
-          <w:t xml:space="preserve">Options API expansion (WordPress 6.4 and 6.6)</w:t>
-        </w:r>
-      </w:hyperlink>
-    </w:p>
-    <w:p>
-      <w:pPr>
-        <w:pStyle w:val="Compact"/>
-        <w:numPr>
-          <w:ilvl w:val="1"/>
-          <w:numId w:val="1005"/>
-        </w:numPr>
-      </w:pPr>
-      <w:hyperlink w:anchor="X2180c040db0b29e42fc67b6639c713a0f52ca14">
-        <w:r>
-          <w:rPr>
-            <w:rStyle w:val="Hyperlink"/>
-          </w:rPr>
-          <w:t xml:space="preserve">Speculation Rules / Speculative Loading (WordPress 6.8)</w:t>
-        </w:r>
-      </w:hyperlink>
-    </w:p>
-    <w:p>
-      <w:pPr>
-        <w:pStyle w:val="Compact"/>
-        <w:numPr>
-          <w:ilvl w:val="1"/>
-          <w:numId w:val="1005"/>
-        </w:numPr>
-      </w:pPr>
-      <w:hyperlink w:anchor="wordpress-69-performance-deltas">
-        <w:r>
-          <w:rPr>
-            <w:rStyle w:val="Hyperlink"/>
-          </w:rPr>
-          <w:t xml:space="preserve">WordPress 6.9 performance deltas</w:t>
-        </w:r>
-      </w:hyperlink>
-    </w:p>
-    <w:p>
-      <w:pPr>
-        <w:pStyle w:val="Compact"/>
-        <w:numPr>
-          <w:ilvl w:val="1"/>
-          <w:numId w:val="1005"/>
-        </w:numPr>
-      </w:pPr>
-      <w:hyperlink w:anchor="fetchpriority-on-lcp-image-wordpress-63">
-        <w:r>
-          <w:rPr>
-            <w:rStyle w:val="VerbatimChar"/>
-          </w:rPr>
-          <w:t xml:space="preserve">fetchpriority</w:t>
-        </w:r>
-        <w:r>
-          <w:rPr>
-            <w:rStyle w:val="Hyperlink"/>
-          </w:rPr>
-          <w:t xml:space="preserve"> </w:t>
-        </w:r>
-        <w:r>
-          <w:rPr>
-            <w:rStyle w:val="Hyperlink"/>
-          </w:rPr>
-          <w:t xml:space="preserve">on LCP image (WordPress 6.3+)</w:t>
-        </w:r>
-      </w:hyperlink>
-    </w:p>
-    <w:p>
-      <w:pPr>
-        <w:pStyle w:val="Compact"/>
-        <w:numPr>
-          <w:ilvl w:val="1"/>
-          <w:numId w:val="1005"/>
-        </w:numPr>
-      </w:pPr>
-      <w:hyperlink w:anchor="performance-lab-plugin">
-        <w:r>
-          <w:rPr>
-            <w:rStyle w:val="Hyperlink"/>
-          </w:rPr>
-          <w:t xml:space="preserve">Performance Lab plugin</w:t>
-        </w:r>
-      </w:hyperlink>
-    </w:p>
-    <w:p>
-      <w:pPr>
-        <w:pStyle w:val="Compact"/>
-        <w:numPr>
-          <w:ilvl w:val="1"/>
-          <w:numId w:val="1005"/>
-        </w:numPr>
-      </w:pPr>
-      <w:hyperlink w:anchor="X272861d0d2d8708b0ae9043c57ce40fee4abb08">
-        <w:r>
-          <w:rPr>
-            <w:rStyle w:val="Hyperlink"/>
-          </w:rPr>
-          <w:t xml:space="preserve">Core Web Vitals: INP replaced FID (March 2024)</w:t>
-        </w:r>
-      </w:hyperlink>
-    </w:p>
-    <w:p>
-      <w:pPr>
-        <w:pStyle w:val="Compact"/>
-        <w:numPr>
-          <w:ilvl w:val="1"/>
-          <w:numId w:val="1005"/>
-        </w:numPr>
-      </w:pPr>
-      <w:hyperlink w:anchor="editorial-correction-to-source-lesson">
-        <w:r>
-          <w:rPr>
-            <w:rStyle w:val="Hyperlink"/>
-          </w:rPr>
-          <w:t xml:space="preserve">Editorial correction to source lesson</w:t>
-        </w:r>
-      </w:hyperlink>
-    </w:p>
-    <w:p>
-      <w:pPr>
-        <w:pStyle w:val="Compact"/>
-        <w:numPr>
-          <w:ilvl w:val="1"/>
-          <w:numId w:val="1005"/>
-        </w:numPr>
-      </w:pPr>
       <w:hyperlink w:anchor="references">
         <w:r>
           <w:rPr>
@@ -860,7 +745,24 @@
         </w:r>
       </w:hyperlink>
     </w:p>
-    <w:bookmarkStart w:id="41" w:name="define-the-performance-problem"/>
+    <w:p>
+      <w:pPr>
+        <w:pStyle w:val="Compact"/>
+        <w:numPr>
+          <w:ilvl w:val="1"/>
+          <w:numId w:val="1005"/>
+        </w:numPr>
+      </w:pPr>
+      <w:hyperlink w:anchor="source-note">
+        <w:r>
+          <w:rPr>
+            <w:rStyle w:val="Hyperlink"/>
+          </w:rPr>
+          <w:t xml:space="preserve">Source note</w:t>
+        </w:r>
+      </w:hyperlink>
+    </w:p>
+    <w:bookmarkStart w:id="42" w:name="define-the-performance-problem"/>
     <w:p>
       <w:pPr>
         <w:pStyle w:val="Heading2"/>
@@ -1176,8 +1078,8 @@
         </w:pict>
       </w:r>
     </w:p>
-    <w:bookmarkEnd w:id="41"/>
-    <w:bookmarkStart w:id="42" w:name="trace-the-request-cycle"/>
+    <w:bookmarkEnd w:id="42"/>
+    <w:bookmarkStart w:id="43" w:name="trace-the-request-cycle"/>
     <w:p>
       <w:pPr>
         <w:pStyle w:val="Heading2"/>
@@ -1401,8 +1303,8 @@
         </w:pict>
       </w:r>
     </w:p>
-    <w:bookmarkEnd w:id="42"/>
-    <w:bookmarkStart w:id="43" w:name="establish-a-baseline"/>
+    <w:bookmarkEnd w:id="43"/>
+    <w:bookmarkStart w:id="44" w:name="establish-a-baseline"/>
     <w:p>
       <w:pPr>
         <w:pStyle w:val="Heading2"/>
@@ -1512,7 +1414,31 @@
         </w:numPr>
       </w:pPr>
       <w:r>
+        <w:t xml:space="preserve">[ ] Record WordPress version, PHP runtime, and database version. WordPress 7.0 requires PHP 7.4.0 or higher; PHP 8.3 remains the recommended baseline for modern performance work.</w:t>
+      </w:r>
+    </w:p>
+    <w:p>
+      <w:pPr>
+        <w:pStyle w:val="Compact"/>
+        <w:numPr>
+          <w:ilvl w:val="0"/>
+          <w:numId w:val="1011"/>
+        </w:numPr>
+      </w:pPr>
+      <w:r>
         <w:t xml:space="preserve">[ ] Capture frontend impact if browser rendering is part of the symptom.</w:t>
+      </w:r>
+    </w:p>
+    <w:p>
+      <w:pPr>
+        <w:pStyle w:val="Compact"/>
+        <w:numPr>
+          <w:ilvl w:val="0"/>
+          <w:numId w:val="1011"/>
+        </w:numPr>
+      </w:pPr>
+      <w:r>
+        <w:t xml:space="preserve">[ ] Identify AI Client, Abilities API, Connectors API, or other external-service integrations that can add latency, retries, or queue pressure.</w:t>
       </w:r>
     </w:p>
     <w:p>
@@ -1993,8 +1919,8 @@
         </w:pict>
       </w:r>
     </w:p>
-    <w:bookmarkEnd w:id="43"/>
-    <w:bookmarkStart w:id="44" w:name="dns-and-http-request-setup"/>
+    <w:bookmarkEnd w:id="44"/>
+    <w:bookmarkStart w:id="45" w:name="dns-and-http-request-setup"/>
     <w:p>
       <w:pPr>
         <w:pStyle w:val="Heading2"/>
@@ -2534,8 +2460,8 @@
         </w:pict>
       </w:r>
     </w:p>
-    <w:bookmarkEnd w:id="44"/>
-    <w:bookmarkStart w:id="45" w:name="full-page-cache-and-edge-cache"/>
+    <w:bookmarkEnd w:id="45"/>
+    <w:bookmarkStart w:id="46" w:name="full-page-cache-and-edge-cache"/>
     <w:p>
       <w:pPr>
         <w:pStyle w:val="Heading2"/>
@@ -2870,8 +2796,8 @@
         </w:pict>
       </w:r>
     </w:p>
-    <w:bookmarkEnd w:id="45"/>
-    <w:bookmarkStart w:id="46" w:name="ttl-headers-and-invalidation"/>
+    <w:bookmarkEnd w:id="46"/>
+    <w:bookmarkStart w:id="47" w:name="ttl-headers-and-invalidation"/>
     <w:p>
       <w:pPr>
         <w:pStyle w:val="Heading2"/>
@@ -3124,8 +3050,8 @@
         </w:pict>
       </w:r>
     </w:p>
-    <w:bookmarkEnd w:id="46"/>
-    <w:bookmarkStart w:id="47" w:name="application-optimization"/>
+    <w:bookmarkEnd w:id="47"/>
+    <w:bookmarkStart w:id="48" w:name="application-optimization"/>
     <w:p>
       <w:pPr>
         <w:pStyle w:val="Heading2"/>
@@ -3325,8 +3251,8 @@
         </w:pict>
       </w:r>
     </w:p>
-    <w:bookmarkEnd w:id="47"/>
-    <w:bookmarkStart w:id="48" w:name="partial-output-caching"/>
+    <w:bookmarkEnd w:id="48"/>
+    <w:bookmarkStart w:id="49" w:name="partial-output-caching"/>
     <w:p>
       <w:pPr>
         <w:pStyle w:val="Heading2"/>
@@ -4407,8 +4333,8 @@
         </w:pict>
       </w:r>
     </w:p>
-    <w:bookmarkEnd w:id="48"/>
-    <w:bookmarkStart w:id="49" w:name="mysql-query-optimization"/>
+    <w:bookmarkEnd w:id="49"/>
+    <w:bookmarkStart w:id="50" w:name="mysql-query-optimization"/>
     <w:p>
       <w:pPr>
         <w:pStyle w:val="Heading2"/>
@@ -4987,8 +4913,8 @@
         </w:pict>
       </w:r>
     </w:p>
-    <w:bookmarkEnd w:id="49"/>
-    <w:bookmarkStart w:id="50" w:name="unbounded-queries"/>
+    <w:bookmarkEnd w:id="50"/>
+    <w:bookmarkStart w:id="51" w:name="unbounded-queries"/>
     <w:p>
       <w:pPr>
         <w:pStyle w:val="Heading2"/>
@@ -5868,8 +5794,8 @@
         </w:pict>
       </w:r>
     </w:p>
-    <w:bookmarkEnd w:id="50"/>
-    <w:bookmarkStart w:id="55" w:name="taxonomies-exclusions-post-meta-and-like"/>
+    <w:bookmarkEnd w:id="51"/>
+    <w:bookmarkStart w:id="56" w:name="taxonomies-exclusions-post-meta-and-like"/>
     <w:p>
       <w:pPr>
         <w:pStyle w:val="Heading2"/>
@@ -5878,7 +5804,7 @@
         <w:t xml:space="preserve">10. Taxonomies, exclusions, post meta, and LIKE</w:t>
       </w:r>
     </w:p>
-    <w:bookmarkStart w:id="51" w:name="taxonomies"/>
+    <w:bookmarkStart w:id="52" w:name="taxonomies"/>
     <w:p>
       <w:pPr>
         <w:pStyle w:val="Heading3"/>
@@ -6215,8 +6141,8 @@
         <w:t xml:space="preserve">;</w:t>
       </w:r>
     </w:p>
-    <w:bookmarkEnd w:id="51"/>
-    <w:bookmarkStart w:id="52" w:name="not-in"/>
+    <w:bookmarkEnd w:id="52"/>
+    <w:bookmarkStart w:id="53" w:name="not-in"/>
     <w:p>
       <w:pPr>
         <w:pStyle w:val="Heading3"/>
@@ -6502,8 +6428,8 @@
         <w:t xml:space="preserve">);</w:t>
       </w:r>
     </w:p>
-    <w:bookmarkEnd w:id="52"/>
-    <w:bookmarkStart w:id="53" w:name="post-meta"/>
+    <w:bookmarkEnd w:id="53"/>
+    <w:bookmarkStart w:id="54" w:name="post-meta"/>
     <w:p>
       <w:pPr>
         <w:pStyle w:val="Heading3"/>
@@ -6548,8 +6474,8 @@
         <w:t xml:space="preserve">[ ] Consider custom tables or search infrastructure for high-volume structured data.</w:t>
       </w:r>
     </w:p>
-    <w:bookmarkEnd w:id="53"/>
-    <w:bookmarkStart w:id="54" w:name="like"/>
+    <w:bookmarkEnd w:id="54"/>
+    <w:bookmarkStart w:id="55" w:name="like"/>
     <w:p>
       <w:pPr>
         <w:pStyle w:val="Heading3"/>
@@ -6771,9 +6697,9 @@
         </w:pict>
       </w:r>
     </w:p>
-    <w:bookmarkEnd w:id="54"/>
     <w:bookmarkEnd w:id="55"/>
-    <w:bookmarkStart w:id="56" w:name="explain-driven-query-review"/>
+    <w:bookmarkEnd w:id="56"/>
+    <w:bookmarkStart w:id="57" w:name="explain-driven-query-review"/>
     <w:p>
       <w:pPr>
         <w:pStyle w:val="Heading2"/>
@@ -7163,8 +7089,8 @@
         </w:pict>
       </w:r>
     </w:p>
-    <w:bookmarkEnd w:id="56"/>
-    <w:bookmarkStart w:id="57" w:name="object-caching"/>
+    <w:bookmarkEnd w:id="57"/>
+    <w:bookmarkStart w:id="58" w:name="object-caching"/>
     <w:p>
       <w:pPr>
         <w:pStyle w:val="Heading2"/>
@@ -7417,6 +7343,117 @@
       </w:pPr>
       <w:r>
         <w:t xml:space="preserve">[ ] Avoid storing huge objects that increase memory pressure.</w:t>
+      </w:r>
+    </w:p>
+    <w:p>
+      <w:pPr>
+        <w:pStyle w:val="Compact"/>
+        <w:numPr>
+          <w:ilvl w:val="0"/>
+          <w:numId w:val="1033"/>
+        </w:numPr>
+      </w:pPr>
+      <w:r>
+        <w:t xml:space="preserve">[ ] Include</w:t>
+      </w:r>
+      <w:r>
+        <w:t xml:space="preserve"> </w:t>
+      </w:r>
+      <w:r>
+        <w:rPr>
+          <w:rStyle w:val="VerbatimChar"/>
+        </w:rPr>
+        <w:t xml:space="preserve">alloptions</w:t>
+      </w:r>
+      <w:r>
+        <w:t xml:space="preserve"> </w:t>
+      </w:r>
+      <w:r>
+        <w:t xml:space="preserve">and autoloaded-option size in object-cache review. WordPress 6.6+ uses</w:t>
+      </w:r>
+      <w:r>
+        <w:t xml:space="preserve"> </w:t>
+      </w:r>
+      <w:r>
+        <w:rPr>
+          <w:rStyle w:val="VerbatimChar"/>
+        </w:rPr>
+        <w:t xml:space="preserve">on</w:t>
+      </w:r>
+      <w:r>
+        <w:t xml:space="preserve">,</w:t>
+      </w:r>
+      <w:r>
+        <w:t xml:space="preserve"> </w:t>
+      </w:r>
+      <w:r>
+        <w:rPr>
+          <w:rStyle w:val="VerbatimChar"/>
+        </w:rPr>
+        <w:t xml:space="preserve">off</w:t>
+      </w:r>
+      <w:r>
+        <w:t xml:space="preserve">,</w:t>
+      </w:r>
+      <w:r>
+        <w:t xml:space="preserve"> </w:t>
+      </w:r>
+      <w:r>
+        <w:rPr>
+          <w:rStyle w:val="VerbatimChar"/>
+        </w:rPr>
+        <w:t xml:space="preserve">auto</w:t>
+      </w:r>
+      <w:r>
+        <w:t xml:space="preserve">,</w:t>
+      </w:r>
+      <w:r>
+        <w:t xml:space="preserve"> </w:t>
+      </w:r>
+      <w:r>
+        <w:rPr>
+          <w:rStyle w:val="VerbatimChar"/>
+        </w:rPr>
+        <w:t xml:space="preserve">auto-on</w:t>
+      </w:r>
+      <w:r>
+        <w:t xml:space="preserve">, and</w:t>
+      </w:r>
+      <w:r>
+        <w:t xml:space="preserve"> </w:t>
+      </w:r>
+      <w:r>
+        <w:rPr>
+          <w:rStyle w:val="VerbatimChar"/>
+        </w:rPr>
+        <w:t xml:space="preserve">auto-off</w:t>
+      </w:r>
+      <w:r>
+        <w:t xml:space="preserve"> </w:t>
+      </w:r>
+      <w:r>
+        <w:t xml:space="preserve">values while upgraded rows may still use</w:t>
+      </w:r>
+      <w:r>
+        <w:t xml:space="preserve"> </w:t>
+      </w:r>
+      <w:r>
+        <w:rPr>
+          <w:rStyle w:val="VerbatimChar"/>
+        </w:rPr>
+        <w:t xml:space="preserve">yes</w:t>
+      </w:r>
+      <w:r>
+        <w:t xml:space="preserve">/</w:t>
+      </w:r>
+      <w:r>
+        <w:rPr>
+          <w:rStyle w:val="VerbatimChar"/>
+        </w:rPr>
+        <w:t xml:space="preserve">no</w:t>
+      </w:r>
+      <w:r>
+        <w:t xml:space="preserve">; monitoring must query both vocabularies.</w:t>
       </w:r>
     </w:p>
     <w:p>
@@ -7438,8 +7475,8 @@
         </w:pict>
       </w:r>
     </w:p>
-    <w:bookmarkEnd w:id="57"/>
-    <w:bookmarkStart w:id="58" w:name="transients-and-in-memory-caching"/>
+    <w:bookmarkEnd w:id="58"/>
+    <w:bookmarkStart w:id="59" w:name="transients-and-in-memory-caching"/>
     <w:p>
       <w:pPr>
         <w:pStyle w:val="Heading2"/>
@@ -7931,8 +7968,8 @@
         </w:pict>
       </w:r>
     </w:p>
-    <w:bookmarkEnd w:id="58"/>
-    <w:bookmarkStart w:id="59" w:name="race-conditions-and-cache-stampedes"/>
+    <w:bookmarkEnd w:id="59"/>
+    <w:bookmarkStart w:id="60" w:name="race-conditions-and-cache-stampedes"/>
     <w:p>
       <w:pPr>
         <w:pStyle w:val="Heading2"/>
@@ -8601,8 +8638,8 @@
         </w:pict>
       </w:r>
     </w:p>
-    <w:bookmarkEnd w:id="59"/>
-    <w:bookmarkStart w:id="60" w:name="wp-cron-and-scheduled-work"/>
+    <w:bookmarkEnd w:id="60"/>
+    <w:bookmarkStart w:id="61" w:name="wp-cron-and-scheduled-work"/>
     <w:p>
       <w:pPr>
         <w:pStyle w:val="Heading2"/>
@@ -9208,11 +9245,11 @@
         <w:pStyle w:val="FirstParagraph"/>
       </w:pPr>
       <w:r>
-        <w:t xml:space="preserve">After setting the constant, confirm scheduled events continue to clear. Roll back by commenting out the constant and clearing OPcache if the backlog grows.</w:t>
-      </w:r>
-    </w:p>
-    <w:bookmarkEnd w:id="60"/>
-    <w:bookmarkStart w:id="64" w:name="X074b66bf28bf6916238b2bb912424b5abd2e6d1"/>
+        <w:t xml:space="preserve">After setting the constant, confirm scheduled events continue to clear. WordPress 6.9+ spawns request-triggered WP-Cron at shutdown, which can reduce user-facing latency, but enterprise/high-traffic sites should still use a verified external runner. Roll back by commenting out the constant and clearing OPcache if the backlog grows.</w:t>
+      </w:r>
+    </w:p>
+    <w:bookmarkEnd w:id="61"/>
+    <w:bookmarkStart w:id="65" w:name="X074b66bf28bf6916238b2bb912424b5abd2e6d1"/>
     <w:p>
       <w:pPr>
         <w:pStyle w:val="Heading2"/>
@@ -9221,7 +9258,7 @@
         <w:t xml:space="preserve">16. AJAX, REST, sitemaps, redirects, and external requests</w:t>
       </w:r>
     </w:p>
-    <w:bookmarkStart w:id="61" w:name="ajax-and-rest"/>
+    <w:bookmarkStart w:id="62" w:name="ajax-and-rest"/>
     <w:p>
       <w:pPr>
         <w:pStyle w:val="Heading3"/>
@@ -9317,8 +9354,8 @@
         <w:t xml:space="preserve">[ ] Authenticate private endpoints correctly.</w:t>
       </w:r>
     </w:p>
-    <w:bookmarkEnd w:id="61"/>
-    <w:bookmarkStart w:id="62" w:name="sitemaps"/>
+    <w:bookmarkEnd w:id="62"/>
+    <w:bookmarkStart w:id="63" w:name="sitemaps"/>
     <w:p>
       <w:pPr>
         <w:pStyle w:val="Heading3"/>
@@ -9375,8 +9412,8 @@
         <w:t xml:space="preserve">[ ] Avoid regenerating large sitemap structures on every request.</w:t>
       </w:r>
     </w:p>
-    <w:bookmarkEnd w:id="62"/>
-    <w:bookmarkStart w:id="63" w:name="external-requests"/>
+    <w:bookmarkEnd w:id="63"/>
+    <w:bookmarkStart w:id="64" w:name="external-requests"/>
     <w:p>
       <w:pPr>
         <w:pStyle w:val="Heading3"/>
@@ -9452,9 +9489,9 @@
         </w:pict>
       </w:r>
     </w:p>
-    <w:bookmarkEnd w:id="63"/>
     <w:bookmarkEnd w:id="64"/>
-    <w:bookmarkStart w:id="65" w:name="Xbaf3fdb85831dc92fa95e7eb51331eec8c713cb"/>
+    <w:bookmarkEnd w:id="65"/>
+    <w:bookmarkStart w:id="66" w:name="Xbaf3fdb85831dc92fa95e7eb51331eec8c713cb"/>
     <w:p>
       <w:pPr>
         <w:pStyle w:val="Heading2"/>
@@ -9553,6 +9590,57 @@
       </w:pPr>
       <w:r>
         <w:t xml:space="preserve">[ ] Watch for AJAX calls triggered by frontend scripts after load.</w:t>
+      </w:r>
+    </w:p>
+    <w:p>
+      <w:pPr>
+        <w:pStyle w:val="Compact"/>
+        <w:numPr>
+          <w:ilvl w:val="0"/>
+          <w:numId w:val="1042"/>
+        </w:numPr>
+      </w:pPr>
+      <w:r>
+        <w:t xml:space="preserve">[ ] Verify WordPress 6.3+</w:t>
+      </w:r>
+      <w:r>
+        <w:t xml:space="preserve"> </w:t>
+      </w:r>
+      <w:r>
+        <w:rPr>
+          <w:rStyle w:val="VerbatimChar"/>
+        </w:rPr>
+        <w:t xml:space="preserve">fetchpriority</w:t>
+      </w:r>
+      <w:r>
+        <w:t xml:space="preserve"> </w:t>
+      </w:r>
+      <w:r>
+        <w:t xml:space="preserve">handling before adding platform-level hero-image preloads.</w:t>
+      </w:r>
+    </w:p>
+    <w:p>
+      <w:pPr>
+        <w:pStyle w:val="Compact"/>
+        <w:numPr>
+          <w:ilvl w:val="0"/>
+          <w:numId w:val="1042"/>
+        </w:numPr>
+      </w:pPr>
+      <w:r>
+        <w:t xml:space="preserve">[ ] Review WordPress 6.8+ speculative loading rules alongside analytics, consent, personalization, and cacheability controls.</w:t>
+      </w:r>
+    </w:p>
+    <w:p>
+      <w:pPr>
+        <w:pStyle w:val="Compact"/>
+        <w:numPr>
+          <w:ilvl w:val="0"/>
+          <w:numId w:val="1042"/>
+        </w:numPr>
+      </w:pPr>
+      <w:r>
+        <w:t xml:space="preserve">[ ] Re-test authenticated admin/editor workflows after WordPress 7.0 upgrades, especially custom blocks, editor extensions, Font Library workflows, Visual Revisions, and iframed-editor behavior.</w:t>
       </w:r>
     </w:p>
     <w:p>
@@ -9562,8 +9650,8 @@
         </w:pict>
       </w:r>
     </w:p>
-    <w:bookmarkEnd w:id="65"/>
-    <w:bookmarkStart w:id="66" w:name="traffic-patterns-and-high-traffic-events"/>
+    <w:bookmarkEnd w:id="66"/>
+    <w:bookmarkStart w:id="67" w:name="traffic-patterns-and-high-traffic-events"/>
     <w:p>
       <w:pPr>
         <w:pStyle w:val="Heading2"/>
@@ -9662,6 +9750,18 @@
       </w:pPr>
       <w:r>
         <w:t xml:space="preserve">[ ] Remove avoidable query-string cache fragmentation.</w:t>
+      </w:r>
+    </w:p>
+    <w:p>
+      <w:pPr>
+        <w:pStyle w:val="Compact"/>
+        <w:numPr>
+          <w:ilvl w:val="0"/>
+          <w:numId w:val="1043"/>
+        </w:numPr>
+      </w:pPr>
+      <w:r>
+        <w:t xml:space="preserve">[ ] Exclude authenticated, cart/checkout, preview, session-keyed, and personalized paths from speculative loading before enabling more aggressive prefetch/prerender behavior.</w:t>
       </w:r>
     </w:p>
     <w:p>
@@ -9787,8 +9887,8 @@
         </w:pict>
       </w:r>
     </w:p>
-    <w:bookmarkEnd w:id="66"/>
-    <w:bookmarkStart w:id="67" w:name="load-testing"/>
+    <w:bookmarkEnd w:id="67"/>
+    <w:bookmarkStart w:id="68" w:name="load-testing"/>
     <w:p>
       <w:pPr>
         <w:pStyle w:val="Heading2"/>
@@ -10025,8 +10125,8 @@
         </w:pict>
       </w:r>
     </w:p>
-    <w:bookmarkEnd w:id="67"/>
-    <w:bookmarkStart w:id="71" w:name="measuring-time-spent"/>
+    <w:bookmarkEnd w:id="68"/>
+    <w:bookmarkStart w:id="72" w:name="measuring-time-spent"/>
     <w:p>
       <w:pPr>
         <w:pStyle w:val="Heading2"/>
@@ -10043,7 +10143,7 @@
         <w:t xml:space="preserve">Use multiple tools because each sees a different layer.</w:t>
       </w:r>
     </w:p>
-    <w:bookmarkStart w:id="68" w:name="php-logging"/>
+    <w:bookmarkStart w:id="69" w:name="php-logging"/>
     <w:p>
       <w:pPr>
         <w:pStyle w:val="Heading3"/>
@@ -10428,8 +10528,8 @@
         <w:t xml:space="preserve">}</w:t>
       </w:r>
     </w:p>
-    <w:bookmarkEnd w:id="68"/>
-    <w:bookmarkStart w:id="69" w:name="new-relic"/>
+    <w:bookmarkEnd w:id="69"/>
+    <w:bookmarkStart w:id="70" w:name="new-relic"/>
     <w:p>
       <w:pPr>
         <w:pStyle w:val="Heading3"/>
@@ -10476,6 +10576,18 @@
     </w:p>
     <w:p>
       <w:pPr>
+        <w:pStyle w:val="Compact"/>
+        <w:numPr>
+          <w:ilvl w:val="0"/>
+          <w:numId w:val="1048"/>
+        </w:numPr>
+      </w:pPr>
+      <w:r>
+        <w:t xml:space="preserve">[ ] For WordPress 7.0 AI/connectors or similar integrations, separate external API latency, retries, timeouts, queueing, credential access failures, and cacheability of generated results.</w:t>
+      </w:r>
+    </w:p>
+    <w:p>
+      <w:pPr>
         <w:pStyle w:val="FirstParagraph"/>
       </w:pPr>
       <w:r>
@@ -10762,8 +10874,8 @@
         <w:t xml:space="preserve">to give the current request a stable, low-cardinality name in APM. The New Relic transaction-start API takes a New Relic application name, not a transaction name, and is reserved for advanced transaction-lifecycle patterns such as queue workers manually ending one transaction and starting another.</w:t>
       </w:r>
     </w:p>
-    <w:bookmarkEnd w:id="69"/>
-    <w:bookmarkStart w:id="70" w:name="query-monitor"/>
+    <w:bookmarkEnd w:id="70"/>
+    <w:bookmarkStart w:id="71" w:name="query-monitor"/>
     <w:p>
       <w:pPr>
         <w:pStyle w:val="Heading3"/>
@@ -11050,9 +11162,9 @@
         </w:pict>
       </w:r>
     </w:p>
-    <w:bookmarkEnd w:id="70"/>
     <w:bookmarkEnd w:id="71"/>
-    <w:bookmarkStart w:id="72" w:name="performance-alerting"/>
+    <w:bookmarkEnd w:id="72"/>
+    <w:bookmarkStart w:id="73" w:name="performance-alerting"/>
     <w:p>
       <w:pPr>
         <w:pStyle w:val="Heading2"/>
@@ -11256,8 +11368,8 @@
         </w:pict>
       </w:r>
     </w:p>
-    <w:bookmarkEnd w:id="72"/>
-    <w:bookmarkStart w:id="73" w:name="verification-and-definition-of-done"/>
+    <w:bookmarkEnd w:id="73"/>
+    <w:bookmarkStart w:id="74" w:name="verification-and-definition-of-done"/>
     <w:p>
       <w:pPr>
         <w:pStyle w:val="Heading2"/>
@@ -11469,194 +11581,32 @@
         </w:pict>
       </w:r>
     </w:p>
-    <w:bookmarkEnd w:id="73"/>
-    <w:bookmarkStart w:id="95" w:name="X500be7278c824286df7b36766ef783ff99a1679"/>
+    <w:bookmarkEnd w:id="74"/>
+    <w:bookmarkStart w:id="91" w:name="references"/>
     <w:p>
       <w:pPr>
         <w:pStyle w:val="Heading2"/>
       </w:pPr>
       <w:r>
-        <w:t xml:space="preserve">Appendix A: Modern additions (verified against WordPress 6.9.4, 2026-05-18)</w:t>
-      </w:r>
-    </w:p>
-    <w:p>
-      <w:pPr>
-        <w:pStyle w:val="FirstParagraph"/>
-      </w:pPr>
-      <w:r>
-        <w:t xml:space="preserve">The WP VIP Learn Enterprise WordPress Performance course was recorded before several WordPress Core performance changes that matter at platform scale. This appendix covers them in enterprise terms. The unified developer reference at</w:t>
-      </w:r>
-      <w:r>
-        <w:t xml:space="preserve"> </w:t>
-      </w:r>
-      <w:hyperlink r:id="rId74">
+        <w:t xml:space="preserve">References</w:t>
+      </w:r>
+    </w:p>
+    <w:p>
+      <w:pPr>
+        <w:pStyle w:val="Compact"/>
+        <w:numPr>
+          <w:ilvl w:val="0"/>
+          <w:numId w:val="1054"/>
+        </w:numPr>
+      </w:pPr>
+      <w:hyperlink r:id="rId75">
         <w:r>
           <w:rPr>
-            <w:rStyle w:val="VerbatimChar"/>
+            <w:rStyle w:val="Hyperlink"/>
           </w:rPr>
-          <w:t xml:space="preserve">DEVELOPER_REFERENCE.md</w:t>
+          <w:t xml:space="preserve">Options API: Disabling autoload for large options (Make WP Core)</w:t>
         </w:r>
       </w:hyperlink>
-      <w:r>
-        <w:t xml:space="preserve"> </w:t>
-      </w:r>
-      <w:r>
-        <w:t xml:space="preserve">has fuller treatment.</w:t>
-      </w:r>
-    </w:p>
-    <w:bookmarkStart w:id="75" w:name="X84d7775bb3119c347a3b1ab665b19a32c85e188"/>
-    <w:p>
-      <w:pPr>
-        <w:pStyle w:val="Heading3"/>
-      </w:pPr>
-      <w:r>
-        <w:t xml:space="preserve">Options API expansion (WordPress 6.4 and 6.6)</w:t>
-      </w:r>
-    </w:p>
-    <w:p>
-      <w:pPr>
-        <w:pStyle w:val="FirstParagraph"/>
-      </w:pPr>
-      <w:r>
-        <w:t xml:space="preserve">WordPress 6.4 added</w:t>
-      </w:r>
-      <w:r>
-        <w:t xml:space="preserve"> </w:t>
-      </w:r>
-      <w:r>
-        <w:rPr>
-          <w:rStyle w:val="VerbatimChar"/>
-        </w:rPr>
-        <w:t xml:space="preserve">wp_set_option_autoload()</w:t>
-      </w:r>
-      <w:r>
-        <w:t xml:space="preserve"> </w:t>
-      </w:r>
-      <w:r>
-        <w:t xml:space="preserve">and</w:t>
-      </w:r>
-      <w:r>
-        <w:t xml:space="preserve"> </w:t>
-      </w:r>
-      <w:r>
-        <w:rPr>
-          <w:rStyle w:val="VerbatimChar"/>
-        </w:rPr>
-        <w:t xml:space="preserve">wp_set_options_autoload()</w:t>
-      </w:r>
-      <w:r>
-        <w:t xml:space="preserve"> </w:t>
-      </w:r>
-      <w:r>
-        <w:t xml:space="preserve">for managing autoload state without touching the database directly. WordPress 6.6 expanded the</w:t>
-      </w:r>
-      <w:r>
-        <w:t xml:space="preserve"> </w:t>
-      </w:r>
-      <w:r>
-        <w:rPr>
-          <w:rStyle w:val="VerbatimChar"/>
-        </w:rPr>
-        <w:t xml:space="preserve">autoload</w:t>
-      </w:r>
-      <w:r>
-        <w:t xml:space="preserve"> </w:t>
-      </w:r>
-      <w:r>
-        <w:t xml:space="preserve">column to five values:</w:t>
-      </w:r>
-      <w:r>
-        <w:t xml:space="preserve"> </w:t>
-      </w:r>
-      <w:r>
-        <w:rPr>
-          <w:rStyle w:val="VerbatimChar"/>
-        </w:rPr>
-        <w:t xml:space="preserve">'on'</w:t>
-      </w:r>
-      <w:r>
-        <w:t xml:space="preserve">,</w:t>
-      </w:r>
-      <w:r>
-        <w:t xml:space="preserve"> </w:t>
-      </w:r>
-      <w:r>
-        <w:rPr>
-          <w:rStyle w:val="VerbatimChar"/>
-        </w:rPr>
-        <w:t xml:space="preserve">'off'</w:t>
-      </w:r>
-      <w:r>
-        <w:t xml:space="preserve">,</w:t>
-      </w:r>
-      <w:r>
-        <w:t xml:space="preserve"> </w:t>
-      </w:r>
-      <w:r>
-        <w:rPr>
-          <w:rStyle w:val="VerbatimChar"/>
-        </w:rPr>
-        <w:t xml:space="preserve">'auto'</w:t>
-      </w:r>
-      <w:r>
-        <w:t xml:space="preserve">,</w:t>
-      </w:r>
-      <w:r>
-        <w:t xml:space="preserve"> </w:t>
-      </w:r>
-      <w:r>
-        <w:rPr>
-          <w:rStyle w:val="VerbatimChar"/>
-        </w:rPr>
-        <w:t xml:space="preserve">'auto-on'</w:t>
-      </w:r>
-      <w:r>
-        <w:t xml:space="preserve">,</w:t>
-      </w:r>
-      <w:r>
-        <w:t xml:space="preserve"> </w:t>
-      </w:r>
-      <w:r>
-        <w:rPr>
-          <w:rStyle w:val="VerbatimChar"/>
-        </w:rPr>
-        <w:t xml:space="preserve">'auto-off'</w:t>
-      </w:r>
-      <w:r>
-        <w:t xml:space="preserve">. Legacy</w:t>
-      </w:r>
-      <w:r>
-        <w:t xml:space="preserve"> </w:t>
-      </w:r>
-      <w:r>
-        <w:rPr>
-          <w:rStyle w:val="VerbatimChar"/>
-        </w:rPr>
-        <w:t xml:space="preserve">'yes'</w:t>
-      </w:r>
-      <w:r>
-        <w:t xml:space="preserve">/</w:t>
-      </w:r>
-      <w:r>
-        <w:rPr>
-          <w:rStyle w:val="VerbatimChar"/>
-        </w:rPr>
-        <w:t xml:space="preserve">'no'</w:t>
-      </w:r>
-      <w:r>
-        <w:t xml:space="preserve"> </w:t>
-      </w:r>
-      <w:r>
-        <w:t xml:space="preserve">rows persist on upgraded sites.</w:t>
-      </w:r>
-    </w:p>
-    <w:p>
-      <w:pPr>
-        <w:pStyle w:val="BodyText"/>
-      </w:pPr>
-      <w:r>
-        <w:t xml:space="preserve">Enterprise / platform implications:</w:t>
-      </w:r>
     </w:p>
     <w:p>
       <w:pPr>
@@ -11666,532 +11616,75 @@
           <w:numId w:val="1054"/>
         </w:numPr>
       </w:pPr>
-      <w:r>
-        <w:t xml:space="preserve">[ ] Any saved monitoring queries, dashboards, or platform health checks filtering only legacy</w:t>
-      </w:r>
-      <w:r>
-        <w:t xml:space="preserve"> </w:t>
-      </w:r>
-      <w:r>
-        <w:rPr>
-          <w:rStyle w:val="VerbatimChar"/>
-        </w:rPr>
-        <w:t xml:space="preserve">'yes'</w:t>
-      </w:r>
-      <w:r>
-        <w:t xml:space="preserve"> </w:t>
-      </w:r>
-      <w:r>
-        <w:t xml:space="preserve">autoload rows need to switch to</w:t>
-      </w:r>
-      <w:r>
-        <w:t xml:space="preserve"> </w:t>
-      </w:r>
-      <w:r>
-        <w:rPr>
-          <w:rStyle w:val="VerbatimChar"/>
-        </w:rPr>
-        <w:t xml:space="preserve">autoload IN ('yes', 'on', 'auto', 'auto-on')</w:t>
-      </w:r>
-      <w:r>
-        <w:t xml:space="preserve">. This is a silent miss otherwise — newly written 6.6+ options stop showing up.</w:t>
-      </w:r>
-    </w:p>
-    <w:p>
-      <w:pPr>
-        <w:pStyle w:val="Compact"/>
-        <w:numPr>
-          <w:ilvl w:val="0"/>
-          <w:numId w:val="1054"/>
-        </w:numPr>
-      </w:pPr>
-      <w:r>
-        <w:t xml:space="preserve">[ ] WP 6.6 automatically marks options larger than ~150 KB as</w:t>
-      </w:r>
-      <w:r>
-        <w:t xml:space="preserve"> </w:t>
-      </w:r>
-      <w:r>
-        <w:rPr>
-          <w:rStyle w:val="VerbatimChar"/>
-        </w:rPr>
-        <w:t xml:space="preserve">'auto-off'</w:t>
-      </w:r>
-      <w:r>
-        <w:t xml:space="preserve">. Custom platform code that writes large options with explicit autoload should respect this signal rather than fight it.</w:t>
-      </w:r>
-    </w:p>
-    <w:p>
-      <w:pPr>
-        <w:pStyle w:val="Compact"/>
-        <w:numPr>
-          <w:ilvl w:val="0"/>
-          <w:numId w:val="1054"/>
-        </w:numPr>
-      </w:pPr>
-      <w:r>
-        <w:t xml:space="preserve">[ ] Site Health adds a check labeled “Autoloaded options could affect performance” at ~800 KB total autoload size. Surface this in platform telemetry alongside</w:t>
-      </w:r>
-      <w:r>
-        <w:t xml:space="preserve"> </w:t>
-      </w:r>
-      <w:r>
-        <w:rPr>
-          <w:rStyle w:val="VerbatimChar"/>
-        </w:rPr>
-        <w:t xml:space="preserve">alloptions</w:t>
-      </w:r>
-      <w:r>
-        <w:t xml:space="preserve"> </w:t>
-      </w:r>
-      <w:r>
-        <w:t xml:space="preserve">size.</w:t>
-      </w:r>
-    </w:p>
-    <w:p>
-      <w:pPr>
-        <w:pStyle w:val="Compact"/>
-        <w:numPr>
-          <w:ilvl w:val="0"/>
-          <w:numId w:val="1054"/>
-        </w:numPr>
-      </w:pPr>
-      <w:r>
-        <w:t xml:space="preserve">[ ] On</w:t>
-      </w:r>
-      <w:r>
-        <w:t xml:space="preserve"> </w:t>
-      </w:r>
-      <w:r>
-        <w:rPr>
-          <w:rStyle w:val="VerbatimChar"/>
-        </w:rPr>
-        <w:t xml:space="preserve">alloptions</w:t>
-      </w:r>
-      <w:r>
-        <w:t xml:space="preserve"> </w:t>
-      </w:r>
-      <w:r>
-        <w:t xml:space="preserve">cache stampedes (the classic VIP issue), the WP 6.6 auto-skip heuristics reduce — but do not eliminate — the risk. Continue to set explicit</w:t>
-      </w:r>
-      <w:r>
-        <w:t xml:space="preserve"> </w:t>
-      </w:r>
-      <w:r>
-        <w:rPr>
-          <w:rStyle w:val="VerbatimChar"/>
-        </w:rPr>
-        <w:t xml:space="preserve">autoload =&gt; false</w:t>
-      </w:r>
-      <w:r>
-        <w:t xml:space="preserve"> </w:t>
-      </w:r>
-      <w:r>
-        <w:t xml:space="preserve">for known-large platform options.</w:t>
-      </w:r>
-    </w:p>
-    <w:p>
-      <w:pPr>
-        <w:pStyle w:val="SourceCode"/>
-      </w:pPr>
-      <w:r>
-        <w:rPr>
-          <w:rStyle w:val="CommentTok"/>
-        </w:rPr>
-        <w:t xml:space="preserve">// Platform code: prefer explicit autoload over relying on heuristics.</w:t>
-      </w:r>
-      <w:r>
-        <w:br/>
-      </w:r>
-      <w:r>
-        <w:rPr>
-          <w:rStyle w:val="NormalTok"/>
-        </w:rPr>
-        <w:t xml:space="preserve">add_option( </w:t>
-      </w:r>
-      <w:r>
-        <w:rPr>
-          <w:rStyle w:val="StringTok"/>
-        </w:rPr>
-        <w:t xml:space="preserve">'my_platform_large_option'</w:t>
-      </w:r>
-      <w:r>
-        <w:rPr>
-          <w:rStyle w:val="OtherTok"/>
-        </w:rPr>
-        <w:t xml:space="preserve">,</w:t>
-      </w:r>
-      <w:r>
-        <w:rPr>
-          <w:rStyle w:val="NormalTok"/>
-        </w:rPr>
-        <w:t xml:space="preserve"> </w:t>
-      </w:r>
-      <w:r>
-        <w:rPr>
-          <w:rStyle w:val="VariableTok"/>
-        </w:rPr>
-        <w:t xml:space="preserve">$value</w:t>
-      </w:r>
-      <w:r>
-        <w:rPr>
-          <w:rStyle w:val="OtherTok"/>
-        </w:rPr>
-        <w:t xml:space="preserve">,</w:t>
-      </w:r>
-      <w:r>
-        <w:rPr>
-          <w:rStyle w:val="NormalTok"/>
-        </w:rPr>
-        <w:t xml:space="preserve"> </w:t>
-      </w:r>
-      <w:r>
-        <w:rPr>
-          <w:rStyle w:val="StringTok"/>
-        </w:rPr>
-        <w:t xml:space="preserve">''</w:t>
-      </w:r>
-      <w:r>
-        <w:rPr>
-          <w:rStyle w:val="OtherTok"/>
-        </w:rPr>
-        <w:t xml:space="preserve">,</w:t>
-      </w:r>
-      <w:r>
-        <w:rPr>
-          <w:rStyle w:val="NormalTok"/>
-        </w:rPr>
-        <w:t xml:space="preserve"> </w:t>
-      </w:r>
-      <w:r>
-        <w:rPr>
-          <w:rStyle w:val="KeywordTok"/>
-        </w:rPr>
-        <w:t xml:space="preserve">false</w:t>
-      </w:r>
-      <w:r>
-        <w:rPr>
-          <w:rStyle w:val="NormalTok"/>
-        </w:rPr>
-        <w:t xml:space="preserve"> )</w:t>
-      </w:r>
-      <w:r>
-        <w:rPr>
-          <w:rStyle w:val="OtherTok"/>
-        </w:rPr>
-        <w:t xml:space="preserve">;</w:t>
-      </w:r>
-      <w:r>
-        <w:br/>
-      </w:r>
-      <w:r>
-        <w:br/>
-      </w:r>
-      <w:r>
-        <w:rPr>
-          <w:rStyle w:val="CommentTok"/>
-        </w:rPr>
-        <w:t xml:space="preserve">// To flip an existing option:</w:t>
-      </w:r>
-      <w:r>
-        <w:br/>
-      </w:r>
-      <w:r>
-        <w:rPr>
-          <w:rStyle w:val="NormalTok"/>
-        </w:rPr>
-        <w:t xml:space="preserve">wp_set_option_autoload( </w:t>
-      </w:r>
-      <w:r>
-        <w:rPr>
-          <w:rStyle w:val="StringTok"/>
-        </w:rPr>
-        <w:t xml:space="preserve">'my_platform_large_option'</w:t>
-      </w:r>
-      <w:r>
-        <w:rPr>
-          <w:rStyle w:val="OtherTok"/>
-        </w:rPr>
-        <w:t xml:space="preserve">,</w:t>
-      </w:r>
-      <w:r>
-        <w:rPr>
-          <w:rStyle w:val="NormalTok"/>
-        </w:rPr>
-        <w:t xml:space="preserve"> </w:t>
-      </w:r>
-      <w:r>
-        <w:rPr>
-          <w:rStyle w:val="KeywordTok"/>
-        </w:rPr>
-        <w:t xml:space="preserve">false</w:t>
-      </w:r>
-      <w:r>
-        <w:rPr>
-          <w:rStyle w:val="NormalTok"/>
-        </w:rPr>
-        <w:t xml:space="preserve"> )</w:t>
-      </w:r>
-      <w:r>
-        <w:rPr>
-          <w:rStyle w:val="OtherTok"/>
-        </w:rPr>
-        <w:t xml:space="preserve">;</w:t>
-      </w:r>
-    </w:p>
-    <w:bookmarkEnd w:id="75"/>
-    <w:bookmarkStart w:id="78" w:name="X0916ed51d9250e775030e1b001c35a5a994eda1"/>
-    <w:p>
-      <w:pPr>
-        <w:pStyle w:val="Heading3"/>
-      </w:pPr>
-      <w:r>
-        <w:t xml:space="preserve">Speculation Rules / Speculative Loading (WordPress 6.8)</w:t>
-      </w:r>
-    </w:p>
-    <w:p>
-      <w:pPr>
-        <w:pStyle w:val="FirstParagraph"/>
-      </w:pPr>
-      <w:r>
-        <w:t xml:space="preserve">WordPress 6.8 (April 2025) merged speculative-loading support into Core via the</w:t>
-      </w:r>
-      <w:r>
-        <w:t xml:space="preserve"> </w:t>
-      </w:r>
       <w:hyperlink r:id="rId76">
         <w:r>
           <w:rPr>
             <w:rStyle w:val="Hyperlink"/>
           </w:rPr>
-          <w:t xml:space="preserve">Speculation Rules API</w:t>
+          <w:t xml:space="preserve">New option functions in 6.4 (Make WP Core)</w:t>
         </w:r>
       </w:hyperlink>
-      <w:r>
-        <w:t xml:space="preserve">. Core’s effective default is</w:t>
-      </w:r>
-      <w:r>
-        <w:t xml:space="preserve"> </w:t>
-      </w:r>
-      <w:r>
-        <w:rPr>
-          <w:rStyle w:val="VerbatimChar"/>
-          <w:b/>
-          <w:bCs/>
-        </w:rPr>
-        <w:t xml:space="preserve">prefetch</w:t>
-      </w:r>
-      <w:r>
-        <w:t xml:space="preserve"> </w:t>
-      </w:r>
-      <w:r>
-        <w:t xml:space="preserve">with</w:t>
-      </w:r>
-      <w:r>
-        <w:t xml:space="preserve"> </w:t>
-      </w:r>
-      <w:r>
-        <w:rPr>
-          <w:rStyle w:val="VerbatimChar"/>
-          <w:b/>
-          <w:bCs/>
-        </w:rPr>
-        <w:t xml:space="preserve">conservative</w:t>
-      </w:r>
-      <w:r>
-        <w:t xml:space="preserve"> </w:t>
-      </w:r>
-      <w:r>
-        <w:t xml:space="preserve">eagerness, enabled on frontend requests only when pretty permalinks are on and the user is logged out. Core does not ship a dedicated settings UI for speculation rules in 6.8; customization happens through filters such as</w:t>
-      </w:r>
-      <w:r>
-        <w:t xml:space="preserve"> </w:t>
-      </w:r>
-      <w:r>
-        <w:rPr>
-          <w:rStyle w:val="VerbatimChar"/>
-        </w:rPr>
-        <w:t xml:space="preserve">wp_speculation_rules_configuration</w:t>
-      </w:r>
-      <w:r>
-        <w:t xml:space="preserve"> </w:t>
-      </w:r>
-      <w:r>
-        <w:t xml:space="preserve">and</w:t>
-      </w:r>
-      <w:r>
-        <w:t xml:space="preserve"> </w:t>
-      </w:r>
-      <w:r>
-        <w:rPr>
-          <w:rStyle w:val="VerbatimChar"/>
-        </w:rPr>
-        <w:t xml:space="preserve">wp_load_speculation_rules</w:t>
-      </w:r>
-      <w:r>
-        <w:t xml:space="preserve">, plus block-level CSS classes like</w:t>
-      </w:r>
-      <w:r>
-        <w:t xml:space="preserve"> </w:t>
-      </w:r>
-      <w:r>
-        <w:rPr>
-          <w:rStyle w:val="VerbatimChar"/>
-        </w:rPr>
-        <w:t xml:space="preserve">no-prefetch</w:t>
-      </w:r>
-      <w:r>
-        <w:t xml:space="preserve"> </w:t>
-      </w:r>
-      <w:r>
-        <w:t xml:space="preserve">and</w:t>
-      </w:r>
-      <w:r>
-        <w:t xml:space="preserve"> </w:t>
-      </w:r>
-      <w:r>
-        <w:rPr>
-          <w:rStyle w:val="VerbatimChar"/>
-        </w:rPr>
-        <w:t xml:space="preserve">no-prerender</w:t>
-      </w:r>
-      <w:r>
-        <w:t xml:space="preserve">.</w:t>
-      </w:r>
-    </w:p>
-    <w:p>
-      <w:pPr>
-        <w:pStyle w:val="BodyText"/>
-      </w:pPr>
-      <w:r>
-        <w:t xml:space="preserve">The standalone</w:t>
-      </w:r>
-      <w:r>
-        <w:t xml:space="preserve"> </w:t>
-      </w:r>
+    </w:p>
+    <w:p>
+      <w:pPr>
+        <w:pStyle w:val="Compact"/>
+        <w:numPr>
+          <w:ilvl w:val="0"/>
+          <w:numId w:val="1054"/>
+        </w:numPr>
+      </w:pPr>
       <w:hyperlink r:id="rId77">
         <w:r>
           <w:rPr>
             <w:rStyle w:val="Hyperlink"/>
           </w:rPr>
-          <w:t xml:space="preserve">Speculative Loading plugin</w:t>
+          <w:t xml:space="preserve">WordPress 6.6 Performance Improvements</w:t>
         </w:r>
       </w:hyperlink>
-      <w:r>
-        <w:t xml:space="preserve"> </w:t>
-      </w:r>
-      <w:r>
-        <w:t xml:space="preserve">extends Core with a plugin-provided admin screen and more aggressive modes, including</w:t>
-      </w:r>
-      <w:r>
-        <w:t xml:space="preserve"> </w:t>
-      </w:r>
-      <w:r>
-        <w:rPr>
-          <w:rStyle w:val="VerbatimChar"/>
-        </w:rPr>
-        <w:t xml:space="preserve">prerender</w:t>
-      </w:r>
-      <w:r>
-        <w:t xml:space="preserve">. When you opt into prerender, audit analytics SDKs for prerender-aware behavior and confirm that prerendered visits do not double-count or fire third-party scripts on hidden documents.</w:t>
-      </w:r>
-    </w:p>
-    <w:p>
-      <w:pPr>
-        <w:pStyle w:val="BodyText"/>
-      </w:pPr>
-      <w:r>
-        <w:t xml:space="preserve">Enterprise considerations: edge cache hit ratio can rise on sites with predictable navigation patterns because prefetches may hit cache before the eventual navigation. Confirm session-keyed and personalized pages are excluded from speculative loading with Core filters,</w:t>
-      </w:r>
-      <w:r>
-        <w:t xml:space="preserve"> </w:t>
-      </w:r>
-      <w:r>
-        <w:rPr>
-          <w:rStyle w:val="VerbatimChar"/>
-        </w:rPr>
-        <w:t xml:space="preserve">no-prefetch</w:t>
-      </w:r>
-      <w:r>
-        <w:t xml:space="preserve"> </w:t>
-      </w:r>
-      <w:r>
-        <w:t xml:space="preserve">/</w:t>
-      </w:r>
-      <w:r>
-        <w:t xml:space="preserve"> </w:t>
-      </w:r>
-      <w:r>
-        <w:rPr>
-          <w:rStyle w:val="VerbatimChar"/>
-        </w:rPr>
-        <w:t xml:space="preserve">no-prerender</w:t>
-      </w:r>
-      <w:r>
-        <w:t xml:space="preserve"> </w:t>
-      </w:r>
-      <w:r>
-        <w:t xml:space="preserve">classes, or plugin-provided exclusion controls. Do not use older</w:t>
-      </w:r>
-      <w:r>
-        <w:t xml:space="preserve"> </w:t>
-      </w:r>
-      <w:r>
-        <w:rPr>
-          <w:rStyle w:val="VerbatimChar"/>
-        </w:rPr>
-        <w:t xml:space="preserve">data-prefetch="false"</w:t>
-      </w:r>
-      <w:r>
-        <w:t xml:space="preserve"> </w:t>
-      </w:r>
-      <w:r>
-        <w:t xml:space="preserve">wording as the recommended Core opt-out mechanism.</w:t>
-      </w:r>
-    </w:p>
-    <w:bookmarkEnd w:id="78"/>
-    <w:bookmarkStart w:id="81" w:name="wordpress-6.9-performance-deltas"/>
-    <w:p>
-      <w:pPr>
-        <w:pStyle w:val="Heading3"/>
-      </w:pPr>
-      <w:r>
-        <w:t xml:space="preserve">WordPress 6.9 performance deltas</w:t>
-      </w:r>
-    </w:p>
-    <w:p>
-      <w:pPr>
-        <w:pStyle w:val="FirstParagraph"/>
-      </w:pPr>
-      <w:r>
-        <w:t xml:space="preserve">WordPress 6.9 shipped in November 2025; WordPress 6.9.4 was the current patch release verified on 2026-05-18. The most material 6.9 performance changes for this guide are:</w:t>
-      </w:r>
-    </w:p>
-    <w:p>
-      <w:pPr>
-        <w:pStyle w:val="Compact"/>
-        <w:numPr>
-          <w:ilvl w:val="0"/>
-          <w:numId w:val="1055"/>
-        </w:numPr>
-      </w:pPr>
-      <w:r>
-        <w:rPr>
-          <w:b/>
-          <w:bCs/>
-        </w:rPr>
-        <w:t xml:space="preserve">Frontend loading:</w:t>
-      </w:r>
-      <w:r>
-        <w:t xml:space="preserve"> </w:t>
-      </w:r>
-      <w:r>
-        <w:t xml:space="preserve">the</w:t>
-      </w:r>
-      <w:r>
-        <w:t xml:space="preserve"> </w:t>
-      </w:r>
+    </w:p>
+    <w:p>
+      <w:pPr>
+        <w:pStyle w:val="Compact"/>
+        <w:numPr>
+          <w:ilvl w:val="0"/>
+          <w:numId w:val="1054"/>
+        </w:numPr>
+      </w:pPr>
+      <w:hyperlink r:id="rId78">
+        <w:r>
+          <w:rPr>
+            <w:rStyle w:val="Hyperlink"/>
+          </w:rPr>
+          <w:t xml:space="preserve">Speculative Loading in 6.8</w:t>
+        </w:r>
+      </w:hyperlink>
+    </w:p>
+    <w:p>
+      <w:pPr>
+        <w:pStyle w:val="Compact"/>
+        <w:numPr>
+          <w:ilvl w:val="0"/>
+          <w:numId w:val="1054"/>
+        </w:numPr>
+      </w:pPr>
       <w:hyperlink r:id="rId79">
+        <w:r>
+          <w:rPr>
+            <w:rStyle w:val="Hyperlink"/>
+          </w:rPr>
+          <w:t xml:space="preserve">WordPress 6.8 Performance Improvements</w:t>
+        </w:r>
+      </w:hyperlink>
+    </w:p>
+    <w:p>
+      <w:pPr>
+        <w:pStyle w:val="Compact"/>
+        <w:numPr>
+          <w:ilvl w:val="0"/>
+          <w:numId w:val="1054"/>
+        </w:numPr>
+      </w:pPr>
+      <w:hyperlink r:id="rId80">
         <w:r>
           <w:rPr>
             <w:rStyle w:val="Hyperlink"/>
@@ -12199,72 +11692,16 @@
           <w:t xml:space="preserve">WordPress 6.9 Frontend Performance Field Guide</w:t>
         </w:r>
       </w:hyperlink>
-      <w:r>
-        <w:t xml:space="preserve"> </w:t>
-      </w:r>
-      <w:r>
-        <w:t xml:space="preserve">covers script</w:t>
-      </w:r>
-      <w:r>
-        <w:t xml:space="preserve"> </w:t>
-      </w:r>
-      <w:r>
-        <w:rPr>
-          <w:rStyle w:val="VerbatimChar"/>
-        </w:rPr>
-        <w:t xml:space="preserve">fetchpriority</w:t>
-      </w:r>
-      <w:r>
-        <w:t xml:space="preserve">, footer script-module printing, emoji script-module changes, block stylesheet handling, hidden-block asset omission, template enhancement output buffering, RSS feed caching, video block CLS fixes, and related frontend work.</w:t>
-      </w:r>
-    </w:p>
-    <w:p>
-      <w:pPr>
-        <w:pStyle w:val="Compact"/>
-        <w:numPr>
-          <w:ilvl w:val="0"/>
-          <w:numId w:val="1055"/>
-        </w:numPr>
-      </w:pPr>
-      <w:r>
-        <w:rPr>
-          <w:b/>
-          <w:bCs/>
-        </w:rPr>
-        <w:t xml:space="preserve">WP-Cron spawn timing:</w:t>
-      </w:r>
-      <w:r>
-        <w:t xml:space="preserve"> </w:t>
-      </w:r>
-      <w:r>
-        <w:t xml:space="preserve">Core now spawns WP-Cron at shutdown rather than earlier in the request lifecycle, reducing user-facing latency for request-triggered cron. Sites with a verified external cron runner remain the preferred high-traffic pattern.</w:t>
-      </w:r>
-    </w:p>
-    <w:p>
-      <w:pPr>
-        <w:pStyle w:val="Compact"/>
-        <w:numPr>
-          <w:ilvl w:val="0"/>
-          <w:numId w:val="1055"/>
-        </w:numPr>
-      </w:pPr>
-      <w:r>
-        <w:rPr>
-          <w:b/>
-          <w:bCs/>
-        </w:rPr>
-        <w:t xml:space="preserve">Query/cache changes:</w:t>
-      </w:r>
-      <w:r>
-        <w:t xml:space="preserve"> </w:t>
-      </w:r>
-      <w:r>
-        <w:t xml:space="preserve">the</w:t>
-      </w:r>
-      <w:r>
-        <w:t xml:space="preserve"> </w:t>
-      </w:r>
-      <w:hyperlink r:id="rId80">
+    </w:p>
+    <w:p>
+      <w:pPr>
+        <w:pStyle w:val="Compact"/>
+        <w:numPr>
+          <w:ilvl w:val="0"/>
+          <w:numId w:val="1054"/>
+        </w:numPr>
+      </w:pPr>
+      <w:hyperlink r:id="rId81">
         <w:r>
           <w:rPr>
             <w:rStyle w:val="Hyperlink"/>
@@ -12272,686 +11709,55 @@
           <w:t xml:space="preserve">WordPress 6.9 Field Guide</w:t>
         </w:r>
       </w:hyperlink>
-      <w:r>
-        <w:t xml:space="preserve"> </w:t>
-      </w:r>
-      <w:r>
-        <w:t xml:space="preserve">should be checked before relying on plugin code that assumes older query-cache key behavior or intercepts Core caching internals.</w:t>
-      </w:r>
-    </w:p>
-    <w:p>
-      <w:pPr>
-        <w:pStyle w:val="FirstParagraph"/>
-      </w:pPr>
-      <w:r>
-        <w:t xml:space="preserve">Treat this as a delta inventory, not a substitute for measurement: verify impact on the specific site with the same baseline and rollback discipline used elsewhere in this guide.</w:t>
-      </w:r>
-    </w:p>
-    <w:bookmarkEnd w:id="81"/>
-    <w:bookmarkStart w:id="82" w:name="fetchpriority-on-lcp-image-wordpress-6.3"/>
-    <w:p>
-      <w:pPr>
-        <w:pStyle w:val="Heading3"/>
-      </w:pPr>
-      <w:r>
-        <w:rPr>
-          <w:rStyle w:val="VerbatimChar"/>
-        </w:rPr>
-        <w:t xml:space="preserve">fetchpriority</w:t>
-      </w:r>
-      <w:r>
-        <w:t xml:space="preserve"> </w:t>
-      </w:r>
-      <w:r>
-        <w:t xml:space="preserve">on LCP image (WordPress 6.3+)</w:t>
-      </w:r>
-    </w:p>
-    <w:p>
-      <w:pPr>
-        <w:pStyle w:val="FirstParagraph"/>
-      </w:pPr>
-      <w:r>
-        <w:t xml:space="preserve">Core now sets</w:t>
-      </w:r>
-      <w:r>
-        <w:t xml:space="preserve"> </w:t>
-      </w:r>
-      <w:r>
-        <w:rPr>
-          <w:rStyle w:val="VerbatimChar"/>
-        </w:rPr>
-        <w:t xml:space="preserve">fetchpriority="high"</w:t>
-      </w:r>
-      <w:r>
-        <w:t xml:space="preserve"> </w:t>
-      </w:r>
-      <w:r>
-        <w:t xml:space="preserve">on the detected LCP image automatically. At enterprise scale this affects how the platform should advise on hero-image preload patterns:</w:t>
-      </w:r>
-    </w:p>
-    <w:p>
-      <w:pPr>
-        <w:pStyle w:val="Compact"/>
-        <w:numPr>
-          <w:ilvl w:val="0"/>
-          <w:numId w:val="1056"/>
-        </w:numPr>
-      </w:pPr>
-      <w:r>
-        <w:t xml:space="preserve">[ ] Audit any platform-level theme/plugin that emits</w:t>
-      </w:r>
-      <w:r>
-        <w:t xml:space="preserve"> </w:t>
-      </w:r>
-      <w:r>
-        <w:rPr>
-          <w:rStyle w:val="VerbatimChar"/>
-        </w:rPr>
-        <w:t xml:space="preserve">&lt;link rel="preload" as="image"&gt;</w:t>
-      </w:r>
-      <w:r>
-        <w:t xml:space="preserve"> </w:t>
-      </w:r>
-      <w:r>
-        <w:t xml:space="preserve">for hero images — it may now be redundant or, worse, may compete with Core’s</w:t>
-      </w:r>
-      <w:r>
-        <w:t xml:space="preserve"> </w:t>
-      </w:r>
-      <w:r>
-        <w:rPr>
-          <w:rStyle w:val="VerbatimChar"/>
-        </w:rPr>
-        <w:t xml:space="preserve">fetchpriority</w:t>
-      </w:r>
-      <w:r>
-        <w:t xml:space="preserve"> </w:t>
-      </w:r>
-      <w:r>
-        <w:t xml:space="preserve">heuristic by preloading a different candidate.</w:t>
-      </w:r>
-    </w:p>
-    <w:p>
-      <w:pPr>
-        <w:pStyle w:val="Compact"/>
-        <w:numPr>
-          <w:ilvl w:val="0"/>
-          <w:numId w:val="1056"/>
-        </w:numPr>
-      </w:pPr>
-      <w:r>
-        <w:t xml:space="preserve">[ ] Confirm AMP / Block Theme combinations correctly identify the LCP candidate after 6.3.</w:t>
-      </w:r>
-    </w:p>
-    <w:bookmarkEnd w:id="82"/>
-    <w:bookmarkStart w:id="84" w:name="performance-lab-plugin"/>
-    <w:p>
-      <w:pPr>
-        <w:pStyle w:val="Heading3"/>
-      </w:pPr>
-      <w:r>
-        <w:t xml:space="preserve">Performance Lab plugin</w:t>
-      </w:r>
-    </w:p>
-    <w:p>
-      <w:pPr>
-        <w:pStyle w:val="FirstParagraph"/>
+    </w:p>
+    <w:p>
+      <w:pPr>
+        <w:pStyle w:val="Compact"/>
+        <w:numPr>
+          <w:ilvl w:val="0"/>
+          <w:numId w:val="1054"/>
+        </w:numPr>
+      </w:pPr>
+      <w:hyperlink r:id="rId82">
+        <w:r>
+          <w:rPr>
+            <w:rStyle w:val="Hyperlink"/>
+          </w:rPr>
+          <w:t xml:space="preserve">WordPress 7.0 Field Guide</w:t>
+        </w:r>
+      </w:hyperlink>
+    </w:p>
+    <w:p>
+      <w:pPr>
+        <w:pStyle w:val="Compact"/>
+        <w:numPr>
+          <w:ilvl w:val="0"/>
+          <w:numId w:val="1054"/>
+        </w:numPr>
       </w:pPr>
       <w:hyperlink r:id="rId83">
         <w:r>
           <w:rPr>
             <w:rStyle w:val="Hyperlink"/>
           </w:rPr>
-          <w:t xml:space="preserve">Performance Lab</w:t>
+          <w:t xml:space="preserve">Dropping support for PHP 7.2 and 7.3</w:t>
         </w:r>
       </w:hyperlink>
-      <w:r>
-        <w:t xml:space="preserve"> </w:t>
-      </w:r>
-      <w:r>
-        <w:t xml:space="preserve">is the Core team’s feature-plugin discovery and management layer. As features mature inside the Performance Lab ecosystem they either graduate into Core or remain as standalone plugins; the catalog rotates over time. Verify the current featured plugins on the Performance Lab plugin page before recommending any specific module.</w:t>
-      </w:r>
-    </w:p>
-    <w:p>
-      <w:pPr>
-        <w:pStyle w:val="BodyText"/>
-      </w:pPr>
-      <w:r>
-        <w:t xml:space="preserve">Featured plugins as of 2026-05-18 include:</w:t>
-      </w:r>
-    </w:p>
-    <w:p>
-      <w:pPr>
-        <w:pStyle w:val="Compact"/>
-        <w:numPr>
-          <w:ilvl w:val="0"/>
-          <w:numId w:val="1057"/>
-        </w:numPr>
-      </w:pPr>
-      <w:r>
-        <w:rPr>
-          <w:b/>
-          <w:bCs/>
-        </w:rPr>
-        <w:t xml:space="preserve">Embed Optimizer</w:t>
-      </w:r>
-      <w:r>
-        <w:t xml:space="preserve"> </w:t>
-      </w:r>
-      <w:r>
-        <w:t xml:space="preserve">— improves embeds that otherwise add third-party request and rendering cost.</w:t>
-      </w:r>
-    </w:p>
-    <w:p>
-      <w:pPr>
-        <w:pStyle w:val="Compact"/>
-        <w:numPr>
-          <w:ilvl w:val="0"/>
-          <w:numId w:val="1057"/>
-        </w:numPr>
-      </w:pPr>
-      <w:r>
-        <w:rPr>
-          <w:b/>
-          <w:bCs/>
-        </w:rPr>
-        <w:t xml:space="preserve">Enhanced Responsive Images</w:t>
-      </w:r>
-      <w:r>
-        <w:t xml:space="preserve"> </w:t>
-      </w:r>
-      <w:r>
-        <w:t xml:space="preserve">— refines responsive image sizing decisions, including lazy-loaded images.</w:t>
-      </w:r>
-    </w:p>
-    <w:p>
-      <w:pPr>
-        <w:pStyle w:val="Compact"/>
-        <w:numPr>
-          <w:ilvl w:val="0"/>
-          <w:numId w:val="1057"/>
-        </w:numPr>
-      </w:pPr>
-      <w:r>
-        <w:rPr>
-          <w:b/>
-          <w:bCs/>
-        </w:rPr>
-        <w:t xml:space="preserve">Image Placeholders</w:t>
-      </w:r>
-      <w:r>
-        <w:t xml:space="preserve"> </w:t>
-      </w:r>
-      <w:r>
-        <w:t xml:space="preserve">— formerly Dominant Color Images; uses a CSS background placeholder while an image loads.</w:t>
-      </w:r>
-    </w:p>
-    <w:p>
-      <w:pPr>
-        <w:pStyle w:val="Compact"/>
-        <w:numPr>
-          <w:ilvl w:val="0"/>
-          <w:numId w:val="1057"/>
-        </w:numPr>
-      </w:pPr>
-      <w:r>
-        <w:rPr>
-          <w:b/>
-          <w:bCs/>
-        </w:rPr>
-        <w:t xml:space="preserve">Image Prioritizer</w:t>
-      </w:r>
-      <w:r>
-        <w:t xml:space="preserve"> </w:t>
-      </w:r>
-      <w:r>
-        <w:t xml:space="preserve">— automates</w:t>
-      </w:r>
-      <w:r>
-        <w:t xml:space="preserve"> </w:t>
-      </w:r>
-      <w:r>
-        <w:rPr>
-          <w:rStyle w:val="VerbatimChar"/>
-        </w:rPr>
-        <w:t xml:space="preserve">fetchpriority</w:t>
-      </w:r>
-      <w:r>
-        <w:t xml:space="preserve"> </w:t>
-      </w:r>
-      <w:r>
-        <w:t xml:space="preserve">and related loading decisions for likely LCP candidates.</w:t>
-      </w:r>
-    </w:p>
-    <w:p>
-      <w:pPr>
-        <w:pStyle w:val="Compact"/>
-        <w:numPr>
-          <w:ilvl w:val="0"/>
-          <w:numId w:val="1057"/>
-        </w:numPr>
-      </w:pPr>
-      <w:r>
-        <w:rPr>
-          <w:b/>
-          <w:bCs/>
-        </w:rPr>
-        <w:t xml:space="preserve">Instant Back/Forward</w:t>
-      </w:r>
-      <w:r>
-        <w:t xml:space="preserve"> </w:t>
-      </w:r>
-      <w:r>
-        <w:t xml:space="preserve">— improves browser back/forward-cache behavior where applicable.</w:t>
-      </w:r>
-    </w:p>
-    <w:p>
-      <w:pPr>
-        <w:pStyle w:val="Compact"/>
-        <w:numPr>
-          <w:ilvl w:val="0"/>
-          <w:numId w:val="1057"/>
-        </w:numPr>
-      </w:pPr>
-      <w:r>
-        <w:rPr>
-          <w:b/>
-          <w:bCs/>
-        </w:rPr>
-        <w:t xml:space="preserve">Modern Image Formats</w:t>
-      </w:r>
-      <w:r>
-        <w:t xml:space="preserve"> </w:t>
-      </w:r>
-      <w:r>
-        <w:t xml:space="preserve">— formerly named for WebP uploads; stores additional WebP/AVIF versions of uploaded images and serves modern formats to supporting browsers.</w:t>
-      </w:r>
-    </w:p>
-    <w:p>
-      <w:pPr>
-        <w:pStyle w:val="Compact"/>
-        <w:numPr>
-          <w:ilvl w:val="0"/>
-          <w:numId w:val="1057"/>
-        </w:numPr>
-      </w:pPr>
-      <w:r>
-        <w:rPr>
-          <w:b/>
-          <w:bCs/>
-        </w:rPr>
-        <w:t xml:space="preserve">Optimization Detective</w:t>
-      </w:r>
-      <w:r>
-        <w:t xml:space="preserve"> </w:t>
-      </w:r>
-      <w:r>
-        <w:t xml:space="preserve">— opt-in real-user measurement that informs Core/Performance Lab decisions; dependency for some other featured plugins.</w:t>
-      </w:r>
-    </w:p>
-    <w:p>
-      <w:pPr>
-        <w:pStyle w:val="Compact"/>
-        <w:numPr>
-          <w:ilvl w:val="0"/>
-          <w:numId w:val="1057"/>
-        </w:numPr>
-      </w:pPr>
-      <w:r>
-        <w:rPr>
-          <w:b/>
-          <w:bCs/>
-        </w:rPr>
-        <w:t xml:space="preserve">Performant Translations</w:t>
-      </w:r>
-      <w:r>
-        <w:t xml:space="preserve">,</w:t>
-      </w:r>
-      <w:r>
-        <w:t xml:space="preserve"> </w:t>
-      </w:r>
-      <w:r>
-        <w:rPr>
-          <w:b/>
-          <w:bCs/>
-        </w:rPr>
-        <w:t xml:space="preserve">Speculative Loading</w:t>
-      </w:r>
-      <w:r>
-        <w:t xml:space="preserve">, and</w:t>
-      </w:r>
-      <w:r>
-        <w:t xml:space="preserve"> </w:t>
-      </w:r>
-      <w:r>
-        <w:rPr>
-          <w:b/>
-          <w:bCs/>
-        </w:rPr>
-        <w:t xml:space="preserve">View Transitions</w:t>
-      </w:r>
-      <w:r>
-        <w:t xml:space="preserve"> </w:t>
-      </w:r>
-      <w:r>
-        <w:t xml:space="preserve">— additional featured plugins whose relevance depends on the site and rollout risk.</w:t>
-      </w:r>
-    </w:p>
-    <w:p>
-      <w:pPr>
-        <w:pStyle w:val="FirstParagraph"/>
-      </w:pPr>
-      <w:r>
-        <w:t xml:space="preserve">Recommendation: evaluate Performance Lab on staging, look at the current Featured Plugins list at the verification time, and adopt specific plugins by name only when they match the site’s documented performance need.</w:t>
-      </w:r>
-    </w:p>
-    <w:bookmarkEnd w:id="84"/>
-    <w:bookmarkStart w:id="85" w:name="X272861d0d2d8708b0ae9043c57ce40fee4abb08"/>
-    <w:p>
-      <w:pPr>
-        <w:pStyle w:val="Heading3"/>
-      </w:pPr>
-      <w:r>
-        <w:t xml:space="preserve">Core Web Vitals: INP replaced FID (March 2024)</w:t>
-      </w:r>
-    </w:p>
-    <w:p>
-      <w:pPr>
-        <w:pStyle w:val="FirstParagraph"/>
-      </w:pPr>
-      <w:r>
-        <w:t xml:space="preserve">INP is now the responsiveness metric of record, replacing FID. Thresholds at the 75th percentile across real users:</w:t>
-      </w:r>
-    </w:p>
-    <w:tbl>
-      <w:tblPr>
-        <w:tblStyle w:val="Table"/>
-        <w:tblW w:type="auto" w:w="0"/>
-        <w:tblLook w:firstRow="1" w:lastRow="0" w:firstColumn="0" w:lastColumn="0" w:noHBand="0" w:noVBand="0" w:val="0020"/>
-      </w:tblPr>
-      <w:tblGrid>
-        <w:gridCol w:w="1980"/>
-        <w:gridCol w:w="1980"/>
-        <w:gridCol w:w="1980"/>
-        <w:gridCol w:w="1980"/>
-      </w:tblGrid>
-      <w:tr>
-        <w:trPr>
-          <w:tblHeader w:val="on"/>
-        </w:trPr>
-        <w:tc>
-          <w:tcPr/>
-          <w:p>
-            <w:pPr>
-              <w:pStyle w:val="Compact"/>
-            </w:pPr>
-            <w:r>
-              <w:t xml:space="preserve">Metric</w:t>
-            </w:r>
-          </w:p>
-        </w:tc>
-        <w:tc>
-          <w:tcPr/>
-          <w:p>
-            <w:pPr>
-              <w:pStyle w:val="Compact"/>
-              <w:jc w:val="right"/>
-            </w:pPr>
-            <w:r>
-              <w:t xml:space="preserve">Good</w:t>
-            </w:r>
-          </w:p>
-        </w:tc>
-        <w:tc>
-          <w:tcPr/>
-          <w:p>
-            <w:pPr>
-              <w:pStyle w:val="Compact"/>
-              <w:jc w:val="right"/>
-            </w:pPr>
-            <w:r>
-              <w:t xml:space="preserve">Needs improvement</w:t>
-            </w:r>
-          </w:p>
-        </w:tc>
-        <w:tc>
-          <w:tcPr/>
-          <w:p>
-            <w:pPr>
-              <w:pStyle w:val="Compact"/>
-              <w:jc w:val="right"/>
-            </w:pPr>
-            <w:r>
-              <w:t xml:space="preserve">Poor</w:t>
-            </w:r>
-          </w:p>
-        </w:tc>
-      </w:tr>
-      <w:tr>
-        <w:tc>
-          <w:tcPr/>
-          <w:p>
-            <w:pPr>
-              <w:pStyle w:val="Compact"/>
-            </w:pPr>
-            <w:r>
-              <w:t xml:space="preserve">LCP</w:t>
-            </w:r>
-          </w:p>
-        </w:tc>
-        <w:tc>
-          <w:tcPr/>
-          <w:p>
-            <w:pPr>
-              <w:pStyle w:val="Compact"/>
-              <w:jc w:val="right"/>
-            </w:pPr>
-            <w:r>
-              <w:t xml:space="preserve">&lt;= 2.5 s</w:t>
-            </w:r>
-          </w:p>
-        </w:tc>
-        <w:tc>
-          <w:tcPr/>
-          <w:p>
-            <w:pPr>
-              <w:pStyle w:val="Compact"/>
-              <w:jc w:val="right"/>
-            </w:pPr>
-            <w:r>
-              <w:t xml:space="preserve">2.5–4.0 s</w:t>
-            </w:r>
-          </w:p>
-        </w:tc>
-        <w:tc>
-          <w:tcPr/>
-          <w:p>
-            <w:pPr>
-              <w:pStyle w:val="Compact"/>
-              <w:jc w:val="right"/>
-            </w:pPr>
-            <w:r>
-              <w:t xml:space="preserve">&gt; 4.0 s</w:t>
-            </w:r>
-          </w:p>
-        </w:tc>
-      </w:tr>
-      <w:tr>
-        <w:tc>
-          <w:tcPr/>
-          <w:p>
-            <w:pPr>
-              <w:pStyle w:val="Compact"/>
-            </w:pPr>
-            <w:r>
-              <w:t xml:space="preserve">INP</w:t>
-            </w:r>
-          </w:p>
-        </w:tc>
-        <w:tc>
-          <w:tcPr/>
-          <w:p>
-            <w:pPr>
-              <w:pStyle w:val="Compact"/>
-              <w:jc w:val="right"/>
-            </w:pPr>
-            <w:r>
-              <w:t xml:space="preserve">&lt;= 200 ms</w:t>
-            </w:r>
-          </w:p>
-        </w:tc>
-        <w:tc>
-          <w:tcPr/>
-          <w:p>
-            <w:pPr>
-              <w:pStyle w:val="Compact"/>
-              <w:jc w:val="right"/>
-            </w:pPr>
-            <w:r>
-              <w:t xml:space="preserve">200–500 ms</w:t>
-            </w:r>
-          </w:p>
-        </w:tc>
-        <w:tc>
-          <w:tcPr/>
-          <w:p>
-            <w:pPr>
-              <w:pStyle w:val="Compact"/>
-              <w:jc w:val="right"/>
-            </w:pPr>
-            <w:r>
-              <w:t xml:space="preserve">&gt; 500 ms</w:t>
-            </w:r>
-          </w:p>
-        </w:tc>
-      </w:tr>
-      <w:tr>
-        <w:tc>
-          <w:tcPr/>
-          <w:p>
-            <w:pPr>
-              <w:pStyle w:val="Compact"/>
-            </w:pPr>
-            <w:r>
-              <w:t xml:space="preserve">CLS</w:t>
-            </w:r>
-          </w:p>
-        </w:tc>
-        <w:tc>
-          <w:tcPr/>
-          <w:p>
-            <w:pPr>
-              <w:pStyle w:val="Compact"/>
-              <w:jc w:val="right"/>
-            </w:pPr>
-            <w:r>
-              <w:t xml:space="preserve">&lt;= 0.1</w:t>
-            </w:r>
-          </w:p>
-        </w:tc>
-        <w:tc>
-          <w:tcPr/>
-          <w:p>
-            <w:pPr>
-              <w:pStyle w:val="Compact"/>
-              <w:jc w:val="right"/>
-            </w:pPr>
-            <w:r>
-              <w:t xml:space="preserve">0.1–0.25</w:t>
-            </w:r>
-          </w:p>
-        </w:tc>
-        <w:tc>
-          <w:tcPr/>
-          <w:p>
-            <w:pPr>
-              <w:pStyle w:val="Compact"/>
-              <w:jc w:val="right"/>
-            </w:pPr>
-            <w:r>
-              <w:t xml:space="preserve">&gt; 0.25</w:t>
-            </w:r>
-          </w:p>
-        </w:tc>
-      </w:tr>
-    </w:tbl>
-    <w:p>
-      <w:pPr>
-        <w:pStyle w:val="BodyText"/>
-      </w:pPr>
-      <w:r>
-        <w:t xml:space="preserve">Enterprise platform reporting should retire FID dashboards and ensure RUM SDKs report INP. INP is more sensitive to JavaScript main-thread work than FID was, so customer-success conversations about “suddenly worse mobile” often trace to long-running scripts that FID would not have penalized.</w:t>
-      </w:r>
-    </w:p>
-    <w:bookmarkEnd w:id="85"/>
-    <w:bookmarkStart w:id="86" w:name="editorial-correction-to-source-lesson"/>
-    <w:p>
-      <w:pPr>
-        <w:pStyle w:val="Heading3"/>
-      </w:pPr>
-      <w:r>
-        <w:t xml:space="preserve">Editorial correction to source lesson</w:t>
-      </w:r>
-    </w:p>
-    <w:p>
-      <w:pPr>
-        <w:pStyle w:val="FirstParagraph"/>
-      </w:pPr>
-      <w:r>
-        <w:t xml:space="preserve">WP VIP Learn lesson 34 (WP Cron) shows the cron URL as</w:t>
-      </w:r>
-      <w:r>
-        <w:t xml:space="preserve"> </w:t>
-      </w:r>
-      <w:r>
-        <w:rPr>
-          <w:rStyle w:val="VerbatimChar"/>
-        </w:rPr>
-        <w:t xml:space="preserve">http://yourdomain.com/wp-cron.php?doing_wp_cron</w:t>
-      </w:r>
-      <w:r>
-        <w:t xml:space="preserve">. That is insecure for any modern production site — credentials, cookies, and the WP-Cron token would travel in cleartext. Use</w:t>
-      </w:r>
-      <w:r>
-        <w:t xml:space="preserve"> </w:t>
-      </w:r>
-      <w:r>
-        <w:rPr>
-          <w:rStyle w:val="VerbatimChar"/>
-        </w:rPr>
-        <w:t xml:space="preserve">https://</w:t>
-      </w:r>
-      <w:r>
-        <w:t xml:space="preserve"> </w:t>
-      </w:r>
-      <w:r>
-        <w:t xml:space="preserve">matching the site’s canonical scheme. (This operational checklist at §15 already uses HTTPS.)</w:t>
-      </w:r>
-    </w:p>
-    <w:bookmarkEnd w:id="86"/>
-    <w:bookmarkStart w:id="94" w:name="references"/>
-    <w:p>
-      <w:pPr>
-        <w:pStyle w:val="Heading3"/>
-      </w:pPr>
-      <w:r>
-        <w:t xml:space="preserve">References</w:t>
-      </w:r>
-    </w:p>
-    <w:p>
-      <w:pPr>
-        <w:pStyle w:val="Compact"/>
-        <w:numPr>
-          <w:ilvl w:val="0"/>
-          <w:numId w:val="1058"/>
-        </w:numPr>
-      </w:pPr>
-      <w:hyperlink r:id="rId87">
+    </w:p>
+    <w:p>
+      <w:pPr>
+        <w:pStyle w:val="Compact"/>
+        <w:numPr>
+          <w:ilvl w:val="0"/>
+          <w:numId w:val="1054"/>
+        </w:numPr>
+      </w:pPr>
+      <w:hyperlink r:id="rId84">
         <w:r>
           <w:rPr>
             <w:rStyle w:val="Hyperlink"/>
           </w:rPr>
-          <w:t xml:space="preserve">Options API: Disabling autoload for large options (Make WP Core)</w:t>
+          <w:t xml:space="preserve">Real-time collaboration will not ship in WordPress 7.0</w:t>
         </w:r>
       </w:hyperlink>
     </w:p>
@@ -12960,15 +11766,15 @@
         <w:pStyle w:val="Compact"/>
         <w:numPr>
           <w:ilvl w:val="0"/>
-          <w:numId w:val="1058"/>
-        </w:numPr>
-      </w:pPr>
-      <w:hyperlink r:id="rId88">
+          <w:numId w:val="1054"/>
+        </w:numPr>
+      </w:pPr>
+      <w:hyperlink r:id="rId85">
         <w:r>
           <w:rPr>
             <w:rStyle w:val="Hyperlink"/>
           </w:rPr>
-          <w:t xml:space="preserve">New option functions in 6.4 (Make WP Core)</w:t>
+          <w:t xml:space="preserve">WordPress release archive</w:t>
         </w:r>
       </w:hyperlink>
     </w:p>
@@ -12977,61 +11783,10 @@
         <w:pStyle w:val="Compact"/>
         <w:numPr>
           <w:ilvl w:val="0"/>
-          <w:numId w:val="1058"/>
-        </w:numPr>
-      </w:pPr>
-      <w:hyperlink r:id="rId89">
-        <w:r>
-          <w:rPr>
-            <w:rStyle w:val="Hyperlink"/>
-          </w:rPr>
-          <w:t xml:space="preserve">WordPress 6.6 Performance Improvements</w:t>
-        </w:r>
-      </w:hyperlink>
-    </w:p>
-    <w:p>
-      <w:pPr>
-        <w:pStyle w:val="Compact"/>
-        <w:numPr>
-          <w:ilvl w:val="0"/>
-          <w:numId w:val="1058"/>
-        </w:numPr>
-      </w:pPr>
-      <w:hyperlink r:id="rId76">
-        <w:r>
-          <w:rPr>
-            <w:rStyle w:val="Hyperlink"/>
-          </w:rPr>
-          <w:t xml:space="preserve">Speculative Loading in 6.8</w:t>
-        </w:r>
-      </w:hyperlink>
-    </w:p>
-    <w:p>
-      <w:pPr>
-        <w:pStyle w:val="Compact"/>
-        <w:numPr>
-          <w:ilvl w:val="0"/>
-          <w:numId w:val="1058"/>
-        </w:numPr>
-      </w:pPr>
-      <w:hyperlink r:id="rId90">
-        <w:r>
-          <w:rPr>
-            <w:rStyle w:val="Hyperlink"/>
-          </w:rPr>
-          <w:t xml:space="preserve">WordPress 6.8 Performance Improvements</w:t>
-        </w:r>
-      </w:hyperlink>
-    </w:p>
-    <w:p>
-      <w:pPr>
-        <w:pStyle w:val="Compact"/>
-        <w:numPr>
-          <w:ilvl w:val="0"/>
-          <w:numId w:val="1058"/>
-        </w:numPr>
-      </w:pPr>
-      <w:hyperlink r:id="rId91">
+          <w:numId w:val="1054"/>
+        </w:numPr>
+      </w:pPr>
+      <w:hyperlink r:id="rId86">
         <w:r>
           <w:rPr>
             <w:rStyle w:val="VerbatimChar"/>
@@ -13045,10 +11800,10 @@
         <w:pStyle w:val="Compact"/>
         <w:numPr>
           <w:ilvl w:val="0"/>
-          <w:numId w:val="1058"/>
-        </w:numPr>
-      </w:pPr>
-      <w:hyperlink r:id="rId83">
+          <w:numId w:val="1054"/>
+        </w:numPr>
+      </w:pPr>
+      <w:hyperlink r:id="rId87">
         <w:r>
           <w:rPr>
             <w:rStyle w:val="Hyperlink"/>
@@ -13062,10 +11817,10 @@
         <w:pStyle w:val="Compact"/>
         <w:numPr>
           <w:ilvl w:val="0"/>
-          <w:numId w:val="1058"/>
-        </w:numPr>
-      </w:pPr>
-      <w:hyperlink r:id="rId92">
+          <w:numId w:val="1054"/>
+        </w:numPr>
+      </w:pPr>
+      <w:hyperlink r:id="rId88">
         <w:r>
           <w:rPr>
             <w:rStyle w:val="Hyperlink"/>
@@ -13079,10 +11834,10 @@
         <w:pStyle w:val="Compact"/>
         <w:numPr>
           <w:ilvl w:val="0"/>
-          <w:numId w:val="1058"/>
-        </w:numPr>
-      </w:pPr>
-      <w:hyperlink r:id="rId93">
+          <w:numId w:val="1054"/>
+        </w:numPr>
+      </w:pPr>
+      <w:hyperlink r:id="rId89">
         <w:r>
           <w:rPr>
             <w:rStyle w:val="Hyperlink"/>
@@ -13091,9 +11846,53 @@
         </w:r>
       </w:hyperlink>
     </w:p>
-    <w:bookmarkEnd w:id="94"/>
-    <w:bookmarkEnd w:id="95"/>
-    <w:bookmarkEnd w:id="96"/>
+    <w:bookmarkStart w:id="90" w:name="source-note"/>
+    <w:p>
+      <w:pPr>
+        <w:pStyle w:val="Heading3"/>
+      </w:pPr>
+      <w:r>
+        <w:t xml:space="preserve">Source note</w:t>
+      </w:r>
+    </w:p>
+    <w:p>
+      <w:pPr>
+        <w:pStyle w:val="FirstParagraph"/>
+      </w:pPr>
+      <w:r>
+        <w:t xml:space="preserve">One WP VIP Learn WP-Cron lesson shows the cron URL as</w:t>
+      </w:r>
+      <w:r>
+        <w:t xml:space="preserve"> </w:t>
+      </w:r>
+      <w:r>
+        <w:rPr>
+          <w:rStyle w:val="VerbatimChar"/>
+        </w:rPr>
+        <w:t xml:space="preserve">http://yourdomain.com/wp-cron.php?doing_wp_cron</w:t>
+      </w:r>
+      <w:r>
+        <w:t xml:space="preserve">. That is insecure for any modern production site — credentials, cookies, and the WP-Cron token would travel in cleartext. Use</w:t>
+      </w:r>
+      <w:r>
+        <w:t xml:space="preserve"> </w:t>
+      </w:r>
+      <w:r>
+        <w:rPr>
+          <w:rStyle w:val="VerbatimChar"/>
+        </w:rPr>
+        <w:t xml:space="preserve">https://</w:t>
+      </w:r>
+      <w:r>
+        <w:t xml:space="preserve"> </w:t>
+      </w:r>
+      <w:r>
+        <w:t xml:space="preserve">matching the site’s canonical scheme. This operational checklist at §15 already uses HTTPS.</w:t>
+      </w:r>
+    </w:p>
+    <w:bookmarkEnd w:id="90"/>
+    <w:bookmarkEnd w:id="91"/>
+    <w:bookmarkEnd w:id="92"/>
     <w:sectPr>
       <w:footerReference r:id="rId31" w:type="default"/>
       <w:footnotePr>
@@ -13497,18 +12296,6 @@
     <w:abstractNumId w:val="991"/>
   </w:num>
   <w:num w:numId="1054">
-    <w:abstractNumId w:val="991"/>
-  </w:num>
-  <w:num w:numId="1055">
-    <w:abstractNumId w:val="991"/>
-  </w:num>
-  <w:num w:numId="1056">
-    <w:abstractNumId w:val="991"/>
-  </w:num>
-  <w:num w:numId="1057">
-    <w:abstractNumId w:val="991"/>
-  </w:num>
-  <w:num w:numId="1058">
     <w:abstractNumId w:val="991"/>
   </w:num>
 </w:numbering>

</xml_diff>

<commit_message>
docs: harden performance runbook follow-up
</commit_message>
<xml_diff>
--- a/Enterprise-WordPress-Performance-Operational-Checklist.docx
+++ b/Enterprise-WordPress-Performance-Operational-Checklist.docx
@@ -26,7 +26,7 @@
         <w:t xml:space="preserve">Dan Knauss, General Editor</w:t>
       </w:r>
     </w:p>
-    <w:bookmarkStart w:id="21" w:name="X0ee7156a14d8698c74ff527f137db695911a062"/>
+    <w:bookmarkStart w:id="41" w:name="X0ee7156a14d8698c74ff527f137db695911a062"/>
     <w:p>
       <w:pPr>
         <w:pStyle w:val="Heading1"/>
@@ -127,7 +127,7 @@
       <w:r>
         <w:t xml:space="preserve"> </w:t>
       </w:r>
-      <w:hyperlink r:id="rId20">
+      <w:hyperlink r:id="rId40">
         <w:r>
           <w:rPr>
             <w:rStyle w:val="VerbatimChar"/>
@@ -157,8 +157,8 @@
         </w:pict>
       </w:r>
     </w:p>
-    <w:bookmarkEnd w:id="21"/>
-    <w:bookmarkStart w:id="72" w:name="table-of-contents"/>
+    <w:bookmarkEnd w:id="41"/>
+    <w:bookmarkStart w:id="92" w:name="table-of-contents"/>
     <w:p>
       <w:pPr>
         <w:pStyle w:val="Heading1"/>
@@ -762,7 +762,7 @@
         </w:r>
       </w:hyperlink>
     </w:p>
-    <w:bookmarkStart w:id="22" w:name="define-the-performance-problem"/>
+    <w:bookmarkStart w:id="42" w:name="define-the-performance-problem"/>
     <w:p>
       <w:pPr>
         <w:pStyle w:val="Heading2"/>
@@ -1078,8 +1078,8 @@
         </w:pict>
       </w:r>
     </w:p>
-    <w:bookmarkEnd w:id="22"/>
-    <w:bookmarkStart w:id="23" w:name="trace-the-request-cycle"/>
+    <w:bookmarkEnd w:id="42"/>
+    <w:bookmarkStart w:id="43" w:name="trace-the-request-cycle"/>
     <w:p>
       <w:pPr>
         <w:pStyle w:val="Heading2"/>
@@ -1303,8 +1303,8 @@
         </w:pict>
       </w:r>
     </w:p>
-    <w:bookmarkEnd w:id="23"/>
-    <w:bookmarkStart w:id="24" w:name="establish-a-baseline"/>
+    <w:bookmarkEnd w:id="43"/>
+    <w:bookmarkStart w:id="44" w:name="establish-a-baseline"/>
     <w:p>
       <w:pPr>
         <w:pStyle w:val="Heading2"/>
@@ -1919,8 +1919,8 @@
         </w:pict>
       </w:r>
     </w:p>
-    <w:bookmarkEnd w:id="24"/>
-    <w:bookmarkStart w:id="25" w:name="dns-and-http-request-setup"/>
+    <w:bookmarkEnd w:id="44"/>
+    <w:bookmarkStart w:id="45" w:name="dns-and-http-request-setup"/>
     <w:p>
       <w:pPr>
         <w:pStyle w:val="Heading2"/>
@@ -2460,8 +2460,8 @@
         </w:pict>
       </w:r>
     </w:p>
-    <w:bookmarkEnd w:id="25"/>
-    <w:bookmarkStart w:id="26" w:name="full-page-cache-and-edge-cache"/>
+    <w:bookmarkEnd w:id="45"/>
+    <w:bookmarkStart w:id="46" w:name="full-page-cache-and-edge-cache"/>
     <w:p>
       <w:pPr>
         <w:pStyle w:val="Heading2"/>
@@ -2796,8 +2796,8 @@
         </w:pict>
       </w:r>
     </w:p>
-    <w:bookmarkEnd w:id="26"/>
-    <w:bookmarkStart w:id="27" w:name="ttl-headers-and-invalidation"/>
+    <w:bookmarkEnd w:id="46"/>
+    <w:bookmarkStart w:id="47" w:name="ttl-headers-and-invalidation"/>
     <w:p>
       <w:pPr>
         <w:pStyle w:val="Heading2"/>
@@ -3050,8 +3050,8 @@
         </w:pict>
       </w:r>
     </w:p>
-    <w:bookmarkEnd w:id="27"/>
-    <w:bookmarkStart w:id="28" w:name="application-optimization"/>
+    <w:bookmarkEnd w:id="47"/>
+    <w:bookmarkStart w:id="48" w:name="application-optimization"/>
     <w:p>
       <w:pPr>
         <w:pStyle w:val="Heading2"/>
@@ -3251,8 +3251,8 @@
         </w:pict>
       </w:r>
     </w:p>
-    <w:bookmarkEnd w:id="28"/>
-    <w:bookmarkStart w:id="29" w:name="partial-output-caching"/>
+    <w:bookmarkEnd w:id="48"/>
+    <w:bookmarkStart w:id="49" w:name="partial-output-caching"/>
     <w:p>
       <w:pPr>
         <w:pStyle w:val="Heading2"/>
@@ -4333,8 +4333,8 @@
         </w:pict>
       </w:r>
     </w:p>
-    <w:bookmarkEnd w:id="29"/>
-    <w:bookmarkStart w:id="30" w:name="mysql-query-optimization"/>
+    <w:bookmarkEnd w:id="49"/>
+    <w:bookmarkStart w:id="50" w:name="mysql-query-optimization"/>
     <w:p>
       <w:pPr>
         <w:pStyle w:val="Heading2"/>
@@ -4913,8 +4913,8 @@
         </w:pict>
       </w:r>
     </w:p>
-    <w:bookmarkEnd w:id="30"/>
-    <w:bookmarkStart w:id="31" w:name="unbounded-queries"/>
+    <w:bookmarkEnd w:id="50"/>
+    <w:bookmarkStart w:id="51" w:name="unbounded-queries"/>
     <w:p>
       <w:pPr>
         <w:pStyle w:val="Heading2"/>
@@ -5794,8 +5794,8 @@
         </w:pict>
       </w:r>
     </w:p>
-    <w:bookmarkEnd w:id="31"/>
-    <w:bookmarkStart w:id="36" w:name="taxonomies-exclusions-post-meta-and-like"/>
+    <w:bookmarkEnd w:id="51"/>
+    <w:bookmarkStart w:id="56" w:name="taxonomies-exclusions-post-meta-and-like"/>
     <w:p>
       <w:pPr>
         <w:pStyle w:val="Heading2"/>
@@ -5804,7 +5804,7 @@
         <w:t xml:space="preserve">10. Taxonomies, exclusions, post meta, and LIKE</w:t>
       </w:r>
     </w:p>
-    <w:bookmarkStart w:id="32" w:name="taxonomies"/>
+    <w:bookmarkStart w:id="52" w:name="taxonomies"/>
     <w:p>
       <w:pPr>
         <w:pStyle w:val="Heading3"/>
@@ -6141,8 +6141,8 @@
         <w:t xml:space="preserve">;</w:t>
       </w:r>
     </w:p>
-    <w:bookmarkEnd w:id="32"/>
-    <w:bookmarkStart w:id="33" w:name="not-in"/>
+    <w:bookmarkEnd w:id="52"/>
+    <w:bookmarkStart w:id="53" w:name="not-in"/>
     <w:p>
       <w:pPr>
         <w:pStyle w:val="Heading3"/>
@@ -6428,8 +6428,8 @@
         <w:t xml:space="preserve">);</w:t>
       </w:r>
     </w:p>
-    <w:bookmarkEnd w:id="33"/>
-    <w:bookmarkStart w:id="34" w:name="post-meta"/>
+    <w:bookmarkEnd w:id="53"/>
+    <w:bookmarkStart w:id="54" w:name="post-meta"/>
     <w:p>
       <w:pPr>
         <w:pStyle w:val="Heading3"/>
@@ -6474,8 +6474,8 @@
         <w:t xml:space="preserve">[ ] Consider custom tables or search infrastructure for high-volume structured data.</w:t>
       </w:r>
     </w:p>
-    <w:bookmarkEnd w:id="34"/>
-    <w:bookmarkStart w:id="35" w:name="like"/>
+    <w:bookmarkEnd w:id="54"/>
+    <w:bookmarkStart w:id="55" w:name="like"/>
     <w:p>
       <w:pPr>
         <w:pStyle w:val="Heading3"/>
@@ -6697,9 +6697,9 @@
         </w:pict>
       </w:r>
     </w:p>
-    <w:bookmarkEnd w:id="35"/>
-    <w:bookmarkEnd w:id="36"/>
-    <w:bookmarkStart w:id="37" w:name="explain-driven-query-review"/>
+    <w:bookmarkEnd w:id="55"/>
+    <w:bookmarkEnd w:id="56"/>
+    <w:bookmarkStart w:id="57" w:name="explain-driven-query-review"/>
     <w:p>
       <w:pPr>
         <w:pStyle w:val="Heading2"/>
@@ -7089,8 +7089,8 @@
         </w:pict>
       </w:r>
     </w:p>
-    <w:bookmarkEnd w:id="37"/>
-    <w:bookmarkStart w:id="38" w:name="object-caching"/>
+    <w:bookmarkEnd w:id="57"/>
+    <w:bookmarkStart w:id="58" w:name="object-caching"/>
     <w:p>
       <w:pPr>
         <w:pStyle w:val="Heading2"/>
@@ -7475,8 +7475,8 @@
         </w:pict>
       </w:r>
     </w:p>
-    <w:bookmarkEnd w:id="38"/>
-    <w:bookmarkStart w:id="39" w:name="transients-and-in-memory-caching"/>
+    <w:bookmarkEnd w:id="58"/>
+    <w:bookmarkStart w:id="59" w:name="transients-and-in-memory-caching"/>
     <w:p>
       <w:pPr>
         <w:pStyle w:val="Heading2"/>
@@ -7968,8 +7968,8 @@
         </w:pict>
       </w:r>
     </w:p>
-    <w:bookmarkEnd w:id="39"/>
-    <w:bookmarkStart w:id="40" w:name="race-conditions-and-cache-stampedes"/>
+    <w:bookmarkEnd w:id="59"/>
+    <w:bookmarkStart w:id="60" w:name="race-conditions-and-cache-stampedes"/>
     <w:p>
       <w:pPr>
         <w:pStyle w:val="Heading2"/>
@@ -8638,8 +8638,8 @@
         </w:pict>
       </w:r>
     </w:p>
-    <w:bookmarkEnd w:id="40"/>
-    <w:bookmarkStart w:id="41" w:name="wp-cron-and-scheduled-work"/>
+    <w:bookmarkEnd w:id="60"/>
+    <w:bookmarkStart w:id="61" w:name="wp-cron-and-scheduled-work"/>
     <w:p>
       <w:pPr>
         <w:pStyle w:val="Heading2"/>
@@ -9248,8 +9248,8 @@
         <w:t xml:space="preserve">After setting the constant, confirm scheduled events continue to clear. WordPress 6.9+ spawns request-triggered WP-Cron at shutdown, which can reduce user-facing latency, but enterprise/high-traffic sites should still use a verified external runner. Roll back by commenting out the constant and clearing OPcache if the backlog grows.</w:t>
       </w:r>
     </w:p>
-    <w:bookmarkEnd w:id="41"/>
-    <w:bookmarkStart w:id="45" w:name="X074b66bf28bf6916238b2bb912424b5abd2e6d1"/>
+    <w:bookmarkEnd w:id="61"/>
+    <w:bookmarkStart w:id="65" w:name="X074b66bf28bf6916238b2bb912424b5abd2e6d1"/>
     <w:p>
       <w:pPr>
         <w:pStyle w:val="Heading2"/>
@@ -9258,7 +9258,7 @@
         <w:t xml:space="preserve">16. AJAX, REST, sitemaps, redirects, and external requests</w:t>
       </w:r>
     </w:p>
-    <w:bookmarkStart w:id="42" w:name="ajax-and-rest"/>
+    <w:bookmarkStart w:id="62" w:name="ajax-and-rest"/>
     <w:p>
       <w:pPr>
         <w:pStyle w:val="Heading3"/>
@@ -9354,8 +9354,8 @@
         <w:t xml:space="preserve">[ ] Authenticate private endpoints correctly.</w:t>
       </w:r>
     </w:p>
-    <w:bookmarkEnd w:id="42"/>
-    <w:bookmarkStart w:id="43" w:name="sitemaps"/>
+    <w:bookmarkEnd w:id="62"/>
+    <w:bookmarkStart w:id="63" w:name="sitemaps"/>
     <w:p>
       <w:pPr>
         <w:pStyle w:val="Heading3"/>
@@ -9412,8 +9412,8 @@
         <w:t xml:space="preserve">[ ] Avoid regenerating large sitemap structures on every request.</w:t>
       </w:r>
     </w:p>
-    <w:bookmarkEnd w:id="43"/>
-    <w:bookmarkStart w:id="44" w:name="external-requests"/>
+    <w:bookmarkEnd w:id="63"/>
+    <w:bookmarkStart w:id="64" w:name="external-requests"/>
     <w:p>
       <w:pPr>
         <w:pStyle w:val="Heading3"/>
@@ -9489,9 +9489,9 @@
         </w:pict>
       </w:r>
     </w:p>
-    <w:bookmarkEnd w:id="44"/>
-    <w:bookmarkEnd w:id="45"/>
-    <w:bookmarkStart w:id="46" w:name="Xbaf3fdb85831dc92fa95e7eb51331eec8c713cb"/>
+    <w:bookmarkEnd w:id="64"/>
+    <w:bookmarkEnd w:id="65"/>
+    <w:bookmarkStart w:id="66" w:name="Xbaf3fdb85831dc92fa95e7eb51331eec8c713cb"/>
     <w:p>
       <w:pPr>
         <w:pStyle w:val="Heading2"/>
@@ -9650,8 +9650,8 @@
         </w:pict>
       </w:r>
     </w:p>
-    <w:bookmarkEnd w:id="46"/>
-    <w:bookmarkStart w:id="47" w:name="traffic-patterns-and-high-traffic-events"/>
+    <w:bookmarkEnd w:id="66"/>
+    <w:bookmarkStart w:id="67" w:name="traffic-patterns-and-high-traffic-events"/>
     <w:p>
       <w:pPr>
         <w:pStyle w:val="Heading2"/>
@@ -9887,8 +9887,8 @@
         </w:pict>
       </w:r>
     </w:p>
-    <w:bookmarkEnd w:id="47"/>
-    <w:bookmarkStart w:id="48" w:name="load-testing"/>
+    <w:bookmarkEnd w:id="67"/>
+    <w:bookmarkStart w:id="68" w:name="load-testing"/>
     <w:p>
       <w:pPr>
         <w:pStyle w:val="Heading2"/>
@@ -10125,8 +10125,8 @@
         </w:pict>
       </w:r>
     </w:p>
-    <w:bookmarkEnd w:id="48"/>
-    <w:bookmarkStart w:id="52" w:name="measuring-time-spent"/>
+    <w:bookmarkEnd w:id="68"/>
+    <w:bookmarkStart w:id="72" w:name="measuring-time-spent"/>
     <w:p>
       <w:pPr>
         <w:pStyle w:val="Heading2"/>
@@ -10143,7 +10143,7 @@
         <w:t xml:space="preserve">Use multiple tools because each sees a different layer.</w:t>
       </w:r>
     </w:p>
-    <w:bookmarkStart w:id="49" w:name="php-logging"/>
+    <w:bookmarkStart w:id="69" w:name="php-logging"/>
     <w:p>
       <w:pPr>
         <w:pStyle w:val="Heading3"/>
@@ -10528,8 +10528,8 @@
         <w:t xml:space="preserve">}</w:t>
       </w:r>
     </w:p>
-    <w:bookmarkEnd w:id="49"/>
-    <w:bookmarkStart w:id="50" w:name="new-relic"/>
+    <w:bookmarkEnd w:id="69"/>
+    <w:bookmarkStart w:id="70" w:name="new-relic"/>
     <w:p>
       <w:pPr>
         <w:pStyle w:val="Heading3"/>
@@ -10874,8 +10874,8 @@
         <w:t xml:space="preserve">to give the current request a stable, low-cardinality name in APM. The New Relic transaction-start API takes a New Relic application name, not a transaction name, and is reserved for advanced transaction-lifecycle patterns such as queue workers manually ending one transaction and starting another.</w:t>
       </w:r>
     </w:p>
-    <w:bookmarkEnd w:id="50"/>
-    <w:bookmarkStart w:id="51" w:name="query-monitor"/>
+    <w:bookmarkEnd w:id="70"/>
+    <w:bookmarkStart w:id="71" w:name="query-monitor"/>
     <w:p>
       <w:pPr>
         <w:pStyle w:val="Heading3"/>
@@ -11162,9 +11162,9 @@
         </w:pict>
       </w:r>
     </w:p>
-    <w:bookmarkEnd w:id="51"/>
-    <w:bookmarkEnd w:id="52"/>
-    <w:bookmarkStart w:id="53" w:name="performance-alerting"/>
+    <w:bookmarkEnd w:id="71"/>
+    <w:bookmarkEnd w:id="72"/>
+    <w:bookmarkStart w:id="73" w:name="performance-alerting"/>
     <w:p>
       <w:pPr>
         <w:pStyle w:val="Heading2"/>
@@ -11368,8 +11368,8 @@
         </w:pict>
       </w:r>
     </w:p>
-    <w:bookmarkEnd w:id="53"/>
-    <w:bookmarkStart w:id="54" w:name="verification-and-definition-of-done"/>
+    <w:bookmarkEnd w:id="73"/>
+    <w:bookmarkStart w:id="74" w:name="verification-and-definition-of-done"/>
     <w:p>
       <w:pPr>
         <w:pStyle w:val="Heading2"/>
@@ -11581,8 +11581,8 @@
         </w:pict>
       </w:r>
     </w:p>
-    <w:bookmarkEnd w:id="54"/>
-    <w:bookmarkStart w:id="71" w:name="references"/>
+    <w:bookmarkEnd w:id="74"/>
+    <w:bookmarkStart w:id="91" w:name="references"/>
     <w:p>
       <w:pPr>
         <w:pStyle w:val="Heading2"/>
@@ -11599,7 +11599,7 @@
           <w:numId w:val="1054"/>
         </w:numPr>
       </w:pPr>
-      <w:hyperlink r:id="rId55">
+      <w:hyperlink r:id="rId75">
         <w:r>
           <w:rPr>
             <w:rStyle w:val="Hyperlink"/>
@@ -11616,7 +11616,7 @@
           <w:numId w:val="1054"/>
         </w:numPr>
       </w:pPr>
-      <w:hyperlink r:id="rId56">
+      <w:hyperlink r:id="rId76">
         <w:r>
           <w:rPr>
             <w:rStyle w:val="Hyperlink"/>
@@ -11633,7 +11633,7 @@
           <w:numId w:val="1054"/>
         </w:numPr>
       </w:pPr>
-      <w:hyperlink r:id="rId57">
+      <w:hyperlink r:id="rId77">
         <w:r>
           <w:rPr>
             <w:rStyle w:val="Hyperlink"/>
@@ -11650,7 +11650,7 @@
           <w:numId w:val="1054"/>
         </w:numPr>
       </w:pPr>
-      <w:hyperlink r:id="rId58">
+      <w:hyperlink r:id="rId78">
         <w:r>
           <w:rPr>
             <w:rStyle w:val="Hyperlink"/>
@@ -11667,7 +11667,7 @@
           <w:numId w:val="1054"/>
         </w:numPr>
       </w:pPr>
-      <w:hyperlink r:id="rId59">
+      <w:hyperlink r:id="rId79">
         <w:r>
           <w:rPr>
             <w:rStyle w:val="Hyperlink"/>
@@ -11684,7 +11684,7 @@
           <w:numId w:val="1054"/>
         </w:numPr>
       </w:pPr>
-      <w:hyperlink r:id="rId60">
+      <w:hyperlink r:id="rId80">
         <w:r>
           <w:rPr>
             <w:rStyle w:val="Hyperlink"/>
@@ -11701,7 +11701,7 @@
           <w:numId w:val="1054"/>
         </w:numPr>
       </w:pPr>
-      <w:hyperlink r:id="rId61">
+      <w:hyperlink r:id="rId81">
         <w:r>
           <w:rPr>
             <w:rStyle w:val="Hyperlink"/>
@@ -11718,7 +11718,7 @@
           <w:numId w:val="1054"/>
         </w:numPr>
       </w:pPr>
-      <w:hyperlink r:id="rId62">
+      <w:hyperlink r:id="rId82">
         <w:r>
           <w:rPr>
             <w:rStyle w:val="Hyperlink"/>
@@ -11735,7 +11735,7 @@
           <w:numId w:val="1054"/>
         </w:numPr>
       </w:pPr>
-      <w:hyperlink r:id="rId63">
+      <w:hyperlink r:id="rId83">
         <w:r>
           <w:rPr>
             <w:rStyle w:val="Hyperlink"/>
@@ -11752,7 +11752,7 @@
           <w:numId w:val="1054"/>
         </w:numPr>
       </w:pPr>
-      <w:hyperlink r:id="rId64">
+      <w:hyperlink r:id="rId84">
         <w:r>
           <w:rPr>
             <w:rStyle w:val="Hyperlink"/>
@@ -11769,7 +11769,7 @@
           <w:numId w:val="1054"/>
         </w:numPr>
       </w:pPr>
-      <w:hyperlink r:id="rId65">
+      <w:hyperlink r:id="rId85">
         <w:r>
           <w:rPr>
             <w:rStyle w:val="Hyperlink"/>
@@ -11786,7 +11786,7 @@
           <w:numId w:val="1054"/>
         </w:numPr>
       </w:pPr>
-      <w:hyperlink r:id="rId66">
+      <w:hyperlink r:id="rId86">
         <w:r>
           <w:rPr>
             <w:rStyle w:val="VerbatimChar"/>
@@ -11803,7 +11803,7 @@
           <w:numId w:val="1054"/>
         </w:numPr>
       </w:pPr>
-      <w:hyperlink r:id="rId67">
+      <w:hyperlink r:id="rId87">
         <w:r>
           <w:rPr>
             <w:rStyle w:val="Hyperlink"/>
@@ -11820,7 +11820,7 @@
           <w:numId w:val="1054"/>
         </w:numPr>
       </w:pPr>
-      <w:hyperlink r:id="rId68">
+      <w:hyperlink r:id="rId88">
         <w:r>
           <w:rPr>
             <w:rStyle w:val="Hyperlink"/>
@@ -11837,7 +11837,7 @@
           <w:numId w:val="1054"/>
         </w:numPr>
       </w:pPr>
-      <w:hyperlink r:id="rId69">
+      <w:hyperlink r:id="rId89">
         <w:r>
           <w:rPr>
             <w:rStyle w:val="Hyperlink"/>
@@ -11846,7 +11846,7 @@
         </w:r>
       </w:hyperlink>
     </w:p>
-    <w:bookmarkStart w:id="70" w:name="source-note"/>
+    <w:bookmarkStart w:id="90" w:name="source-note"/>
     <w:p>
       <w:pPr>
         <w:pStyle w:val="Heading3"/>
@@ -11890,11 +11890,11 @@
         <w:t xml:space="preserve">matching the site’s canonical scheme. This operational checklist at §15 already uses HTTPS.</w:t>
       </w:r>
     </w:p>
-    <w:bookmarkEnd w:id="70"/>
-    <w:bookmarkEnd w:id="71"/>
-    <w:bookmarkEnd w:id="72"/>
+    <w:bookmarkEnd w:id="90"/>
+    <w:bookmarkEnd w:id="91"/>
+    <w:bookmarkEnd w:id="92"/>
     <w:sectPr>
-      <w:footerReference r:id="rId9" w:type="default"/>
+      <w:footerReference r:id="rId31" w:type="default"/>
       <w:footnotePr>
         <w:numRestart w:val="eachSect"/>
       </w:footnotePr>

</xml_diff>

<commit_message>
docs: regenerate released publication artifacts
</commit_message>
<xml_diff>
--- a/Enterprise-WordPress-Performance-Operational-Checklist.docx
+++ b/Enterprise-WordPress-Performance-Operational-Checklist.docx
@@ -15,7 +15,7 @@
         <w:pStyle w:val="Subtitle"/>
       </w:pPr>
       <w:r>
-        <w:t xml:space="preserve">Version 1.1 — DRAFT</w:t>
+        <w:t xml:space="preserve">Version 1.1 — Released</w:t>
       </w:r>
     </w:p>
     <w:p>
@@ -26,7 +26,7 @@
         <w:t xml:space="preserve">Dan Knauss, General Editor</w:t>
       </w:r>
     </w:p>
-    <w:bookmarkStart w:id="21" w:name="X0ee7156a14d8698c74ff527f137db695911a062"/>
+    <w:bookmarkStart w:id="41" w:name="X0ee7156a14d8698c74ff527f137db695911a062"/>
     <w:p>
       <w:pPr>
         <w:pStyle w:val="Heading1"/>
@@ -50,7 +50,7 @@
         <w:t xml:space="preserve"> </w:t>
       </w:r>
       <w:r>
-        <w:t xml:space="preserve">DRAFT</w:t>
+        <w:t xml:space="preserve">Released</w:t>
       </w:r>
       <w:r>
         <w:t xml:space="preserve"> </w:t>
@@ -127,7 +127,7 @@
       <w:r>
         <w:t xml:space="preserve"> </w:t>
       </w:r>
-      <w:hyperlink r:id="rId20">
+      <w:hyperlink r:id="rId40">
         <w:r>
           <w:rPr>
             <w:rStyle w:val="VerbatimChar"/>
@@ -157,8 +157,8 @@
         </w:pict>
       </w:r>
     </w:p>
-    <w:bookmarkEnd w:id="21"/>
-    <w:bookmarkStart w:id="72" w:name="table-of-contents"/>
+    <w:bookmarkEnd w:id="41"/>
+    <w:bookmarkStart w:id="92" w:name="table-of-contents"/>
     <w:p>
       <w:pPr>
         <w:pStyle w:val="Heading1"/>
@@ -762,7 +762,7 @@
         </w:r>
       </w:hyperlink>
     </w:p>
-    <w:bookmarkStart w:id="22" w:name="define-the-performance-problem"/>
+    <w:bookmarkStart w:id="42" w:name="define-the-performance-problem"/>
     <w:p>
       <w:pPr>
         <w:pStyle w:val="Heading2"/>
@@ -1078,8 +1078,8 @@
         </w:pict>
       </w:r>
     </w:p>
-    <w:bookmarkEnd w:id="22"/>
-    <w:bookmarkStart w:id="23" w:name="trace-the-request-cycle"/>
+    <w:bookmarkEnd w:id="42"/>
+    <w:bookmarkStart w:id="43" w:name="trace-the-request-cycle"/>
     <w:p>
       <w:pPr>
         <w:pStyle w:val="Heading2"/>
@@ -1303,8 +1303,8 @@
         </w:pict>
       </w:r>
     </w:p>
-    <w:bookmarkEnd w:id="23"/>
-    <w:bookmarkStart w:id="24" w:name="establish-a-baseline"/>
+    <w:bookmarkEnd w:id="43"/>
+    <w:bookmarkStart w:id="44" w:name="establish-a-baseline"/>
     <w:p>
       <w:pPr>
         <w:pStyle w:val="Heading2"/>
@@ -1919,8 +1919,8 @@
         </w:pict>
       </w:r>
     </w:p>
-    <w:bookmarkEnd w:id="24"/>
-    <w:bookmarkStart w:id="25" w:name="dns-and-http-request-setup"/>
+    <w:bookmarkEnd w:id="44"/>
+    <w:bookmarkStart w:id="45" w:name="dns-and-http-request-setup"/>
     <w:p>
       <w:pPr>
         <w:pStyle w:val="Heading2"/>
@@ -2460,8 +2460,8 @@
         </w:pict>
       </w:r>
     </w:p>
-    <w:bookmarkEnd w:id="25"/>
-    <w:bookmarkStart w:id="26" w:name="full-page-cache-and-edge-cache"/>
+    <w:bookmarkEnd w:id="45"/>
+    <w:bookmarkStart w:id="46" w:name="full-page-cache-and-edge-cache"/>
     <w:p>
       <w:pPr>
         <w:pStyle w:val="Heading2"/>
@@ -2796,8 +2796,8 @@
         </w:pict>
       </w:r>
     </w:p>
-    <w:bookmarkEnd w:id="26"/>
-    <w:bookmarkStart w:id="27" w:name="ttl-headers-and-invalidation"/>
+    <w:bookmarkEnd w:id="46"/>
+    <w:bookmarkStart w:id="47" w:name="ttl-headers-and-invalidation"/>
     <w:p>
       <w:pPr>
         <w:pStyle w:val="Heading2"/>
@@ -3050,8 +3050,8 @@
         </w:pict>
       </w:r>
     </w:p>
-    <w:bookmarkEnd w:id="27"/>
-    <w:bookmarkStart w:id="28" w:name="application-optimization"/>
+    <w:bookmarkEnd w:id="47"/>
+    <w:bookmarkStart w:id="48" w:name="application-optimization"/>
     <w:p>
       <w:pPr>
         <w:pStyle w:val="Heading2"/>
@@ -3251,8 +3251,8 @@
         </w:pict>
       </w:r>
     </w:p>
-    <w:bookmarkEnd w:id="28"/>
-    <w:bookmarkStart w:id="29" w:name="partial-output-caching"/>
+    <w:bookmarkEnd w:id="48"/>
+    <w:bookmarkStart w:id="49" w:name="partial-output-caching"/>
     <w:p>
       <w:pPr>
         <w:pStyle w:val="Heading2"/>
@@ -4333,8 +4333,8 @@
         </w:pict>
       </w:r>
     </w:p>
-    <w:bookmarkEnd w:id="29"/>
-    <w:bookmarkStart w:id="30" w:name="mysql-query-optimization"/>
+    <w:bookmarkEnd w:id="49"/>
+    <w:bookmarkStart w:id="50" w:name="mysql-query-optimization"/>
     <w:p>
       <w:pPr>
         <w:pStyle w:val="Heading2"/>
@@ -4913,8 +4913,8 @@
         </w:pict>
       </w:r>
     </w:p>
-    <w:bookmarkEnd w:id="30"/>
-    <w:bookmarkStart w:id="31" w:name="unbounded-queries"/>
+    <w:bookmarkEnd w:id="50"/>
+    <w:bookmarkStart w:id="51" w:name="unbounded-queries"/>
     <w:p>
       <w:pPr>
         <w:pStyle w:val="Heading2"/>
@@ -5794,8 +5794,8 @@
         </w:pict>
       </w:r>
     </w:p>
-    <w:bookmarkEnd w:id="31"/>
-    <w:bookmarkStart w:id="36" w:name="taxonomies-exclusions-post-meta-and-like"/>
+    <w:bookmarkEnd w:id="51"/>
+    <w:bookmarkStart w:id="56" w:name="taxonomies-exclusions-post-meta-and-like"/>
     <w:p>
       <w:pPr>
         <w:pStyle w:val="Heading2"/>
@@ -5804,7 +5804,7 @@
         <w:t xml:space="preserve">10. Taxonomies, exclusions, post meta, and LIKE</w:t>
       </w:r>
     </w:p>
-    <w:bookmarkStart w:id="32" w:name="taxonomies"/>
+    <w:bookmarkStart w:id="52" w:name="taxonomies"/>
     <w:p>
       <w:pPr>
         <w:pStyle w:val="Heading3"/>
@@ -6141,8 +6141,8 @@
         <w:t xml:space="preserve">;</w:t>
       </w:r>
     </w:p>
-    <w:bookmarkEnd w:id="32"/>
-    <w:bookmarkStart w:id="33" w:name="not-in"/>
+    <w:bookmarkEnd w:id="52"/>
+    <w:bookmarkStart w:id="53" w:name="not-in"/>
     <w:p>
       <w:pPr>
         <w:pStyle w:val="Heading3"/>
@@ -6428,8 +6428,8 @@
         <w:t xml:space="preserve">);</w:t>
       </w:r>
     </w:p>
-    <w:bookmarkEnd w:id="33"/>
-    <w:bookmarkStart w:id="34" w:name="post-meta"/>
+    <w:bookmarkEnd w:id="53"/>
+    <w:bookmarkStart w:id="54" w:name="post-meta"/>
     <w:p>
       <w:pPr>
         <w:pStyle w:val="Heading3"/>
@@ -6474,8 +6474,8 @@
         <w:t xml:space="preserve">[ ] Consider custom tables or search infrastructure for high-volume structured data.</w:t>
       </w:r>
     </w:p>
-    <w:bookmarkEnd w:id="34"/>
-    <w:bookmarkStart w:id="35" w:name="like"/>
+    <w:bookmarkEnd w:id="54"/>
+    <w:bookmarkStart w:id="55" w:name="like"/>
     <w:p>
       <w:pPr>
         <w:pStyle w:val="Heading3"/>
@@ -6697,9 +6697,9 @@
         </w:pict>
       </w:r>
     </w:p>
-    <w:bookmarkEnd w:id="35"/>
-    <w:bookmarkEnd w:id="36"/>
-    <w:bookmarkStart w:id="37" w:name="explain-driven-query-review"/>
+    <w:bookmarkEnd w:id="55"/>
+    <w:bookmarkEnd w:id="56"/>
+    <w:bookmarkStart w:id="57" w:name="explain-driven-query-review"/>
     <w:p>
       <w:pPr>
         <w:pStyle w:val="Heading2"/>
@@ -7089,8 +7089,8 @@
         </w:pict>
       </w:r>
     </w:p>
-    <w:bookmarkEnd w:id="37"/>
-    <w:bookmarkStart w:id="38" w:name="object-caching"/>
+    <w:bookmarkEnd w:id="57"/>
+    <w:bookmarkStart w:id="58" w:name="object-caching"/>
     <w:p>
       <w:pPr>
         <w:pStyle w:val="Heading2"/>
@@ -7475,8 +7475,8 @@
         </w:pict>
       </w:r>
     </w:p>
-    <w:bookmarkEnd w:id="38"/>
-    <w:bookmarkStart w:id="39" w:name="transients-and-in-memory-caching"/>
+    <w:bookmarkEnd w:id="58"/>
+    <w:bookmarkStart w:id="59" w:name="transients-and-in-memory-caching"/>
     <w:p>
       <w:pPr>
         <w:pStyle w:val="Heading2"/>
@@ -7968,8 +7968,8 @@
         </w:pict>
       </w:r>
     </w:p>
-    <w:bookmarkEnd w:id="39"/>
-    <w:bookmarkStart w:id="40" w:name="race-conditions-and-cache-stampedes"/>
+    <w:bookmarkEnd w:id="59"/>
+    <w:bookmarkStart w:id="60" w:name="race-conditions-and-cache-stampedes"/>
     <w:p>
       <w:pPr>
         <w:pStyle w:val="Heading2"/>
@@ -8638,8 +8638,8 @@
         </w:pict>
       </w:r>
     </w:p>
-    <w:bookmarkEnd w:id="40"/>
-    <w:bookmarkStart w:id="41" w:name="wp-cron-and-scheduled-work"/>
+    <w:bookmarkEnd w:id="60"/>
+    <w:bookmarkStart w:id="61" w:name="wp-cron-and-scheduled-work"/>
     <w:p>
       <w:pPr>
         <w:pStyle w:val="Heading2"/>
@@ -9248,8 +9248,8 @@
         <w:t xml:space="preserve">After setting the constant, confirm scheduled events continue to clear. WordPress 6.9+ spawns request-triggered WP-Cron at shutdown, which can reduce user-facing latency, but enterprise/high-traffic sites should still use a verified external runner. Roll back by commenting out the constant and clearing OPcache if the backlog grows.</w:t>
       </w:r>
     </w:p>
-    <w:bookmarkEnd w:id="41"/>
-    <w:bookmarkStart w:id="45" w:name="X074b66bf28bf6916238b2bb912424b5abd2e6d1"/>
+    <w:bookmarkEnd w:id="61"/>
+    <w:bookmarkStart w:id="65" w:name="X074b66bf28bf6916238b2bb912424b5abd2e6d1"/>
     <w:p>
       <w:pPr>
         <w:pStyle w:val="Heading2"/>
@@ -9258,7 +9258,7 @@
         <w:t xml:space="preserve">16. AJAX, REST, sitemaps, redirects, and external requests</w:t>
       </w:r>
     </w:p>
-    <w:bookmarkStart w:id="42" w:name="ajax-and-rest"/>
+    <w:bookmarkStart w:id="62" w:name="ajax-and-rest"/>
     <w:p>
       <w:pPr>
         <w:pStyle w:val="Heading3"/>
@@ -9354,8 +9354,8 @@
         <w:t xml:space="preserve">[ ] Authenticate private endpoints correctly.</w:t>
       </w:r>
     </w:p>
-    <w:bookmarkEnd w:id="42"/>
-    <w:bookmarkStart w:id="43" w:name="sitemaps"/>
+    <w:bookmarkEnd w:id="62"/>
+    <w:bookmarkStart w:id="63" w:name="sitemaps"/>
     <w:p>
       <w:pPr>
         <w:pStyle w:val="Heading3"/>
@@ -9412,8 +9412,8 @@
         <w:t xml:space="preserve">[ ] Avoid regenerating large sitemap structures on every request.</w:t>
       </w:r>
     </w:p>
-    <w:bookmarkEnd w:id="43"/>
-    <w:bookmarkStart w:id="44" w:name="external-requests"/>
+    <w:bookmarkEnd w:id="63"/>
+    <w:bookmarkStart w:id="64" w:name="external-requests"/>
     <w:p>
       <w:pPr>
         <w:pStyle w:val="Heading3"/>
@@ -9489,9 +9489,9 @@
         </w:pict>
       </w:r>
     </w:p>
-    <w:bookmarkEnd w:id="44"/>
-    <w:bookmarkEnd w:id="45"/>
-    <w:bookmarkStart w:id="46" w:name="Xbaf3fdb85831dc92fa95e7eb51331eec8c713cb"/>
+    <w:bookmarkEnd w:id="64"/>
+    <w:bookmarkEnd w:id="65"/>
+    <w:bookmarkStart w:id="66" w:name="Xbaf3fdb85831dc92fa95e7eb51331eec8c713cb"/>
     <w:p>
       <w:pPr>
         <w:pStyle w:val="Heading2"/>
@@ -9650,8 +9650,8 @@
         </w:pict>
       </w:r>
     </w:p>
-    <w:bookmarkEnd w:id="46"/>
-    <w:bookmarkStart w:id="47" w:name="traffic-patterns-and-high-traffic-events"/>
+    <w:bookmarkEnd w:id="66"/>
+    <w:bookmarkStart w:id="67" w:name="traffic-patterns-and-high-traffic-events"/>
     <w:p>
       <w:pPr>
         <w:pStyle w:val="Heading2"/>
@@ -9887,8 +9887,8 @@
         </w:pict>
       </w:r>
     </w:p>
-    <w:bookmarkEnd w:id="47"/>
-    <w:bookmarkStart w:id="48" w:name="load-testing"/>
+    <w:bookmarkEnd w:id="67"/>
+    <w:bookmarkStart w:id="68" w:name="load-testing"/>
     <w:p>
       <w:pPr>
         <w:pStyle w:val="Heading2"/>
@@ -10125,8 +10125,8 @@
         </w:pict>
       </w:r>
     </w:p>
-    <w:bookmarkEnd w:id="48"/>
-    <w:bookmarkStart w:id="52" w:name="measuring-time-spent"/>
+    <w:bookmarkEnd w:id="68"/>
+    <w:bookmarkStart w:id="72" w:name="measuring-time-spent"/>
     <w:p>
       <w:pPr>
         <w:pStyle w:val="Heading2"/>
@@ -10143,7 +10143,7 @@
         <w:t xml:space="preserve">Use multiple tools because each sees a different layer.</w:t>
       </w:r>
     </w:p>
-    <w:bookmarkStart w:id="49" w:name="php-logging"/>
+    <w:bookmarkStart w:id="69" w:name="php-logging"/>
     <w:p>
       <w:pPr>
         <w:pStyle w:val="Heading3"/>
@@ -10528,8 +10528,8 @@
         <w:t xml:space="preserve">}</w:t>
       </w:r>
     </w:p>
-    <w:bookmarkEnd w:id="49"/>
-    <w:bookmarkStart w:id="50" w:name="new-relic"/>
+    <w:bookmarkEnd w:id="69"/>
+    <w:bookmarkStart w:id="70" w:name="new-relic"/>
     <w:p>
       <w:pPr>
         <w:pStyle w:val="Heading3"/>
@@ -10874,8 +10874,8 @@
         <w:t xml:space="preserve">to give the current request a stable, low-cardinality name in APM. The New Relic transaction-start API takes a New Relic application name, not a transaction name, and is reserved for advanced transaction-lifecycle patterns such as queue workers manually ending one transaction and starting another.</w:t>
       </w:r>
     </w:p>
-    <w:bookmarkEnd w:id="50"/>
-    <w:bookmarkStart w:id="51" w:name="query-monitor"/>
+    <w:bookmarkEnd w:id="70"/>
+    <w:bookmarkStart w:id="71" w:name="query-monitor"/>
     <w:p>
       <w:pPr>
         <w:pStyle w:val="Heading3"/>
@@ -11162,9 +11162,9 @@
         </w:pict>
       </w:r>
     </w:p>
-    <w:bookmarkEnd w:id="51"/>
-    <w:bookmarkEnd w:id="52"/>
-    <w:bookmarkStart w:id="53" w:name="performance-alerting"/>
+    <w:bookmarkEnd w:id="71"/>
+    <w:bookmarkEnd w:id="72"/>
+    <w:bookmarkStart w:id="73" w:name="performance-alerting"/>
     <w:p>
       <w:pPr>
         <w:pStyle w:val="Heading2"/>
@@ -11368,8 +11368,8 @@
         </w:pict>
       </w:r>
     </w:p>
-    <w:bookmarkEnd w:id="53"/>
-    <w:bookmarkStart w:id="54" w:name="verification-and-definition-of-done"/>
+    <w:bookmarkEnd w:id="73"/>
+    <w:bookmarkStart w:id="74" w:name="verification-and-definition-of-done"/>
     <w:p>
       <w:pPr>
         <w:pStyle w:val="Heading2"/>
@@ -11581,8 +11581,8 @@
         </w:pict>
       </w:r>
     </w:p>
-    <w:bookmarkEnd w:id="54"/>
-    <w:bookmarkStart w:id="71" w:name="references"/>
+    <w:bookmarkEnd w:id="74"/>
+    <w:bookmarkStart w:id="91" w:name="references"/>
     <w:p>
       <w:pPr>
         <w:pStyle w:val="Heading2"/>
@@ -11599,7 +11599,7 @@
           <w:numId w:val="1054"/>
         </w:numPr>
       </w:pPr>
-      <w:hyperlink r:id="rId55">
+      <w:hyperlink r:id="rId75">
         <w:r>
           <w:rPr>
             <w:rStyle w:val="Hyperlink"/>
@@ -11616,7 +11616,7 @@
           <w:numId w:val="1054"/>
         </w:numPr>
       </w:pPr>
-      <w:hyperlink r:id="rId56">
+      <w:hyperlink r:id="rId76">
         <w:r>
           <w:rPr>
             <w:rStyle w:val="Hyperlink"/>
@@ -11633,7 +11633,7 @@
           <w:numId w:val="1054"/>
         </w:numPr>
       </w:pPr>
-      <w:hyperlink r:id="rId57">
+      <w:hyperlink r:id="rId77">
         <w:r>
           <w:rPr>
             <w:rStyle w:val="Hyperlink"/>
@@ -11650,7 +11650,7 @@
           <w:numId w:val="1054"/>
         </w:numPr>
       </w:pPr>
-      <w:hyperlink r:id="rId58">
+      <w:hyperlink r:id="rId78">
         <w:r>
           <w:rPr>
             <w:rStyle w:val="Hyperlink"/>
@@ -11667,7 +11667,7 @@
           <w:numId w:val="1054"/>
         </w:numPr>
       </w:pPr>
-      <w:hyperlink r:id="rId59">
+      <w:hyperlink r:id="rId79">
         <w:r>
           <w:rPr>
             <w:rStyle w:val="Hyperlink"/>
@@ -11684,7 +11684,7 @@
           <w:numId w:val="1054"/>
         </w:numPr>
       </w:pPr>
-      <w:hyperlink r:id="rId60">
+      <w:hyperlink r:id="rId80">
         <w:r>
           <w:rPr>
             <w:rStyle w:val="Hyperlink"/>
@@ -11701,7 +11701,7 @@
           <w:numId w:val="1054"/>
         </w:numPr>
       </w:pPr>
-      <w:hyperlink r:id="rId61">
+      <w:hyperlink r:id="rId81">
         <w:r>
           <w:rPr>
             <w:rStyle w:val="Hyperlink"/>
@@ -11718,7 +11718,7 @@
           <w:numId w:val="1054"/>
         </w:numPr>
       </w:pPr>
-      <w:hyperlink r:id="rId62">
+      <w:hyperlink r:id="rId82">
         <w:r>
           <w:rPr>
             <w:rStyle w:val="Hyperlink"/>
@@ -11735,7 +11735,7 @@
           <w:numId w:val="1054"/>
         </w:numPr>
       </w:pPr>
-      <w:hyperlink r:id="rId63">
+      <w:hyperlink r:id="rId83">
         <w:r>
           <w:rPr>
             <w:rStyle w:val="Hyperlink"/>
@@ -11752,7 +11752,7 @@
           <w:numId w:val="1054"/>
         </w:numPr>
       </w:pPr>
-      <w:hyperlink r:id="rId64">
+      <w:hyperlink r:id="rId84">
         <w:r>
           <w:rPr>
             <w:rStyle w:val="Hyperlink"/>
@@ -11769,7 +11769,7 @@
           <w:numId w:val="1054"/>
         </w:numPr>
       </w:pPr>
-      <w:hyperlink r:id="rId65">
+      <w:hyperlink r:id="rId85">
         <w:r>
           <w:rPr>
             <w:rStyle w:val="Hyperlink"/>
@@ -11786,7 +11786,7 @@
           <w:numId w:val="1054"/>
         </w:numPr>
       </w:pPr>
-      <w:hyperlink r:id="rId66">
+      <w:hyperlink r:id="rId86">
         <w:r>
           <w:rPr>
             <w:rStyle w:val="VerbatimChar"/>
@@ -11803,7 +11803,7 @@
           <w:numId w:val="1054"/>
         </w:numPr>
       </w:pPr>
-      <w:hyperlink r:id="rId67">
+      <w:hyperlink r:id="rId87">
         <w:r>
           <w:rPr>
             <w:rStyle w:val="Hyperlink"/>
@@ -11820,7 +11820,7 @@
           <w:numId w:val="1054"/>
         </w:numPr>
       </w:pPr>
-      <w:hyperlink r:id="rId68">
+      <w:hyperlink r:id="rId88">
         <w:r>
           <w:rPr>
             <w:rStyle w:val="Hyperlink"/>
@@ -11837,7 +11837,7 @@
           <w:numId w:val="1054"/>
         </w:numPr>
       </w:pPr>
-      <w:hyperlink r:id="rId69">
+      <w:hyperlink r:id="rId89">
         <w:r>
           <w:rPr>
             <w:rStyle w:val="Hyperlink"/>
@@ -11846,7 +11846,7 @@
         </w:r>
       </w:hyperlink>
     </w:p>
-    <w:bookmarkStart w:id="70" w:name="source-note"/>
+    <w:bookmarkStart w:id="90" w:name="source-note"/>
     <w:p>
       <w:pPr>
         <w:pStyle w:val="Heading3"/>
@@ -11890,11 +11890,11 @@
         <w:t xml:space="preserve">matching the site’s canonical scheme. This operational checklist at §15 already uses HTTPS.</w:t>
       </w:r>
     </w:p>
-    <w:bookmarkEnd w:id="70"/>
-    <w:bookmarkEnd w:id="71"/>
-    <w:bookmarkEnd w:id="72"/>
+    <w:bookmarkEnd w:id="90"/>
+    <w:bookmarkEnd w:id="91"/>
+    <w:bookmarkEnd w:id="92"/>
     <w:sectPr>
-      <w:footerReference r:id="rId9" w:type="default"/>
+      <w:footerReference r:id="rId31" w:type="default"/>
       <w:footnotePr>
         <w:numRestart w:val="eachSect"/>
       </w:footnotePr>

</xml_diff>

<commit_message>
Release prep: cut 1.0.0
</commit_message>
<xml_diff>
--- a/Enterprise-WordPress-Performance-Operational-Checklist.docx
+++ b/Enterprise-WordPress-Performance-Operational-Checklist.docx
@@ -26,7 +26,7 @@
         <w:t xml:space="preserve">Dan Knauss, General Editor</w:t>
       </w:r>
     </w:p>
-    <w:bookmarkStart w:id="21" w:name="X0ee7156a14d8698c74ff527f137db695911a062"/>
+    <w:bookmarkStart w:id="41" w:name="X0ee7156a14d8698c74ff527f137db695911a062"/>
     <w:p>
       <w:pPr>
         <w:pStyle w:val="Heading1"/>
@@ -127,7 +127,7 @@
       <w:r>
         <w:t xml:space="preserve"> </w:t>
       </w:r>
-      <w:hyperlink r:id="rId20">
+      <w:hyperlink r:id="rId40">
         <w:r>
           <w:rPr>
             <w:rStyle w:val="VerbatimChar"/>
@@ -157,8 +157,8 @@
         </w:pict>
       </w:r>
     </w:p>
-    <w:bookmarkEnd w:id="21"/>
-    <w:bookmarkStart w:id="72" w:name="table-of-contents"/>
+    <w:bookmarkEnd w:id="41"/>
+    <w:bookmarkStart w:id="92" w:name="table-of-contents"/>
     <w:p>
       <w:pPr>
         <w:pStyle w:val="Heading1"/>
@@ -762,7 +762,7 @@
         </w:r>
       </w:hyperlink>
     </w:p>
-    <w:bookmarkStart w:id="22" w:name="define-the-performance-problem"/>
+    <w:bookmarkStart w:id="42" w:name="define-the-performance-problem"/>
     <w:p>
       <w:pPr>
         <w:pStyle w:val="Heading2"/>
@@ -1078,8 +1078,8 @@
         </w:pict>
       </w:r>
     </w:p>
-    <w:bookmarkEnd w:id="22"/>
-    <w:bookmarkStart w:id="23" w:name="trace-the-request-cycle"/>
+    <w:bookmarkEnd w:id="42"/>
+    <w:bookmarkStart w:id="43" w:name="trace-the-request-cycle"/>
     <w:p>
       <w:pPr>
         <w:pStyle w:val="Heading2"/>
@@ -1303,8 +1303,8 @@
         </w:pict>
       </w:r>
     </w:p>
-    <w:bookmarkEnd w:id="23"/>
-    <w:bookmarkStart w:id="24" w:name="establish-a-baseline"/>
+    <w:bookmarkEnd w:id="43"/>
+    <w:bookmarkStart w:id="44" w:name="establish-a-baseline"/>
     <w:p>
       <w:pPr>
         <w:pStyle w:val="Heading2"/>
@@ -1919,8 +1919,8 @@
         </w:pict>
       </w:r>
     </w:p>
-    <w:bookmarkEnd w:id="24"/>
-    <w:bookmarkStart w:id="25" w:name="dns-and-http-request-setup"/>
+    <w:bookmarkEnd w:id="44"/>
+    <w:bookmarkStart w:id="45" w:name="dns-and-http-request-setup"/>
     <w:p>
       <w:pPr>
         <w:pStyle w:val="Heading2"/>
@@ -2460,8 +2460,8 @@
         </w:pict>
       </w:r>
     </w:p>
-    <w:bookmarkEnd w:id="25"/>
-    <w:bookmarkStart w:id="26" w:name="full-page-cache-and-edge-cache"/>
+    <w:bookmarkEnd w:id="45"/>
+    <w:bookmarkStart w:id="46" w:name="full-page-cache-and-edge-cache"/>
     <w:p>
       <w:pPr>
         <w:pStyle w:val="Heading2"/>
@@ -2796,8 +2796,8 @@
         </w:pict>
       </w:r>
     </w:p>
-    <w:bookmarkEnd w:id="26"/>
-    <w:bookmarkStart w:id="27" w:name="ttl-headers-and-invalidation"/>
+    <w:bookmarkEnd w:id="46"/>
+    <w:bookmarkStart w:id="47" w:name="ttl-headers-and-invalidation"/>
     <w:p>
       <w:pPr>
         <w:pStyle w:val="Heading2"/>
@@ -3026,8 +3026,8 @@
         </w:pict>
       </w:r>
     </w:p>
-    <w:bookmarkEnd w:id="27"/>
-    <w:bookmarkStart w:id="28" w:name="application-optimization"/>
+    <w:bookmarkEnd w:id="47"/>
+    <w:bookmarkStart w:id="48" w:name="application-optimization"/>
     <w:p>
       <w:pPr>
         <w:pStyle w:val="Heading2"/>
@@ -3227,8 +3227,8 @@
         </w:pict>
       </w:r>
     </w:p>
-    <w:bookmarkEnd w:id="28"/>
-    <w:bookmarkStart w:id="29" w:name="partial-output-caching"/>
+    <w:bookmarkEnd w:id="48"/>
+    <w:bookmarkStart w:id="49" w:name="partial-output-caching"/>
     <w:p>
       <w:pPr>
         <w:pStyle w:val="Heading2"/>
@@ -4309,8 +4309,8 @@
         </w:pict>
       </w:r>
     </w:p>
-    <w:bookmarkEnd w:id="29"/>
-    <w:bookmarkStart w:id="30" w:name="mysql-query-optimization"/>
+    <w:bookmarkEnd w:id="49"/>
+    <w:bookmarkStart w:id="50" w:name="mysql-query-optimization"/>
     <w:p>
       <w:pPr>
         <w:pStyle w:val="Heading2"/>
@@ -4871,8 +4871,8 @@
         </w:pict>
       </w:r>
     </w:p>
-    <w:bookmarkEnd w:id="30"/>
-    <w:bookmarkStart w:id="31" w:name="unbounded-queries"/>
+    <w:bookmarkEnd w:id="50"/>
+    <w:bookmarkStart w:id="51" w:name="unbounded-queries"/>
     <w:p>
       <w:pPr>
         <w:pStyle w:val="Heading2"/>
@@ -5752,8 +5752,8 @@
         </w:pict>
       </w:r>
     </w:p>
-    <w:bookmarkEnd w:id="31"/>
-    <w:bookmarkStart w:id="36" w:name="taxonomies-exclusions-post-meta-and-like"/>
+    <w:bookmarkEnd w:id="51"/>
+    <w:bookmarkStart w:id="56" w:name="taxonomies-exclusions-post-meta-and-like"/>
     <w:p>
       <w:pPr>
         <w:pStyle w:val="Heading2"/>
@@ -5762,7 +5762,7 @@
         <w:t xml:space="preserve">10. Taxonomies, exclusions, post meta, and LIKE</w:t>
       </w:r>
     </w:p>
-    <w:bookmarkStart w:id="32" w:name="taxonomies"/>
+    <w:bookmarkStart w:id="52" w:name="taxonomies"/>
     <w:p>
       <w:pPr>
         <w:pStyle w:val="Heading3"/>
@@ -6099,8 +6099,8 @@
         <w:t xml:space="preserve">;</w:t>
       </w:r>
     </w:p>
-    <w:bookmarkEnd w:id="32"/>
-    <w:bookmarkStart w:id="33" w:name="not-in"/>
+    <w:bookmarkEnd w:id="52"/>
+    <w:bookmarkStart w:id="53" w:name="not-in"/>
     <w:p>
       <w:pPr>
         <w:pStyle w:val="Heading3"/>
@@ -6386,8 +6386,8 @@
         <w:t xml:space="preserve">);</w:t>
       </w:r>
     </w:p>
-    <w:bookmarkEnd w:id="33"/>
-    <w:bookmarkStart w:id="34" w:name="post-meta"/>
+    <w:bookmarkEnd w:id="53"/>
+    <w:bookmarkStart w:id="54" w:name="post-meta"/>
     <w:p>
       <w:pPr>
         <w:pStyle w:val="Heading3"/>
@@ -6432,8 +6432,8 @@
         <w:t xml:space="preserve">Consider custom tables or search infrastructure for high-volume structured data.</w:t>
       </w:r>
     </w:p>
-    <w:bookmarkEnd w:id="34"/>
-    <w:bookmarkStart w:id="35" w:name="like"/>
+    <w:bookmarkEnd w:id="54"/>
+    <w:bookmarkStart w:id="55" w:name="like"/>
     <w:p>
       <w:pPr>
         <w:pStyle w:val="Heading3"/>
@@ -6655,9 +6655,9 @@
         </w:pict>
       </w:r>
     </w:p>
-    <w:bookmarkEnd w:id="35"/>
-    <w:bookmarkEnd w:id="36"/>
-    <w:bookmarkStart w:id="37" w:name="explain-driven-query-review"/>
+    <w:bookmarkEnd w:id="55"/>
+    <w:bookmarkEnd w:id="56"/>
+    <w:bookmarkStart w:id="57" w:name="explain-driven-query-review"/>
     <w:p>
       <w:pPr>
         <w:pStyle w:val="Heading2"/>
@@ -7047,8 +7047,8 @@
         </w:pict>
       </w:r>
     </w:p>
-    <w:bookmarkEnd w:id="37"/>
-    <w:bookmarkStart w:id="38" w:name="object-caching"/>
+    <w:bookmarkEnd w:id="57"/>
+    <w:bookmarkStart w:id="58" w:name="object-caching"/>
     <w:p>
       <w:pPr>
         <w:pStyle w:val="Heading2"/>
@@ -7433,8 +7433,8 @@
         </w:pict>
       </w:r>
     </w:p>
-    <w:bookmarkEnd w:id="38"/>
-    <w:bookmarkStart w:id="39" w:name="transients-and-in-memory-caching"/>
+    <w:bookmarkEnd w:id="58"/>
+    <w:bookmarkStart w:id="59" w:name="transients-and-in-memory-caching"/>
     <w:p>
       <w:pPr>
         <w:pStyle w:val="Heading2"/>
@@ -7926,8 +7926,8 @@
         </w:pict>
       </w:r>
     </w:p>
-    <w:bookmarkEnd w:id="39"/>
-    <w:bookmarkStart w:id="40" w:name="race-conditions-and-cache-stampedes"/>
+    <w:bookmarkEnd w:id="59"/>
+    <w:bookmarkStart w:id="60" w:name="race-conditions-and-cache-stampedes"/>
     <w:p>
       <w:pPr>
         <w:pStyle w:val="Heading2"/>
@@ -8596,8 +8596,8 @@
         </w:pict>
       </w:r>
     </w:p>
-    <w:bookmarkEnd w:id="40"/>
-    <w:bookmarkStart w:id="41" w:name="wp-cron-and-scheduled-work"/>
+    <w:bookmarkEnd w:id="60"/>
+    <w:bookmarkStart w:id="61" w:name="wp-cron-and-scheduled-work"/>
     <w:p>
       <w:pPr>
         <w:pStyle w:val="Heading2"/>
@@ -9206,8 +9206,8 @@
         <w:t xml:space="preserve">After setting the constant, confirm scheduled events continue to clear. WordPress 6.9+ spawns request-triggered WP-Cron at shutdown, which can reduce user-facing latency, but enterprise/high-traffic sites should still use a verified external runner. Roll back by commenting out the constant and clearing OPcache if the backlog grows.</w:t>
       </w:r>
     </w:p>
-    <w:bookmarkEnd w:id="41"/>
-    <w:bookmarkStart w:id="45" w:name="X074b66bf28bf6916238b2bb912424b5abd2e6d1"/>
+    <w:bookmarkEnd w:id="61"/>
+    <w:bookmarkStart w:id="65" w:name="X074b66bf28bf6916238b2bb912424b5abd2e6d1"/>
     <w:p>
       <w:pPr>
         <w:pStyle w:val="Heading2"/>
@@ -9216,7 +9216,7 @@
         <w:t xml:space="preserve">16. AJAX, REST, sitemaps, redirects, and external requests</w:t>
       </w:r>
     </w:p>
-    <w:bookmarkStart w:id="42" w:name="ajax-and-rest"/>
+    <w:bookmarkStart w:id="62" w:name="ajax-and-rest"/>
     <w:p>
       <w:pPr>
         <w:pStyle w:val="Heading3"/>
@@ -9312,8 +9312,8 @@
         <w:t xml:space="preserve">Authenticate private endpoints correctly.</w:t>
       </w:r>
     </w:p>
-    <w:bookmarkEnd w:id="42"/>
-    <w:bookmarkStart w:id="43" w:name="sitemaps"/>
+    <w:bookmarkEnd w:id="62"/>
+    <w:bookmarkStart w:id="63" w:name="sitemaps"/>
     <w:p>
       <w:pPr>
         <w:pStyle w:val="Heading3"/>
@@ -9370,8 +9370,8 @@
         <w:t xml:space="preserve">Avoid regenerating large sitemap structures on every request.</w:t>
       </w:r>
     </w:p>
-    <w:bookmarkEnd w:id="43"/>
-    <w:bookmarkStart w:id="44" w:name="external-requests"/>
+    <w:bookmarkEnd w:id="63"/>
+    <w:bookmarkStart w:id="64" w:name="external-requests"/>
     <w:p>
       <w:pPr>
         <w:pStyle w:val="Heading3"/>
@@ -9447,9 +9447,9 @@
         </w:pict>
       </w:r>
     </w:p>
-    <w:bookmarkEnd w:id="44"/>
-    <w:bookmarkEnd w:id="45"/>
-    <w:bookmarkStart w:id="46" w:name="Xbaf3fdb85831dc92fa95e7eb51331eec8c713cb"/>
+    <w:bookmarkEnd w:id="64"/>
+    <w:bookmarkEnd w:id="65"/>
+    <w:bookmarkStart w:id="66" w:name="Xbaf3fdb85831dc92fa95e7eb51331eec8c713cb"/>
     <w:p>
       <w:pPr>
         <w:pStyle w:val="Heading2"/>
@@ -9608,8 +9608,8 @@
         </w:pict>
       </w:r>
     </w:p>
-    <w:bookmarkEnd w:id="46"/>
-    <w:bookmarkStart w:id="47" w:name="traffic-patterns-and-high-traffic-events"/>
+    <w:bookmarkEnd w:id="66"/>
+    <w:bookmarkStart w:id="67" w:name="traffic-patterns-and-high-traffic-events"/>
     <w:p>
       <w:pPr>
         <w:pStyle w:val="Heading2"/>
@@ -9845,8 +9845,8 @@
         </w:pict>
       </w:r>
     </w:p>
-    <w:bookmarkEnd w:id="47"/>
-    <w:bookmarkStart w:id="48" w:name="load-testing"/>
+    <w:bookmarkEnd w:id="67"/>
+    <w:bookmarkStart w:id="68" w:name="load-testing"/>
     <w:p>
       <w:pPr>
         <w:pStyle w:val="Heading2"/>
@@ -10083,8 +10083,8 @@
         </w:pict>
       </w:r>
     </w:p>
-    <w:bookmarkEnd w:id="48"/>
-    <w:bookmarkStart w:id="52" w:name="measuring-time-spent"/>
+    <w:bookmarkEnd w:id="68"/>
+    <w:bookmarkStart w:id="72" w:name="measuring-time-spent"/>
     <w:p>
       <w:pPr>
         <w:pStyle w:val="Heading2"/>
@@ -10101,7 +10101,7 @@
         <w:t xml:space="preserve">Use multiple tools because each sees a different layer.</w:t>
       </w:r>
     </w:p>
-    <w:bookmarkStart w:id="49" w:name="php-logging"/>
+    <w:bookmarkStart w:id="69" w:name="php-logging"/>
     <w:p>
       <w:pPr>
         <w:pStyle w:val="Heading3"/>
@@ -10486,8 +10486,8 @@
         <w:t xml:space="preserve">}</w:t>
       </w:r>
     </w:p>
-    <w:bookmarkEnd w:id="49"/>
-    <w:bookmarkStart w:id="50" w:name="new-relic"/>
+    <w:bookmarkEnd w:id="69"/>
+    <w:bookmarkStart w:id="70" w:name="new-relic"/>
     <w:p>
       <w:pPr>
         <w:pStyle w:val="Heading3"/>
@@ -10832,8 +10832,8 @@
         <w:t xml:space="preserve">to give the current request a stable, low-cardinality name in APM. The New Relic transaction-start API takes a New Relic application name, not a transaction name, and is reserved for advanced transaction-lifecycle patterns such as queue workers manually ending one transaction and starting another.</w:t>
       </w:r>
     </w:p>
-    <w:bookmarkEnd w:id="50"/>
-    <w:bookmarkStart w:id="51" w:name="query-monitor"/>
+    <w:bookmarkEnd w:id="70"/>
+    <w:bookmarkStart w:id="71" w:name="query-monitor"/>
     <w:p>
       <w:pPr>
         <w:pStyle w:val="Heading3"/>
@@ -11120,9 +11120,9 @@
         </w:pict>
       </w:r>
     </w:p>
-    <w:bookmarkEnd w:id="51"/>
-    <w:bookmarkEnd w:id="52"/>
-    <w:bookmarkStart w:id="53" w:name="performance-alerting"/>
+    <w:bookmarkEnd w:id="71"/>
+    <w:bookmarkEnd w:id="72"/>
+    <w:bookmarkStart w:id="73" w:name="performance-alerting"/>
     <w:p>
       <w:pPr>
         <w:pStyle w:val="Heading2"/>
@@ -11326,8 +11326,8 @@
         </w:pict>
       </w:r>
     </w:p>
-    <w:bookmarkEnd w:id="53"/>
-    <w:bookmarkStart w:id="54" w:name="verification-and-definition-of-done"/>
+    <w:bookmarkEnd w:id="73"/>
+    <w:bookmarkStart w:id="74" w:name="verification-and-definition-of-done"/>
     <w:p>
       <w:pPr>
         <w:pStyle w:val="Heading2"/>
@@ -11539,8 +11539,8 @@
         </w:pict>
       </w:r>
     </w:p>
-    <w:bookmarkEnd w:id="54"/>
-    <w:bookmarkStart w:id="71" w:name="references"/>
+    <w:bookmarkEnd w:id="74"/>
+    <w:bookmarkStart w:id="91" w:name="references"/>
     <w:p>
       <w:pPr>
         <w:pStyle w:val="Heading2"/>
@@ -11557,7 +11557,7 @@
           <w:numId w:val="1297"/>
         </w:numPr>
       </w:pPr>
-      <w:hyperlink r:id="rId55">
+      <w:hyperlink r:id="rId75">
         <w:r>
           <w:rPr>
             <w:rStyle w:val="Hyperlink"/>
@@ -11574,7 +11574,7 @@
           <w:numId w:val="1297"/>
         </w:numPr>
       </w:pPr>
-      <w:hyperlink r:id="rId56">
+      <w:hyperlink r:id="rId76">
         <w:r>
           <w:rPr>
             <w:rStyle w:val="Hyperlink"/>
@@ -11591,7 +11591,7 @@
           <w:numId w:val="1297"/>
         </w:numPr>
       </w:pPr>
-      <w:hyperlink r:id="rId57">
+      <w:hyperlink r:id="rId77">
         <w:r>
           <w:rPr>
             <w:rStyle w:val="Hyperlink"/>
@@ -11608,7 +11608,7 @@
           <w:numId w:val="1297"/>
         </w:numPr>
       </w:pPr>
-      <w:hyperlink r:id="rId58">
+      <w:hyperlink r:id="rId78">
         <w:r>
           <w:rPr>
             <w:rStyle w:val="Hyperlink"/>
@@ -11625,7 +11625,7 @@
           <w:numId w:val="1297"/>
         </w:numPr>
       </w:pPr>
-      <w:hyperlink r:id="rId59">
+      <w:hyperlink r:id="rId79">
         <w:r>
           <w:rPr>
             <w:rStyle w:val="Hyperlink"/>
@@ -11642,7 +11642,7 @@
           <w:numId w:val="1297"/>
         </w:numPr>
       </w:pPr>
-      <w:hyperlink r:id="rId60">
+      <w:hyperlink r:id="rId80">
         <w:r>
           <w:rPr>
             <w:rStyle w:val="Hyperlink"/>
@@ -11659,7 +11659,7 @@
           <w:numId w:val="1297"/>
         </w:numPr>
       </w:pPr>
-      <w:hyperlink r:id="rId61">
+      <w:hyperlink r:id="rId81">
         <w:r>
           <w:rPr>
             <w:rStyle w:val="Hyperlink"/>
@@ -11676,7 +11676,7 @@
           <w:numId w:val="1297"/>
         </w:numPr>
       </w:pPr>
-      <w:hyperlink r:id="rId62">
+      <w:hyperlink r:id="rId82">
         <w:r>
           <w:rPr>
             <w:rStyle w:val="Hyperlink"/>
@@ -11693,7 +11693,7 @@
           <w:numId w:val="1297"/>
         </w:numPr>
       </w:pPr>
-      <w:hyperlink r:id="rId63">
+      <w:hyperlink r:id="rId83">
         <w:r>
           <w:rPr>
             <w:rStyle w:val="Hyperlink"/>
@@ -11710,7 +11710,7 @@
           <w:numId w:val="1297"/>
         </w:numPr>
       </w:pPr>
-      <w:hyperlink r:id="rId64">
+      <w:hyperlink r:id="rId84">
         <w:r>
           <w:rPr>
             <w:rStyle w:val="Hyperlink"/>
@@ -11727,7 +11727,7 @@
           <w:numId w:val="1297"/>
         </w:numPr>
       </w:pPr>
-      <w:hyperlink r:id="rId65">
+      <w:hyperlink r:id="rId85">
         <w:r>
           <w:rPr>
             <w:rStyle w:val="Hyperlink"/>
@@ -11744,7 +11744,7 @@
           <w:numId w:val="1297"/>
         </w:numPr>
       </w:pPr>
-      <w:hyperlink r:id="rId66">
+      <w:hyperlink r:id="rId86">
         <w:r>
           <w:rPr>
             <w:rStyle w:val="VerbatimChar"/>
@@ -11761,7 +11761,7 @@
           <w:numId w:val="1297"/>
         </w:numPr>
       </w:pPr>
-      <w:hyperlink r:id="rId67">
+      <w:hyperlink r:id="rId87">
         <w:r>
           <w:rPr>
             <w:rStyle w:val="Hyperlink"/>
@@ -11778,7 +11778,7 @@
           <w:numId w:val="1297"/>
         </w:numPr>
       </w:pPr>
-      <w:hyperlink r:id="rId68">
+      <w:hyperlink r:id="rId88">
         <w:r>
           <w:rPr>
             <w:rStyle w:val="Hyperlink"/>
@@ -11795,7 +11795,7 @@
           <w:numId w:val="1297"/>
         </w:numPr>
       </w:pPr>
-      <w:hyperlink r:id="rId69">
+      <w:hyperlink r:id="rId89">
         <w:r>
           <w:rPr>
             <w:rStyle w:val="Hyperlink"/>
@@ -11804,7 +11804,7 @@
         </w:r>
       </w:hyperlink>
     </w:p>
-    <w:bookmarkStart w:id="70" w:name="source-note"/>
+    <w:bookmarkStart w:id="90" w:name="source-note"/>
     <w:p>
       <w:pPr>
         <w:pStyle w:val="Heading3"/>
@@ -11848,11 +11848,11 @@
         <w:t xml:space="preserve">matching the site’s canonical scheme. This operational checklist at §15 already uses HTTPS.</w:t>
       </w:r>
     </w:p>
-    <w:bookmarkEnd w:id="70"/>
-    <w:bookmarkEnd w:id="71"/>
-    <w:bookmarkEnd w:id="72"/>
+    <w:bookmarkEnd w:id="90"/>
+    <w:bookmarkEnd w:id="91"/>
+    <w:bookmarkEnd w:id="92"/>
     <w:sectPr>
-      <w:footerReference r:id="rId9" w:type="default"/>
+      <w:footerReference r:id="rId31" w:type="default"/>
       <w:footnotePr>
         <w:numRestart w:val="eachSect"/>
       </w:footnotePr>

</xml_diff>